<commit_message>
CP0529-350 New Mapping to styles
</commit_message>
<xml_diff>
--- a/src/Layers/W1/BaseApp/Sales/Reports/CustomerOrderSummaryBody.docx
+++ b/src/Layers/W1/BaseApp/Sales/Reports/CustomerOrderSummaryBody.docx
@@ -1,47 +1,31 @@
 
 <file path=word/document.xml><?xml version="1.0" encoding="utf-8"?>
-<w:document xmlns:wpc="http://schemas.microsoft.com/office/word/2010/wordprocessingCanvas" xmlns:cx="http://schemas.microsoft.com/office/drawing/2014/chartex" xmlns:cx1="http://schemas.microsoft.com/office/drawing/2015/9/8/chartex" xmlns:cx2="http://schemas.microsoft.com/office/drawing/2015/10/21/chartex" xmlns:cx3="http://schemas.microsoft.com/office/drawing/2016/5/9/chartex" xmlns:cx4="http://schemas.microsoft.com/office/drawing/2016/5/10/chartex" xmlns:cx5="http://schemas.microsoft.com/office/drawing/2016/5/11/chartex" xmlns:cx6="http://schemas.microsoft.com/office/drawing/2016/5/12/chartex" xmlns:cx7="http://schemas.microsoft.com/office/drawing/2016/5/13/chartex" xmlns:cx8="http://schemas.microsoft.com/office/drawing/2016/5/14/chartex" xmlns:mc="http://schemas.openxmlformats.org/markup-compatibility/2006" xmlns:aink="http://schemas.microsoft.com/office/drawing/2016/ink" xmlns:am3d="http://schemas.microsoft.com/office/drawing/2017/model3d" xmlns:o="urn:schemas-microsoft-com:office:office" xmlns:oel="http://schemas.microsoft.com/office/2019/extlst" xmlns:r="http://schemas.openxmlformats.org/officeDocument/2006/relationships" xmlns:m="http://schemas.openxmlformats.org/officeDocument/2006/math" xmlns:v="urn:schemas-microsoft-com:vml" xmlns:wp14="http://schemas.microsoft.com/office/word/2010/wordprocessingDrawing" xmlns:wp="http://schemas.openxmlformats.org/drawingml/2006/wordprocessingDrawing" xmlns:w10="urn:schemas-microsoft-com:office:word" xmlns:w="http://schemas.openxmlformats.org/wordprocessingml/2006/main" xmlns:w14="http://schemas.microsoft.com/office/word/2010/wordml" xmlns:w15="http://schemas.microsoft.com/office/word/2012/wordml" xmlns:w16cex="http://schemas.microsoft.com/office/word/2018/wordml/cex" xmlns:w16cid="http://schemas.microsoft.com/office/word/2016/wordml/cid" xmlns:w16="http://schemas.microsoft.com/office/word/2018/wordml" xmlns:w16du="http://schemas.microsoft.com/office/word/2023/wordml/word16du" xmlns:w16sdtdh="http://schemas.microsoft.com/office/word/2020/wordml/sdtdatahash" xmlns:w16sdtfl="http://schemas.microsoft.com/office/word/2024/wordml/sdtformatlock" xmlns:w16se="http://schemas.microsoft.com/office/word/2015/wordml/symex" xmlns:wpg="http://schemas.microsoft.com/office/word/2010/wordprocessingGroup" xmlns:wpi="http://schemas.microsoft.com/office/word/2010/wordprocessingInk" xmlns:wne="http://schemas.microsoft.com/office/word/2006/wordml" xmlns:wps="http://schemas.microsoft.com/office/word/2010/wordprocessingShape" mc:Ignorable="w14 w15 w16se w16cid w16 w16cex w16sdtdh w16sdtfl w16du wp14">
+<w:document xmlns:wpc="http://schemas.microsoft.com/office/word/2010/wordprocessingCanvas" xmlns:cx="http://schemas.microsoft.com/office/drawing/2014/chartex" xmlns:cx1="http://schemas.microsoft.com/office/drawing/2015/9/8/chartex" xmlns:cx2="http://schemas.microsoft.com/office/drawing/2015/10/21/chartex" xmlns:cx3="http://schemas.microsoft.com/office/drawing/2016/5/9/chartex" xmlns:cx4="http://schemas.microsoft.com/office/drawing/2016/5/10/chartex" xmlns:cx5="http://schemas.microsoft.com/office/drawing/2016/5/11/chartex" xmlns:cx6="http://schemas.microsoft.com/office/drawing/2016/5/12/chartex" xmlns:cx7="http://schemas.microsoft.com/office/drawing/2016/5/13/chartex" xmlns:cx8="http://schemas.microsoft.com/office/drawing/2016/5/14/chartex" xmlns:mc="http://schemas.openxmlformats.org/markup-compatibility/2006" xmlns:aink="http://schemas.microsoft.com/office/drawing/2016/ink" xmlns:am3d="http://schemas.microsoft.com/office/drawing/2017/model3d" xmlns:o="urn:schemas-microsoft-com:office:office" xmlns:oel="http://schemas.microsoft.com/office/2019/extlst" xmlns:r="http://schemas.openxmlformats.org/officeDocument/2006/relationships" xmlns:m="http://schemas.openxmlformats.org/officeDocument/2006/math" xmlns:v="urn:schemas-microsoft-com:vml" xmlns:wp14="http://schemas.microsoft.com/office/word/2010/wordprocessingDrawing" xmlns:wp="http://schemas.openxmlformats.org/drawingml/2006/wordprocessingDrawing" xmlns:w10="urn:schemas-microsoft-com:office:word" xmlns:w="http://schemas.openxmlformats.org/wordprocessingml/2006/main" xmlns:w14="http://schemas.microsoft.com/office/word/2010/wordml" xmlns:w15="http://schemas.microsoft.com/office/word/2012/wordml" xmlns:w16cei="http://schemas.microsoft.com/office/word/2026/wordml/cei" xmlns:w16cex="http://schemas.microsoft.com/office/word/2018/wordml/cex" xmlns:w16cid="http://schemas.microsoft.com/office/word/2016/wordml/cid" xmlns:w16="http://schemas.microsoft.com/office/word/2018/wordml" xmlns:w16du="http://schemas.microsoft.com/office/word/2023/wordml/word16du" xmlns:w16sdtdh="http://schemas.microsoft.com/office/word/2020/wordml/sdtdatahash" xmlns:w16sdtfl="http://schemas.microsoft.com/office/word/2024/wordml/sdtformatlock" xmlns:w16se="http://schemas.microsoft.com/office/word/2015/wordml/symex" xmlns:wpg="http://schemas.microsoft.com/office/word/2010/wordprocessingGroup" xmlns:wpi="http://schemas.microsoft.com/office/word/2010/wordprocessingInk" xmlns:wne="http://schemas.microsoft.com/office/word/2006/wordml" xmlns:wps="http://schemas.microsoft.com/office/word/2010/wordprocessingShape" mc:Ignorable="w14 w15 w16se w16cid w16 w16cex w16sdtdh w16sdtfl w16du wp14">
   <w:body>
     <w:tbl>
       <w:tblPr>
-        <w:tblStyle w:val="TableGrid"/>
-        <w:tblW w:w="15422" w:type="dxa"/>
-        <w:tblBorders>
-          <w:top w:val="none" w:color="auto" w:sz="0" w:space="0"/>
-          <w:left w:val="none" w:color="auto" w:sz="0" w:space="0"/>
-          <w:bottom w:val="none" w:color="auto" w:sz="0" w:space="0"/>
-          <w:right w:val="none" w:color="auto" w:sz="0" w:space="0"/>
-          <w:insideH w:val="none" w:color="auto" w:sz="0" w:space="0"/>
-          <w:insideV w:val="none" w:color="auto" w:sz="0" w:space="0"/>
-        </w:tblBorders>
-        <w:tblLayout w:type="fixed"/>
-        <w:tblCellMar>
-          <w:left w:w="0" w:type="dxa"/>
-          <w:right w:w="0" w:type="dxa"/>
-        </w:tblCellMar>
-        <w:tblLook w:val="04A0" w:firstRow="1" w:lastRow="0" w:firstColumn="1" w:lastColumn="0" w:noHBand="0" w:noVBand="1"/>
+        <w:tblStyle w:val="BCBlockTable"/>
+        <w:tblW w:w="5000" w:type="pct"/>
+        <w:tblLook w:val="0620" w:firstRow="1" w:lastRow="0" w:firstColumn="0" w:lastColumn="0" w:noHBand="1" w:noVBand="1"/>
         <w:tblCaption w:val="Document Information Block"/>
+        <w:tblDescription w:val="Layout table. Used for positioning, not for tabular data."/>
       </w:tblPr>
       <w:tblGrid>
-        <w:gridCol w:w="2570"/>
-        <w:gridCol w:w="2570"/>
-        <w:gridCol w:w="2571"/>
-        <w:gridCol w:w="2570"/>
-        <w:gridCol w:w="2570"/>
-        <w:gridCol w:w="2571"/>
+        <w:gridCol w:w="2614"/>
+        <w:gridCol w:w="2614"/>
+        <w:gridCol w:w="2616"/>
+        <w:gridCol w:w="2613"/>
+        <w:gridCol w:w="2613"/>
+        <w:gridCol w:w="2616"/>
       </w:tblGrid>
       <w:tr>
         <w:trPr>
           <w:cnfStyle w:val="100000000000" w:firstRow="1" w:lastRow="0" w:firstColumn="0" w:lastColumn="0" w:oddVBand="0" w:evenVBand="0" w:oddHBand="0" w:evenHBand="0" w:firstRowFirstColumn="0" w:firstRowLastColumn="0" w:lastRowFirstColumn="0" w:lastRowLastColumn="0"/>
+          <w:cantSplit/>
           <w:trHeight w:val="254"/>
         </w:trPr>
         <w:sdt>
           <w:sdtPr>
-            <w:rPr>
-              <w:rFonts w:ascii="Segoe UI Semibold" w:hAnsi="Segoe UI Semibold" w:cs="Segoe UI Semibold"/>
-              <w:sz w:val="22"/>
-              <w:szCs w:val="22"/>
-            </w:rPr>
             <w:alias w:val="OutstandingOrdersLbl"/>
             <w:tag w:val="#BC:InsertDataItem,Labels/OutstandingOrdersLbl"/>
             <w:id w:val="888227909"/>
@@ -55,39 +39,22 @@
           <w:sdtContent>
             <w:tc>
               <w:tcPr>
-                <w:tcW w:w="2570" w:type="dxa"/>
+                <w:tcW w:w="833" w:type="pct"/>
               </w:tcPr>
               <w:p>
                 <w:pPr>
-                  <w:pStyle w:val="Heading2"/>
-                  <w:spacing w:before="0" w:after="0" w:line="276" w:lineRule="auto"/>
-                  <w:rPr>
-                    <w:rFonts w:ascii="Segoe UI Semibold" w:hAnsi="Segoe UI Semibold" w:cs="Segoe UI Semibold"/>
-                    <w:sz w:val="22"/>
-                    <w:szCs w:val="22"/>
-                  </w:rPr>
+                  <w:pStyle w:val="BCLabel0"/>
+                  <w:spacing w:line="276" w:lineRule="auto"/>
                 </w:pPr>
-                <w:proofErr w:type="spellStart"/>
                 <w:r>
-                  <w:rPr>
-                    <w:rFonts w:ascii="Segoe UI Semibold" w:hAnsi="Segoe UI Semibold" w:cs="Segoe UI Semibold"/>
-                    <w:sz w:val="22"/>
-                    <w:szCs w:val="22"/>
-                  </w:rPr>
                   <w:t>OutstandingOrdersLbl</w:t>
                 </w:r>
-                <w:proofErr w:type="spellEnd"/>
               </w:p>
             </w:tc>
           </w:sdtContent>
         </w:sdt>
         <w:sdt>
           <w:sdtPr>
-            <w:rPr>
-              <w:rFonts w:ascii="Segoe UI Semibold" w:hAnsi="Segoe UI Semibold" w:cs="Segoe UI Semibold"/>
-              <w:sz w:val="22"/>
-              <w:szCs w:val="22"/>
-            </w:rPr>
             <w:alias w:val="AllAmountsAreInLCYTxt"/>
             <w:tag w:val="#BC:InsertDataItem,DataItems/Customer/AllAmountsAreInLCYTxt"/>
             <w:id w:val="-1274169207"/>
@@ -101,39 +68,22 @@
           <w:sdtContent>
             <w:tc>
               <w:tcPr>
-                <w:tcW w:w="2570" w:type="dxa"/>
+                <w:tcW w:w="833" w:type="pct"/>
               </w:tcPr>
               <w:p>
                 <w:pPr>
-                  <w:pStyle w:val="Heading2"/>
-                  <w:spacing w:before="0" w:after="0" w:line="276" w:lineRule="auto"/>
-                  <w:rPr>
-                    <w:rFonts w:ascii="Segoe UI Semibold" w:hAnsi="Segoe UI Semibold" w:cs="Segoe UI Semibold"/>
-                    <w:sz w:val="22"/>
-                    <w:szCs w:val="22"/>
-                  </w:rPr>
+                  <w:pStyle w:val="BCLabel0"/>
+                  <w:spacing w:line="276" w:lineRule="auto"/>
                 </w:pPr>
-                <w:proofErr w:type="spellStart"/>
                 <w:r>
-                  <w:rPr>
-                    <w:rFonts w:ascii="Segoe UI Semibold" w:hAnsi="Segoe UI Semibold" w:cs="Segoe UI Semibold"/>
-                    <w:sz w:val="22"/>
-                    <w:szCs w:val="22"/>
-                  </w:rPr>
                   <w:t>AllAmountsAreInLCYTxt</w:t>
                 </w:r>
-                <w:proofErr w:type="spellEnd"/>
               </w:p>
             </w:tc>
           </w:sdtContent>
         </w:sdt>
         <w:sdt>
           <w:sdtPr>
-            <w:rPr>
-              <w:rFonts w:ascii="Segoe UI Semibold" w:hAnsi="Segoe UI Semibold" w:cs="Segoe UI Semibold"/>
-              <w:sz w:val="22"/>
-              <w:szCs w:val="22"/>
-            </w:rPr>
             <w:alias w:val="CustFilter"/>
             <w:tag w:val="#BC:InsertDataItem,DataItems/Customer/CustFilter"/>
             <w:id w:val="-1173940905"/>
@@ -147,170 +97,140 @@
           <w:sdtContent>
             <w:tc>
               <w:tcPr>
-                <w:tcW w:w="2571" w:type="dxa"/>
+                <w:tcW w:w="834" w:type="pct"/>
               </w:tcPr>
               <w:p>
                 <w:pPr>
-                  <w:pStyle w:val="Heading2"/>
-                  <w:spacing w:before="0" w:after="0" w:line="276" w:lineRule="auto"/>
-                  <w:rPr>
-                    <w:rFonts w:ascii="Segoe UI Semibold" w:hAnsi="Segoe UI Semibold" w:cs="Segoe UI Semibold"/>
-                    <w:sz w:val="22"/>
-                    <w:szCs w:val="22"/>
-                  </w:rPr>
+                  <w:pStyle w:val="BCLabel0"/>
+                  <w:spacing w:line="276" w:lineRule="auto"/>
                 </w:pPr>
-                <w:proofErr w:type="spellStart"/>
                 <w:r>
-                  <w:rPr>
-                    <w:rFonts w:ascii="Segoe UI Semibold" w:hAnsi="Segoe UI Semibold" w:cs="Segoe UI Semibold"/>
-                    <w:sz w:val="22"/>
-                    <w:szCs w:val="22"/>
-                  </w:rPr>
                   <w:t>CustFilter</w:t>
                 </w:r>
-                <w:proofErr w:type="spellEnd"/>
               </w:p>
             </w:tc>
           </w:sdtContent>
         </w:sdt>
         <w:tc>
           <w:tcPr>
-            <w:tcW w:w="2570" w:type="dxa"/>
+            <w:tcW w:w="833" w:type="pct"/>
           </w:tcPr>
           <w:p>
             <w:pPr>
-              <w:pStyle w:val="Heading2"/>
-              <w:spacing w:before="0" w:after="0" w:line="276" w:lineRule="auto"/>
-              <w:rPr>
-                <w:rFonts w:ascii="Segoe UI Semibold" w:hAnsi="Segoe UI Semibold" w:cs="Segoe UI Semibold"/>
-                <w:sz w:val="22"/>
-                <w:szCs w:val="22"/>
-              </w:rPr>
+              <w:pStyle w:val="BCLabel0"/>
+              <w:spacing w:line="276" w:lineRule="auto"/>
             </w:pPr>
           </w:p>
         </w:tc>
         <w:tc>
           <w:tcPr>
-            <w:tcW w:w="2570" w:type="dxa"/>
+            <w:tcW w:w="833" w:type="pct"/>
           </w:tcPr>
           <w:p>
             <w:pPr>
-              <w:pStyle w:val="Heading2"/>
-              <w:spacing w:before="0" w:after="0" w:line="276" w:lineRule="auto"/>
-              <w:rPr>
-                <w:rFonts w:ascii="Segoe UI Semibold" w:hAnsi="Segoe UI Semibold" w:cs="Segoe UI Semibold"/>
-                <w:sz w:val="22"/>
-                <w:szCs w:val="22"/>
-              </w:rPr>
+              <w:pStyle w:val="BCLabel0"/>
+              <w:spacing w:line="276" w:lineRule="auto"/>
             </w:pPr>
           </w:p>
         </w:tc>
         <w:tc>
           <w:tcPr>
-            <w:tcW w:w="2571" w:type="dxa"/>
+            <w:tcW w:w="834" w:type="pct"/>
           </w:tcPr>
           <w:p>
             <w:pPr>
-              <w:pStyle w:val="Heading2"/>
-              <w:spacing w:before="0" w:after="0" w:line="276" w:lineRule="auto"/>
+              <w:pStyle w:val="BCLabel0"/>
+              <w:spacing w:line="276" w:lineRule="auto"/>
+            </w:pPr>
+            <w:r>
+              <w:fldChar w:fldCharType="begin"/>
+            </w:r>
+            <w:r>
+              <w:instrText xml:space="preserve"> DATE \@ "</w:instrText>
+            </w:r>
+            <w:r>
+              <w:instrText>dddd</w:instrText>
+            </w:r>
+            <w:r>
+              <w:instrText xml:space="preserve">, d MMMM yyyy" </w:instrText>
+            </w:r>
+            <w:r>
+              <w:fldChar w:fldCharType="separate"/>
+            </w:r>
+            <w:r>
               <w:rPr>
-                <w:rFonts w:ascii="Segoe UI Semibold" w:hAnsi="Segoe UI Semibold" w:cs="Segoe UI Semibold"/>
-                <w:sz w:val="22"/>
-                <w:szCs w:val="22"/>
+                <w:noProof/>
               </w:rPr>
-            </w:pPr>
+              <w:t>Thursday, 30 July 2026</w:t>
+            </w:r>
+            <w:r>
+              <w:fldChar w:fldCharType="end"/>
+            </w:r>
           </w:p>
         </w:tc>
       </w:tr>
       <w:tr>
         <w:trPr>
+          <w:cantSplit/>
           <w:trHeight w:val="242"/>
         </w:trPr>
         <w:tc>
           <w:tcPr>
-            <w:tcW w:w="2570" w:type="dxa"/>
+            <w:tcW w:w="833" w:type="pct"/>
           </w:tcPr>
           <w:p>
             <w:pPr>
-              <w:rPr>
-                <w:sz w:val="22"/>
-                <w:szCs w:val="22"/>
-              </w:rPr>
+              <w:pStyle w:val="NoSpacing"/>
             </w:pPr>
           </w:p>
         </w:tc>
         <w:tc>
           <w:tcPr>
-            <w:tcW w:w="2570" w:type="dxa"/>
+            <w:tcW w:w="833" w:type="pct"/>
           </w:tcPr>
           <w:p>
             <w:pPr>
-              <w:rPr>
-                <w:rFonts w:cs="Segoe UI" w:asciiTheme="minorHAnsi" w:hAnsiTheme="minorHAnsi"/>
-                <w:color w:val="242424"/>
-                <w:sz w:val="22"/>
-                <w:szCs w:val="22"/>
-              </w:rPr>
+              <w:pStyle w:val="NoSpacing"/>
             </w:pPr>
           </w:p>
         </w:tc>
         <w:tc>
           <w:tcPr>
-            <w:tcW w:w="2571" w:type="dxa"/>
+            <w:tcW w:w="834" w:type="pct"/>
           </w:tcPr>
           <w:p>
             <w:pPr>
-              <w:rPr>
-                <w:rFonts w:cs="Segoe UI" w:asciiTheme="minorHAnsi" w:hAnsiTheme="minorHAnsi"/>
-                <w:color w:val="242424"/>
-                <w:sz w:val="22"/>
-                <w:szCs w:val="22"/>
-              </w:rPr>
+              <w:pStyle w:val="NoSpacing"/>
             </w:pPr>
           </w:p>
         </w:tc>
         <w:tc>
           <w:tcPr>
-            <w:tcW w:w="2570" w:type="dxa"/>
+            <w:tcW w:w="833" w:type="pct"/>
           </w:tcPr>
           <w:p>
             <w:pPr>
-              <w:rPr>
-                <w:rFonts w:cs="Segoe UI" w:asciiTheme="minorHAnsi" w:hAnsiTheme="minorHAnsi"/>
-                <w:color w:val="242424"/>
-                <w:sz w:val="22"/>
-                <w:szCs w:val="22"/>
-              </w:rPr>
+              <w:pStyle w:val="NoSpacing"/>
             </w:pPr>
           </w:p>
         </w:tc>
         <w:tc>
           <w:tcPr>
-            <w:tcW w:w="2570" w:type="dxa"/>
+            <w:tcW w:w="833" w:type="pct"/>
           </w:tcPr>
           <w:p>
             <w:pPr>
-              <w:rPr>
-                <w:rFonts w:cs="Segoe UI"/>
-                <w:color w:val="242424"/>
-                <w:sz w:val="22"/>
-                <w:szCs w:val="22"/>
-              </w:rPr>
+              <w:pStyle w:val="NoSpacing"/>
             </w:pPr>
           </w:p>
         </w:tc>
         <w:tc>
           <w:tcPr>
-            <w:tcW w:w="2571" w:type="dxa"/>
+            <w:tcW w:w="834" w:type="pct"/>
           </w:tcPr>
           <w:p>
             <w:pPr>
-              <w:rPr>
-                <w:rFonts w:cs="Segoe UI"/>
-                <w:color w:val="242424"/>
-                <w:sz w:val="22"/>
-                <w:szCs w:val="22"/>
-              </w:rPr>
+              <w:pStyle w:val="NoSpacing"/>
             </w:pPr>
           </w:p>
         </w:tc>
@@ -319,43 +239,36 @@
     <w:p>
       <w:pPr>
         <w:spacing w:after="0"/>
-        <w:rPr>
-          <w:sz w:val="22"/>
-          <w:szCs w:val="22"/>
-        </w:rPr>
       </w:pPr>
     </w:p>
     <w:tbl>
       <w:tblPr>
-        <w:tblStyle w:val="CLSequoiatablestyle021"/>
-        <w:tblW w:w="15422" w:type="dxa"/>
-        <w:tblLayout w:type="fixed"/>
-        <w:tblLook w:val="04A0" w:firstRow="1" w:lastRow="0" w:firstColumn="1" w:lastColumn="0" w:noHBand="0" w:noVBand="1"/>
+        <w:tblStyle w:val="BCDataTable"/>
+        <w:tblW w:w="5000" w:type="pct"/>
+        <w:tblLook w:val="0420" w:firstRow="1" w:lastRow="0" w:firstColumn="0" w:lastColumn="0" w:noHBand="0" w:noVBand="1"/>
         <w:tblCaption w:val="Data Table Block"/>
+        <w:tblDescription w:val="Document lines. Column headers in the first row."/>
       </w:tblPr>
       <w:tblGrid>
-        <w:gridCol w:w="1713"/>
-        <w:gridCol w:w="1714"/>
-        <w:gridCol w:w="1713"/>
-        <w:gridCol w:w="1714"/>
-        <w:gridCol w:w="1713"/>
-        <w:gridCol w:w="1714"/>
-        <w:gridCol w:w="1713"/>
-        <w:gridCol w:w="1714"/>
-        <w:gridCol w:w="1714"/>
+        <w:gridCol w:w="1728"/>
+        <w:gridCol w:w="1643"/>
+        <w:gridCol w:w="1579"/>
+        <w:gridCol w:w="1792"/>
+        <w:gridCol w:w="1792"/>
+        <w:gridCol w:w="1792"/>
+        <w:gridCol w:w="1792"/>
+        <w:gridCol w:w="1792"/>
+        <w:gridCol w:w="1776"/>
       </w:tblGrid>
       <w:tr>
         <w:trPr>
           <w:cnfStyle w:val="100000000000" w:firstRow="1" w:lastRow="0" w:firstColumn="0" w:lastColumn="0" w:oddVBand="0" w:evenVBand="0" w:oddHBand="0" w:evenHBand="0" w:firstRowFirstColumn="0" w:firstRowLastColumn="0" w:lastRowFirstColumn="0" w:lastRowLastColumn="0"/>
+          <w:cantSplit/>
           <w:trHeight w:val="490"/>
+          <w:tblHeader/>
         </w:trPr>
         <w:sdt>
           <w:sdtPr>
-            <w:rPr>
-              <w:rFonts w:ascii="Segoe UI Semibold" w:hAnsi="Segoe UI Semibold" w:cs="Segoe UI Semibold" w:eastAsiaTheme="minorHAnsi"/>
-              <w:sz w:val="22"/>
-              <w:szCs w:val="22"/>
-            </w:rPr>
             <w:alias w:val="CustomerNoLbl"/>
             <w:tag w:val="#BC:InsertDataItem,Labels/CustomerNoLbl"/>
             <w:id w:val="1406180128"/>
@@ -369,42 +282,24 @@
           <w:sdtContent>
             <w:tc>
               <w:tcPr>
-                <w:cnfStyle w:val="001000000000" w:firstRow="0" w:lastRow="0" w:firstColumn="1" w:lastColumn="0" w:oddVBand="0" w:evenVBand="0" w:oddHBand="0" w:evenHBand="0" w:firstRowFirstColumn="0" w:firstRowLastColumn="0" w:lastRowFirstColumn="0" w:lastRowLastColumn="0"/>
-                <w:tcW w:w="1713" w:type="dxa"/>
+                <w:tcW w:w="555" w:type="pct"/>
                 <w:tcBorders>
                   <w:bottom w:val="single" w:color="auto" w:sz="4" w:space="0"/>
                 </w:tcBorders>
               </w:tcPr>
               <w:p>
                 <w:pPr>
-                  <w:pStyle w:val="Heading2"/>
-                  <w:rPr>
-                    <w:rFonts w:ascii="Segoe UI Semibold" w:hAnsi="Segoe UI Semibold" w:cs="Segoe UI Semibold" w:eastAsiaTheme="minorHAnsi"/>
-                    <w:sz w:val="22"/>
-                    <w:szCs w:val="22"/>
-                  </w:rPr>
+                  <w:pStyle w:val="BCLabel0"/>
                 </w:pPr>
-                <w:proofErr w:type="spellStart"/>
                 <w:r>
-                  <w:rPr>
-                    <w:rFonts w:ascii="Segoe UI Semibold" w:hAnsi="Segoe UI Semibold" w:cs="Segoe UI Semibold" w:eastAsiaTheme="minorHAnsi"/>
-                    <w:sz w:val="22"/>
-                    <w:szCs w:val="22"/>
-                  </w:rPr>
                   <w:t>CustomerNoLbl</w:t>
                 </w:r>
-                <w:proofErr w:type="spellEnd"/>
               </w:p>
             </w:tc>
           </w:sdtContent>
         </w:sdt>
         <w:sdt>
           <w:sdtPr>
-            <w:rPr>
-              <w:rFonts w:ascii="Segoe UI Semibold" w:hAnsi="Segoe UI Semibold" w:cs="Segoe UI Semibold"/>
-              <w:sz w:val="22"/>
-              <w:szCs w:val="22"/>
-            </w:rPr>
             <w:alias w:val="CustomerNameLbl"/>
             <w:tag w:val="#BC:InsertDataItem,Labels/CustomerNameLbl"/>
             <w:id w:val="1334260404"/>
@@ -418,42 +313,24 @@
           <w:sdtContent>
             <w:tc>
               <w:tcPr>
-                <w:tcW w:w="1714" w:type="dxa"/>
+                <w:tcW w:w="556" w:type="pct"/>
                 <w:tcBorders>
                   <w:bottom w:val="single" w:color="auto" w:sz="4" w:space="0"/>
                 </w:tcBorders>
               </w:tcPr>
               <w:p>
                 <w:pPr>
-                  <w:pStyle w:val="Heading2"/>
-                  <w:cnfStyle w:val="100000000000" w:firstRow="1" w:lastRow="0" w:firstColumn="0" w:lastColumn="0" w:oddVBand="0" w:evenVBand="0" w:oddHBand="0" w:evenHBand="0" w:firstRowFirstColumn="0" w:firstRowLastColumn="0" w:lastRowFirstColumn="0" w:lastRowLastColumn="0"/>
-                  <w:rPr>
-                    <w:rFonts w:ascii="Segoe UI Semibold" w:hAnsi="Segoe UI Semibold" w:cs="Segoe UI Semibold"/>
-                    <w:sz w:val="22"/>
-                    <w:szCs w:val="22"/>
-                  </w:rPr>
+                  <w:pStyle w:val="BCLabel0"/>
                 </w:pPr>
-                <w:proofErr w:type="spellStart"/>
                 <w:r>
-                  <w:rPr>
-                    <w:rFonts w:ascii="Segoe UI Semibold" w:hAnsi="Segoe UI Semibold" w:cs="Segoe UI Semibold"/>
-                    <w:sz w:val="22"/>
-                    <w:szCs w:val="22"/>
-                  </w:rPr>
                   <w:t>CustomerNameLbl</w:t>
                 </w:r>
-                <w:proofErr w:type="spellEnd"/>
               </w:p>
             </w:tc>
           </w:sdtContent>
         </w:sdt>
         <w:sdt>
           <w:sdtPr>
-            <w:rPr>
-              <w:rFonts w:ascii="Segoe UI Semibold" w:hAnsi="Segoe UI Semibold" w:cs="Segoe UI Semibold"/>
-              <w:sz w:val="22"/>
-              <w:szCs w:val="22"/>
-            </w:rPr>
             <w:alias w:val="CurrencyCode_SalesLineCaption"/>
             <w:tag w:val="#BC:InsertDataItem,Labels/CurrencyCode_SalesLineCaption"/>
             <w:id w:val="-1944988925"/>
@@ -467,52 +344,24 @@
           <w:sdtContent>
             <w:tc>
               <w:tcPr>
-                <w:tcW w:w="1713" w:type="dxa"/>
+                <w:tcW w:w="555" w:type="pct"/>
                 <w:tcBorders>
                   <w:bottom w:val="single" w:color="auto" w:sz="4" w:space="0"/>
                 </w:tcBorders>
               </w:tcPr>
               <w:p>
                 <w:pPr>
-                  <w:pStyle w:val="Heading2"/>
-                  <w:cnfStyle w:val="100000000000" w:firstRow="1" w:lastRow="0" w:firstColumn="0" w:lastColumn="0" w:oddVBand="0" w:evenVBand="0" w:oddHBand="0" w:evenHBand="0" w:firstRowFirstColumn="0" w:firstRowLastColumn="0" w:lastRowFirstColumn="0" w:lastRowLastColumn="0"/>
-                  <w:rPr>
-                    <w:rFonts w:ascii="Segoe UI Semibold" w:hAnsi="Segoe UI Semibold" w:cs="Segoe UI Semibold"/>
-                    <w:sz w:val="22"/>
-                    <w:szCs w:val="22"/>
-                  </w:rPr>
+                  <w:pStyle w:val="BCLabel0"/>
                 </w:pPr>
-                <w:proofErr w:type="spellStart"/>
-                <w:proofErr w:type="gramStart"/>
                 <w:r>
-                  <w:rPr>
-                    <w:rFonts w:ascii="Segoe UI Semibold" w:hAnsi="Segoe UI Semibold" w:cs="Segoe UI Semibold"/>
-                    <w:sz w:val="22"/>
-                    <w:szCs w:val="22"/>
-                  </w:rPr>
-                  <w:t>CurrencyCode</w:t>
+                  <w:t>CurrencyCode_SalesLineCaption</w:t>
                 </w:r>
-                <w:proofErr w:type="gramEnd"/>
-                <w:r>
-                  <w:rPr>
-                    <w:rFonts w:ascii="Segoe UI Semibold" w:hAnsi="Segoe UI Semibold" w:cs="Segoe UI Semibold"/>
-                    <w:sz w:val="22"/>
-                    <w:szCs w:val="22"/>
-                  </w:rPr>
-                  <w:t>_SalesLineCaption</w:t>
-                </w:r>
-                <w:proofErr w:type="spellEnd"/>
               </w:p>
             </w:tc>
           </w:sdtContent>
         </w:sdt>
         <w:sdt>
           <w:sdtPr>
-            <w:rPr>
-              <w:rFonts w:ascii="Segoe UI Semibold" w:hAnsi="Segoe UI Semibold" w:cs="Segoe UI Semibold"/>
-              <w:sz w:val="22"/>
-              <w:szCs w:val="22"/>
-            </w:rPr>
             <w:alias w:val="Before1Lbl"/>
             <w:tag w:val="#BC:InsertDataItem,Labels/Before1Lbl"/>
             <w:id w:val="-1228152801"/>
@@ -526,297 +375,282 @@
           <w:sdtContent>
             <w:tc>
               <w:tcPr>
-                <w:tcW w:w="1714" w:type="dxa"/>
+                <w:tcW w:w="556" w:type="pct"/>
                 <w:tcBorders>
                   <w:bottom w:val="single" w:color="auto" w:sz="4" w:space="0"/>
                 </w:tcBorders>
               </w:tcPr>
               <w:p>
                 <w:pPr>
-                  <w:pStyle w:val="Heading2"/>
+                  <w:pStyle w:val="BCLabelNumber0"/>
                   <w:jc w:val="right"/>
-                  <w:cnfStyle w:val="100000000000" w:firstRow="1" w:lastRow="0" w:firstColumn="0" w:lastColumn="0" w:oddVBand="0" w:evenVBand="0" w:oddHBand="0" w:evenHBand="0" w:firstRowFirstColumn="0" w:firstRowLastColumn="0" w:lastRowFirstColumn="0" w:lastRowLastColumn="0"/>
-                  <w:rPr>
-                    <w:rFonts w:ascii="Segoe UI Semibold" w:hAnsi="Segoe UI Semibold" w:cs="Segoe UI Semibold"/>
-                    <w:sz w:val="22"/>
-                    <w:szCs w:val="22"/>
-                  </w:rPr>
                 </w:pPr>
                 <w:r>
-                  <w:rPr>
-                    <w:rFonts w:ascii="Segoe UI Semibold" w:hAnsi="Segoe UI Semibold" w:cs="Segoe UI Semibold"/>
-                    <w:sz w:val="22"/>
-                    <w:szCs w:val="22"/>
-                  </w:rPr>
                   <w:t>Before1Lbl</w:t>
                 </w:r>
               </w:p>
             </w:tc>
           </w:sdtContent>
         </w:sdt>
-        <w:sdt>
-          <w:sdtPr>
-            <w:rPr>
-              <w:rFonts w:ascii="Segoe UI Semibold" w:hAnsi="Segoe UI Semibold" w:cs="Segoe UI Semibold"/>
-              <w:sz w:val="22"/>
-              <w:szCs w:val="22"/>
-            </w:rPr>
-            <w:alias w:val="PeriodStartDate1"/>
-            <w:tag w:val="#BC:InsertDataItem,DataItems/Customer/PeriodStartDate1"/>
-            <w:id w:val="2026817770"/>
-            <w:placeholder>
-              <w:docPart w:val="DefaultPlaceholder_-1854013440"/>
-            </w:placeholder>
-            <w:dataBinding w:prefixMappings="xmlns:ns0='urn:microsoft-dynamics-nav/reports/Customer_Order_Summary/107/'" w:xpath="/ns0:NavWordReportXmlPart[1]/ns0:Customer[1]/ns0:PeriodStartDate1[1]" w:storeItemID="{00000000-0000-0000-0000-000000000000}"/>
-            <w15:color w:val="808080"/>
-            <w:text/>
-          </w:sdtPr>
-          <w:sdtContent>
-            <w:tc>
-              <w:tcPr>
-                <w:tcW w:w="1713" w:type="dxa"/>
-                <w:tcBorders>
-                  <w:bottom w:val="single" w:color="auto" w:sz="4" w:space="0"/>
-                </w:tcBorders>
-              </w:tcPr>
+        <w:tc>
+          <w:tcPr>
+            <w:tcW w:w="555" w:type="pct"/>
+            <w:tcBorders>
+              <w:bottom w:val="single" w:color="auto" w:sz="4" w:space="0"/>
+            </w:tcBorders>
+          </w:tcPr>
+          <w:sdt>
+            <w:sdtPr>
+              <w:alias w:val="PeriodStartDate1"/>
+              <w:tag w:val="#BC:InsertDataItem,DataItems/Customer/PeriodStartDate1"/>
+              <w:id w:val="2026817770"/>
+              <w:placeholder>
+                <w:docPart w:val="DefaultPlaceholder_-1854013440"/>
+              </w:placeholder>
+              <w:dataBinding w:prefixMappings="xmlns:ns0='urn:microsoft-dynamics-nav/reports/Customer_Order_Summary/107/'" w:xpath="/ns0:NavWordReportXmlPart[1]/ns0:Customer[1]/ns0:PeriodStartDate1[1]" w:storeItemID="{00000000-0000-0000-0000-000000000000}"/>
+              <w15:color w:val="808080"/>
+              <w:text/>
+            </w:sdtPr>
+            <w:sdtContent>
               <w:p>
                 <w:pPr>
-                  <w:pStyle w:val="Heading2"/>
+                  <w:pStyle w:val="BCLabelNumber0"/>
                   <w:jc w:val="right"/>
-                  <w:cnfStyle w:val="100000000000" w:firstRow="1" w:lastRow="0" w:firstColumn="0" w:lastColumn="0" w:oddVBand="0" w:evenVBand="0" w:oddHBand="0" w:evenHBand="0" w:firstRowFirstColumn="0" w:firstRowLastColumn="0" w:lastRowFirstColumn="0" w:lastRowLastColumn="0"/>
-                  <w:rPr>
-                    <w:rFonts w:ascii="Segoe UI Semibold" w:hAnsi="Segoe UI Semibold" w:cs="Segoe UI Semibold"/>
-                    <w:sz w:val="22"/>
-                    <w:szCs w:val="22"/>
-                  </w:rPr>
                 </w:pPr>
                 <w:r>
-                  <w:rPr>
-                    <w:rFonts w:ascii="Segoe UI Semibold" w:hAnsi="Segoe UI Semibold" w:cs="Segoe UI Semibold"/>
-                    <w:sz w:val="22"/>
-                    <w:szCs w:val="22"/>
-                  </w:rPr>
                   <w:t>PeriodStartDate1</w:t>
                 </w:r>
               </w:p>
-            </w:tc>
-          </w:sdtContent>
-        </w:sdt>
-        <w:sdt>
-          <w:sdtPr>
-            <w:rPr>
-              <w:rFonts w:ascii="Segoe UI Semibold" w:hAnsi="Segoe UI Semibold" w:cs="Segoe UI Semibold"/>
-              <w:sz w:val="22"/>
-              <w:szCs w:val="22"/>
-            </w:rPr>
-            <w:alias w:val="PeriodStartDate2"/>
-            <w:tag w:val="#BC:InsertDataItem,DataItems/Customer/PeriodStartDate2"/>
-            <w:id w:val="146951674"/>
-            <w:placeholder>
-              <w:docPart w:val="DefaultPlaceholder_-1854013440"/>
-            </w:placeholder>
-            <w:dataBinding w:prefixMappings="xmlns:ns0='urn:microsoft-dynamics-nav/reports/Customer_Order_Summary/107/'" w:xpath="/ns0:NavWordReportXmlPart[1]/ns0:Customer[1]/ns0:PeriodStartDate2[1]" w:storeItemID="{00000000-0000-0000-0000-000000000000}"/>
-            <w15:color w:val="808080"/>
-            <w:text/>
-          </w:sdtPr>
-          <w:sdtContent>
-            <w:tc>
-              <w:tcPr>
-                <w:tcW w:w="1714" w:type="dxa"/>
-                <w:tcBorders>
-                  <w:bottom w:val="single" w:color="auto" w:sz="4" w:space="0"/>
-                </w:tcBorders>
-              </w:tcPr>
+            </w:sdtContent>
+          </w:sdt>
+          <w:p>
+            <w:pPr>
+              <w:pStyle w:val="BCLabelNumber0"/>
+              <w:jc w:val="right"/>
+            </w:pPr>
+            <w:sdt>
+              <w:sdtPr>
+                <w:alias w:val="#Nav: /Customer/PeriodStartDate21"/>
+                <w:tag w:val="#Nav: Customer_Order_Summary/107"/>
+                <w:id w:val="849211576"/>
+                <w:placeholder>
+                  <w:docPart w:val="5F2903C5364142F592C70983355C4059"/>
+                </w:placeholder>
+                <w:dataBinding w:prefixMappings="xmlns:ns0='urn:microsoft-dynamics-nav/reports/Customer_Order_Summary/107/'" w:xpath="/ns0:NavWordReportXmlPart[1]/ns0:Customer[1]/ns0:PeriodStartDate21[1]" w:storeItemID="{935A1A8B-FBD8-496F-9CFA-0DAB10C40436}"/>
+                <w:text/>
+              </w:sdtPr>
+              <w:sdtContent>
+                <w:r>
+                  <w:t>PeriodStartDate21</w:t>
+                </w:r>
+              </w:sdtContent>
+            </w:sdt>
+          </w:p>
+        </w:tc>
+        <w:tc>
+          <w:tcPr>
+            <w:tcW w:w="556" w:type="pct"/>
+            <w:tcBorders>
+              <w:bottom w:val="single" w:color="auto" w:sz="4" w:space="0"/>
+            </w:tcBorders>
+          </w:tcPr>
+          <w:sdt>
+            <w:sdtPr>
+              <w:alias w:val="PeriodStartDate2"/>
+              <w:tag w:val="#BC:InsertDataItem,DataItems/Customer/PeriodStartDate2"/>
+              <w:id w:val="146951674"/>
+              <w:placeholder>
+                <w:docPart w:val="DefaultPlaceholder_-1854013440"/>
+              </w:placeholder>
+              <w:dataBinding w:prefixMappings="xmlns:ns0='urn:microsoft-dynamics-nav/reports/Customer_Order_Summary/107/'" w:xpath="/ns0:NavWordReportXmlPart[1]/ns0:Customer[1]/ns0:PeriodStartDate2[1]" w:storeItemID="{00000000-0000-0000-0000-000000000000}"/>
+              <w15:color w:val="808080"/>
+              <w:text/>
+            </w:sdtPr>
+            <w:sdtContent>
               <w:p>
                 <w:pPr>
-                  <w:pStyle w:val="Heading2"/>
+                  <w:pStyle w:val="BCLabelNumber0"/>
                   <w:jc w:val="right"/>
-                  <w:cnfStyle w:val="100000000000" w:firstRow="1" w:lastRow="0" w:firstColumn="0" w:lastColumn="0" w:oddVBand="0" w:evenVBand="0" w:oddHBand="0" w:evenHBand="0" w:firstRowFirstColumn="0" w:firstRowLastColumn="0" w:lastRowFirstColumn="0" w:lastRowLastColumn="0"/>
-                  <w:rPr>
-                    <w:rFonts w:ascii="Segoe UI Semibold" w:hAnsi="Segoe UI Semibold" w:cs="Segoe UI Semibold"/>
-                    <w:sz w:val="22"/>
-                    <w:szCs w:val="22"/>
-                  </w:rPr>
                 </w:pPr>
                 <w:r>
-                  <w:rPr>
-                    <w:rFonts w:ascii="Segoe UI Semibold" w:hAnsi="Segoe UI Semibold" w:cs="Segoe UI Semibold"/>
-                    <w:sz w:val="22"/>
-                    <w:szCs w:val="22"/>
-                  </w:rPr>
                   <w:t>PeriodStartDate2</w:t>
                 </w:r>
               </w:p>
-            </w:tc>
-          </w:sdtContent>
-        </w:sdt>
-        <w:sdt>
-          <w:sdtPr>
-            <w:rPr>
-              <w:rFonts w:ascii="Segoe UI Semibold" w:hAnsi="Segoe UI Semibold" w:cs="Segoe UI Semibold"/>
-              <w:sz w:val="22"/>
-              <w:szCs w:val="22"/>
-            </w:rPr>
-            <w:alias w:val="PeriodStartDate3"/>
-            <w:tag w:val="#BC:InsertDataItem,DataItems/Customer/PeriodStartDate3"/>
-            <w:id w:val="-1647040021"/>
-            <w:placeholder>
-              <w:docPart w:val="DefaultPlaceholder_-1854013440"/>
-            </w:placeholder>
-            <w:dataBinding w:prefixMappings="xmlns:ns0='urn:microsoft-dynamics-nav/reports/Customer_Order_Summary/107/'" w:xpath="/ns0:NavWordReportXmlPart[1]/ns0:Customer[1]/ns0:PeriodStartDate3[1]" w:storeItemID="{00000000-0000-0000-0000-000000000000}"/>
-            <w15:color w:val="808080"/>
-            <w:text/>
-          </w:sdtPr>
-          <w:sdtContent>
-            <w:tc>
-              <w:tcPr>
-                <w:tcW w:w="1713" w:type="dxa"/>
-                <w:tcBorders>
-                  <w:bottom w:val="single" w:color="auto" w:sz="4" w:space="0"/>
-                </w:tcBorders>
-              </w:tcPr>
+            </w:sdtContent>
+          </w:sdt>
+          <w:p>
+            <w:pPr>
+              <w:pStyle w:val="BCLabelNumber0"/>
+              <w:jc w:val="right"/>
+            </w:pPr>
+            <w:sdt>
+              <w:sdtPr>
+                <w:alias w:val="#Nav: /Customer/PeriodStartDate31"/>
+                <w:tag w:val="#Nav: Customer_Order_Summary/107"/>
+                <w:id w:val="-154614184"/>
+                <w:placeholder>
+                  <w:docPart w:val="5CF7C4BFCF934A4AA31A1EB8FF20C82F"/>
+                </w:placeholder>
+                <w:dataBinding w:prefixMappings="xmlns:ns0='urn:microsoft-dynamics-nav/reports/Customer_Order_Summary/107/'" w:xpath="/ns0:NavWordReportXmlPart[1]/ns0:Customer[1]/ns0:PeriodStartDate31[1]" w:storeItemID="{935A1A8B-FBD8-496F-9CFA-0DAB10C40436}"/>
+                <w:text/>
+              </w:sdtPr>
+              <w:sdtContent>
+                <w:r>
+                  <w:t>PeriodStartDate31</w:t>
+                </w:r>
+              </w:sdtContent>
+            </w:sdt>
+          </w:p>
+        </w:tc>
+        <w:tc>
+          <w:tcPr>
+            <w:tcW w:w="555" w:type="pct"/>
+            <w:tcBorders>
+              <w:bottom w:val="single" w:color="auto" w:sz="4" w:space="0"/>
+            </w:tcBorders>
+          </w:tcPr>
+          <w:sdt>
+            <w:sdtPr>
+              <w:alias w:val="PeriodStartDate3"/>
+              <w:tag w:val="#BC:InsertDataItem,DataItems/Customer/PeriodStartDate3"/>
+              <w:id w:val="-1647040021"/>
+              <w:placeholder>
+                <w:docPart w:val="DefaultPlaceholder_-1854013440"/>
+              </w:placeholder>
+              <w:dataBinding w:prefixMappings="xmlns:ns0='urn:microsoft-dynamics-nav/reports/Customer_Order_Summary/107/'" w:xpath="/ns0:NavWordReportXmlPart[1]/ns0:Customer[1]/ns0:PeriodStartDate3[1]" w:storeItemID="{00000000-0000-0000-0000-000000000000}"/>
+              <w15:color w:val="808080"/>
+              <w:text/>
+            </w:sdtPr>
+            <w:sdtContent>
               <w:p>
                 <w:pPr>
-                  <w:pStyle w:val="Heading2"/>
+                  <w:pStyle w:val="BCLabelNumber0"/>
                   <w:jc w:val="right"/>
-                  <w:cnfStyle w:val="100000000000" w:firstRow="1" w:lastRow="0" w:firstColumn="0" w:lastColumn="0" w:oddVBand="0" w:evenVBand="0" w:oddHBand="0" w:evenHBand="0" w:firstRowFirstColumn="0" w:firstRowLastColumn="0" w:lastRowFirstColumn="0" w:lastRowLastColumn="0"/>
-                  <w:rPr>
-                    <w:rFonts w:ascii="Segoe UI Semibold" w:hAnsi="Segoe UI Semibold" w:cs="Segoe UI Semibold"/>
-                    <w:sz w:val="22"/>
-                    <w:szCs w:val="22"/>
-                  </w:rPr>
                 </w:pPr>
                 <w:r>
-                  <w:rPr>
-                    <w:rFonts w:ascii="Segoe UI Semibold" w:hAnsi="Segoe UI Semibold" w:cs="Segoe UI Semibold"/>
-                    <w:sz w:val="22"/>
-                    <w:szCs w:val="22"/>
-                  </w:rPr>
                   <w:t>PeriodStartDate3</w:t>
                 </w:r>
               </w:p>
-            </w:tc>
-          </w:sdtContent>
-        </w:sdt>
-        <w:sdt>
-          <w:sdtPr>
-            <w:rPr>
-              <w:rFonts w:ascii="Segoe UI Semibold" w:hAnsi="Segoe UI Semibold" w:cs="Segoe UI Semibold"/>
-              <w:sz w:val="22"/>
-              <w:szCs w:val="22"/>
-            </w:rPr>
-            <w:alias w:val="After1Lbl"/>
-            <w:tag w:val="#BC:InsertDataItem,Labels/After1Lbl"/>
-            <w:id w:val="-572970979"/>
-            <w:placeholder>
-              <w:docPart w:val="DefaultPlaceholder_-1854013440"/>
-            </w:placeholder>
-            <w:dataBinding w:prefixMappings="xmlns:ns0='urn:microsoft-dynamics-nav/reports/Customer_Order_Summary/107/'" w:xpath="/ns0:NavWordReportXmlPart[1]/ns0:Labels[1]/ns0:After1Lbl[1]" w:storeItemID="{00000000-0000-0000-0000-000000000000}"/>
-            <w15:color w:val="808080"/>
-            <w:text/>
-          </w:sdtPr>
-          <w:sdtContent>
-            <w:tc>
-              <w:tcPr>
-                <w:tcW w:w="1714" w:type="dxa"/>
-                <w:tcBorders>
-                  <w:bottom w:val="single" w:color="auto" w:sz="4" w:space="0"/>
-                </w:tcBorders>
-              </w:tcPr>
+            </w:sdtContent>
+          </w:sdt>
+          <w:p>
+            <w:pPr>
+              <w:pStyle w:val="BCLabelNumber0"/>
+              <w:jc w:val="right"/>
+            </w:pPr>
+            <w:sdt>
+              <w:sdtPr>
+                <w:alias w:val="#Nav: /Customer/PeriodStartDate41"/>
+                <w:tag w:val="#Nav: Customer_Order_Summary/107"/>
+                <w:id w:val="-428341192"/>
+                <w:placeholder>
+                  <w:docPart w:val="3C8D664EF9864DDCAD46BF7DABA46242"/>
+                </w:placeholder>
+                <w:dataBinding w:prefixMappings="xmlns:ns0='urn:microsoft-dynamics-nav/reports/Customer_Order_Summary/107/'" w:xpath="/ns0:NavWordReportXmlPart[1]/ns0:Customer[1]/ns0:PeriodStartDate41[1]" w:storeItemID="{935A1A8B-FBD8-496F-9CFA-0DAB10C40436}"/>
+                <w:text/>
+              </w:sdtPr>
+              <w:sdtContent>
+                <w:r>
+                  <w:t>PeriodStartDate41</w:t>
+                </w:r>
+              </w:sdtContent>
+            </w:sdt>
+          </w:p>
+        </w:tc>
+        <w:tc>
+          <w:tcPr>
+            <w:tcW w:w="556" w:type="pct"/>
+            <w:tcBorders>
+              <w:bottom w:val="single" w:color="auto" w:sz="4" w:space="0"/>
+            </w:tcBorders>
+          </w:tcPr>
+          <w:p>
+            <w:pPr>
+              <w:pStyle w:val="BCLabelNumber0"/>
+              <w:jc w:val="right"/>
+            </w:pPr>
+          </w:p>
+          <w:sdt>
+            <w:sdtPr>
+              <w:alias w:val="After1Lbl"/>
+              <w:tag w:val="#BC:InsertDataItem,Labels/After1Lbl"/>
+              <w:id w:val="-572970979"/>
+              <w:placeholder>
+                <w:docPart w:val="DefaultPlaceholder_-1854013440"/>
+              </w:placeholder>
+              <w:dataBinding w:prefixMappings="xmlns:ns0='urn:microsoft-dynamics-nav/reports/Customer_Order_Summary/107/'" w:xpath="/ns0:NavWordReportXmlPart[1]/ns0:Labels[1]/ns0:After1Lbl[1]" w:storeItemID="{00000000-0000-0000-0000-000000000000}"/>
+              <w15:color w:val="808080"/>
+              <w:text/>
+            </w:sdtPr>
+            <w:sdtContent>
               <w:p>
                 <w:pPr>
-                  <w:pStyle w:val="Heading2"/>
+                  <w:pStyle w:val="BCLabelNumber0"/>
                   <w:jc w:val="right"/>
-                  <w:cnfStyle w:val="100000000000" w:firstRow="1" w:lastRow="0" w:firstColumn="0" w:lastColumn="0" w:oddVBand="0" w:evenVBand="0" w:oddHBand="0" w:evenHBand="0" w:firstRowFirstColumn="0" w:firstRowLastColumn="0" w:lastRowFirstColumn="0" w:lastRowLastColumn="0"/>
-                  <w:rPr>
-                    <w:rFonts w:ascii="Segoe UI Semibold" w:hAnsi="Segoe UI Semibold" w:cs="Segoe UI Semibold"/>
-                    <w:sz w:val="22"/>
-                    <w:szCs w:val="22"/>
-                  </w:rPr>
                 </w:pPr>
                 <w:r>
-                  <w:rPr>
-                    <w:rFonts w:ascii="Segoe UI Semibold" w:hAnsi="Segoe UI Semibold" w:cs="Segoe UI Semibold"/>
-                    <w:sz w:val="22"/>
-                    <w:szCs w:val="22"/>
-                  </w:rPr>
                   <w:t>After1Lbl</w:t>
                 </w:r>
               </w:p>
-            </w:tc>
-          </w:sdtContent>
-        </w:sdt>
-        <w:sdt>
-          <w:sdtPr>
-            <w:rPr>
-              <w:rFonts w:ascii="Segoe UI Semibold" w:hAnsi="Segoe UI Semibold" w:cs="Segoe UI Semibold"/>
-              <w:sz w:val="22"/>
-              <w:szCs w:val="22"/>
-            </w:rPr>
-            <w:alias w:val="TotalCaptionLbl"/>
-            <w:tag w:val="#BC:InsertDataItem,Labels/TotalCaptionLbl"/>
-            <w:id w:val="762497398"/>
-            <w:placeholder>
-              <w:docPart w:val="DefaultPlaceholder_-1854013440"/>
-            </w:placeholder>
-            <w:dataBinding w:prefixMappings="xmlns:ns0='urn:microsoft-dynamics-nav/reports/Customer_Order_Summary/107/'" w:xpath="/ns0:NavWordReportXmlPart[1]/ns0:Labels[1]/ns0:TotalCaptionLbl[1]" w:storeItemID="{00000000-0000-0000-0000-000000000000}"/>
-            <w15:color w:val="808080"/>
-            <w:text/>
-          </w:sdtPr>
-          <w:sdtContent>
-            <w:tc>
-              <w:tcPr>
-                <w:tcW w:w="1714" w:type="dxa"/>
-                <w:tcBorders>
-                  <w:bottom w:val="single" w:color="auto" w:sz="4" w:space="0"/>
-                </w:tcBorders>
-              </w:tcPr>
+            </w:sdtContent>
+          </w:sdt>
+        </w:tc>
+        <w:tc>
+          <w:tcPr>
+            <w:tcW w:w="556" w:type="pct"/>
+            <w:tcBorders>
+              <w:bottom w:val="single" w:color="auto" w:sz="4" w:space="0"/>
+            </w:tcBorders>
+          </w:tcPr>
+          <w:p>
+            <w:pPr>
+              <w:pStyle w:val="BCLabelNumber0"/>
+              <w:jc w:val="right"/>
+            </w:pPr>
+          </w:p>
+          <w:sdt>
+            <w:sdtPr>
+              <w:alias w:val="TotalCaptionLbl"/>
+              <w:tag w:val="#BC:InsertDataItem,Labels/TotalCaptionLbl"/>
+              <w:id w:val="762497398"/>
+              <w:placeholder>
+                <w:docPart w:val="DefaultPlaceholder_-1854013440"/>
+              </w:placeholder>
+              <w:dataBinding w:prefixMappings="xmlns:ns0='urn:microsoft-dynamics-nav/reports/Customer_Order_Summary/107/'" w:xpath="/ns0:NavWordReportXmlPart[1]/ns0:Labels[1]/ns0:TotalCaptionLbl[1]" w:storeItemID="{00000000-0000-0000-0000-000000000000}"/>
+              <w15:color w:val="808080"/>
+              <w:text/>
+            </w:sdtPr>
+            <w:sdtContent>
               <w:p>
                 <w:pPr>
-                  <w:pStyle w:val="Heading2"/>
+                  <w:pStyle w:val="BCLabelNumber0"/>
                   <w:jc w:val="right"/>
-                  <w:cnfStyle w:val="100000000000" w:firstRow="1" w:lastRow="0" w:firstColumn="0" w:lastColumn="0" w:oddVBand="0" w:evenVBand="0" w:oddHBand="0" w:evenHBand="0" w:firstRowFirstColumn="0" w:firstRowLastColumn="0" w:lastRowFirstColumn="0" w:lastRowLastColumn="0"/>
-                  <w:rPr>
-                    <w:rFonts w:ascii="Segoe UI Semibold" w:hAnsi="Segoe UI Semibold" w:cs="Segoe UI Semibold"/>
-                    <w:sz w:val="22"/>
-                    <w:szCs w:val="22"/>
-                  </w:rPr>
                 </w:pPr>
-                <w:proofErr w:type="spellStart"/>
                 <w:r>
-                  <w:rPr>
-                    <w:rFonts w:ascii="Segoe UI Semibold" w:hAnsi="Segoe UI Semibold" w:cs="Segoe UI Semibold"/>
-                    <w:sz w:val="22"/>
-                    <w:szCs w:val="22"/>
-                  </w:rPr>
                   <w:t>TotalCaptionLbl</w:t>
                 </w:r>
-                <w:proofErr w:type="spellEnd"/>
               </w:p>
-            </w:tc>
-          </w:sdtContent>
-        </w:sdt>
+            </w:sdtContent>
+          </w:sdt>
+        </w:tc>
       </w:tr>
       <w:tr>
         <w:trPr>
           <w:cnfStyle w:val="000000100000" w:firstRow="0" w:lastRow="0" w:firstColumn="0" w:lastColumn="0" w:oddVBand="0" w:evenVBand="0" w:oddHBand="1" w:evenHBand="0" w:firstRowFirstColumn="0" w:firstRowLastColumn="0" w:lastRowFirstColumn="0" w:lastRowLastColumn="0"/>
-          <w:trHeight w:val="245" w:hRule="exact"/>
+          <w:cantSplit/>
+          <w:trHeight w:val="245"/>
         </w:trPr>
         <w:tc>
           <w:tcPr>
-            <w:cnfStyle w:val="001000000000" w:firstRow="0" w:lastRow="0" w:firstColumn="1" w:lastColumn="0" w:oddVBand="0" w:evenVBand="0" w:oddHBand="0" w:evenHBand="0" w:firstRowFirstColumn="0" w:firstRowLastColumn="0" w:lastRowFirstColumn="0" w:lastRowLastColumn="0"/>
-            <w:tcW w:w="1713" w:type="dxa"/>
+            <w:tcW w:w="555" w:type="pct"/>
             <w:tcBorders>
               <w:top w:val="single" w:color="auto" w:sz="4" w:space="0"/>
             </w:tcBorders>
           </w:tcPr>
           <w:p>
             <w:pPr>
+              <w:pStyle w:val="NoSpacing"/>
               <w:rPr>
-                <w:rFonts w:ascii="Segoe UI Semibold" w:hAnsi="Segoe UI Semibold" w:cs="Segoe UI Semibold"/>
-                <w:b/>
-                <w:sz w:val="22"/>
-                <w:szCs w:val="22"/>
                 <w:lang w:val="en-US" w:eastAsia="en-US"/>
               </w:rPr>
             </w:pPr>
@@ -824,20 +658,15 @@
         </w:tc>
         <w:tc>
           <w:tcPr>
-            <w:tcW w:w="1714" w:type="dxa"/>
+            <w:tcW w:w="556" w:type="pct"/>
             <w:tcBorders>
               <w:top w:val="single" w:color="auto" w:sz="4" w:space="0"/>
             </w:tcBorders>
           </w:tcPr>
           <w:p>
             <w:pPr>
-              <w:cnfStyle w:val="000000100000" w:firstRow="0" w:lastRow="0" w:firstColumn="0" w:lastColumn="0" w:oddVBand="0" w:evenVBand="0" w:oddHBand="1" w:evenHBand="0" w:firstRowFirstColumn="0" w:firstRowLastColumn="0" w:lastRowFirstColumn="0" w:lastRowLastColumn="0"/>
+              <w:pStyle w:val="NoSpacing"/>
               <w:rPr>
-                <w:rFonts w:ascii="Segoe UI Semibold" w:hAnsi="Segoe UI Semibold" w:cs="Segoe UI Semibold"/>
-                <w:b/>
-                <w:bCs/>
-                <w:sz w:val="22"/>
-                <w:szCs w:val="22"/>
                 <w:lang w:val="en-US" w:eastAsia="en-US"/>
               </w:rPr>
             </w:pPr>
@@ -845,20 +674,15 @@
         </w:tc>
         <w:tc>
           <w:tcPr>
-            <w:tcW w:w="1713" w:type="dxa"/>
+            <w:tcW w:w="555" w:type="pct"/>
             <w:tcBorders>
               <w:top w:val="single" w:color="auto" w:sz="4" w:space="0"/>
             </w:tcBorders>
           </w:tcPr>
           <w:p>
             <w:pPr>
-              <w:cnfStyle w:val="000000100000" w:firstRow="0" w:lastRow="0" w:firstColumn="0" w:lastColumn="0" w:oddVBand="0" w:evenVBand="0" w:oddHBand="1" w:evenHBand="0" w:firstRowFirstColumn="0" w:firstRowLastColumn="0" w:lastRowFirstColumn="0" w:lastRowLastColumn="0"/>
+              <w:pStyle w:val="NoSpacing"/>
               <w:rPr>
-                <w:rFonts w:ascii="Segoe UI Semibold" w:hAnsi="Segoe UI Semibold" w:cs="Segoe UI Semibold"/>
-                <w:b/>
-                <w:bCs/>
-                <w:sz w:val="22"/>
-                <w:szCs w:val="22"/>
                 <w:lang w:val="en-US" w:eastAsia="en-US"/>
               </w:rPr>
             </w:pPr>
@@ -866,20 +690,15 @@
         </w:tc>
         <w:tc>
           <w:tcPr>
-            <w:tcW w:w="1714" w:type="dxa"/>
+            <w:tcW w:w="556" w:type="pct"/>
             <w:tcBorders>
               <w:top w:val="single" w:color="auto" w:sz="4" w:space="0"/>
             </w:tcBorders>
           </w:tcPr>
           <w:p>
             <w:pPr>
-              <w:cnfStyle w:val="000000100000" w:firstRow="0" w:lastRow="0" w:firstColumn="0" w:lastColumn="0" w:oddVBand="0" w:evenVBand="0" w:oddHBand="1" w:evenHBand="0" w:firstRowFirstColumn="0" w:firstRowLastColumn="0" w:lastRowFirstColumn="0" w:lastRowLastColumn="0"/>
+              <w:pStyle w:val="NoSpacing"/>
               <w:rPr>
-                <w:rFonts w:ascii="Segoe UI Semibold" w:hAnsi="Segoe UI Semibold" w:cs="Segoe UI Semibold"/>
-                <w:b/>
-                <w:bCs/>
-                <w:sz w:val="22"/>
-                <w:szCs w:val="22"/>
                 <w:lang w:val="en-US" w:eastAsia="en-US"/>
               </w:rPr>
             </w:pPr>
@@ -887,20 +706,15 @@
         </w:tc>
         <w:tc>
           <w:tcPr>
-            <w:tcW w:w="1713" w:type="dxa"/>
+            <w:tcW w:w="555" w:type="pct"/>
             <w:tcBorders>
               <w:top w:val="single" w:color="auto" w:sz="4" w:space="0"/>
             </w:tcBorders>
           </w:tcPr>
           <w:p>
             <w:pPr>
-              <w:cnfStyle w:val="000000100000" w:firstRow="0" w:lastRow="0" w:firstColumn="0" w:lastColumn="0" w:oddVBand="0" w:evenVBand="0" w:oddHBand="1" w:evenHBand="0" w:firstRowFirstColumn="0" w:firstRowLastColumn="0" w:lastRowFirstColumn="0" w:lastRowLastColumn="0"/>
+              <w:pStyle w:val="NoSpacing"/>
               <w:rPr>
-                <w:rFonts w:ascii="Segoe UI Semibold" w:hAnsi="Segoe UI Semibold" w:cs="Segoe UI Semibold"/>
-                <w:b/>
-                <w:bCs/>
-                <w:sz w:val="22"/>
-                <w:szCs w:val="22"/>
                 <w:lang w:val="en-US" w:eastAsia="en-US"/>
               </w:rPr>
             </w:pPr>
@@ -908,20 +722,15 @@
         </w:tc>
         <w:tc>
           <w:tcPr>
-            <w:tcW w:w="1714" w:type="dxa"/>
+            <w:tcW w:w="556" w:type="pct"/>
             <w:tcBorders>
               <w:top w:val="single" w:color="auto" w:sz="4" w:space="0"/>
             </w:tcBorders>
           </w:tcPr>
           <w:p>
             <w:pPr>
-              <w:cnfStyle w:val="000000100000" w:firstRow="0" w:lastRow="0" w:firstColumn="0" w:lastColumn="0" w:oddVBand="0" w:evenVBand="0" w:oddHBand="1" w:evenHBand="0" w:firstRowFirstColumn="0" w:firstRowLastColumn="0" w:lastRowFirstColumn="0" w:lastRowLastColumn="0"/>
+              <w:pStyle w:val="NoSpacing"/>
               <w:rPr>
-                <w:rFonts w:ascii="Segoe UI Semibold" w:hAnsi="Segoe UI Semibold" w:cs="Segoe UI Semibold"/>
-                <w:b/>
-                <w:bCs/>
-                <w:sz w:val="22"/>
-                <w:szCs w:val="22"/>
                 <w:lang w:val="en-US" w:eastAsia="en-US"/>
               </w:rPr>
             </w:pPr>
@@ -929,20 +738,15 @@
         </w:tc>
         <w:tc>
           <w:tcPr>
-            <w:tcW w:w="1713" w:type="dxa"/>
+            <w:tcW w:w="555" w:type="pct"/>
             <w:tcBorders>
               <w:top w:val="single" w:color="auto" w:sz="4" w:space="0"/>
             </w:tcBorders>
           </w:tcPr>
           <w:p>
             <w:pPr>
-              <w:cnfStyle w:val="000000100000" w:firstRow="0" w:lastRow="0" w:firstColumn="0" w:lastColumn="0" w:oddVBand="0" w:evenVBand="0" w:oddHBand="1" w:evenHBand="0" w:firstRowFirstColumn="0" w:firstRowLastColumn="0" w:lastRowFirstColumn="0" w:lastRowLastColumn="0"/>
+              <w:pStyle w:val="NoSpacing"/>
               <w:rPr>
-                <w:rFonts w:ascii="Segoe UI Semibold" w:hAnsi="Segoe UI Semibold" w:cs="Segoe UI Semibold"/>
-                <w:b/>
-                <w:bCs/>
-                <w:sz w:val="22"/>
-                <w:szCs w:val="22"/>
                 <w:lang w:val="en-US" w:eastAsia="en-US"/>
               </w:rPr>
             </w:pPr>
@@ -950,20 +754,15 @@
         </w:tc>
         <w:tc>
           <w:tcPr>
-            <w:tcW w:w="1714" w:type="dxa"/>
+            <w:tcW w:w="556" w:type="pct"/>
             <w:tcBorders>
               <w:top w:val="single" w:color="auto" w:sz="4" w:space="0"/>
             </w:tcBorders>
           </w:tcPr>
           <w:p>
             <w:pPr>
-              <w:cnfStyle w:val="000000100000" w:firstRow="0" w:lastRow="0" w:firstColumn="0" w:lastColumn="0" w:oddVBand="0" w:evenVBand="0" w:oddHBand="1" w:evenHBand="0" w:firstRowFirstColumn="0" w:firstRowLastColumn="0" w:lastRowFirstColumn="0" w:lastRowLastColumn="0"/>
+              <w:pStyle w:val="NoSpacing"/>
               <w:rPr>
-                <w:rFonts w:ascii="Segoe UI Semibold" w:hAnsi="Segoe UI Semibold" w:cs="Segoe UI Semibold"/>
-                <w:b/>
-                <w:bCs/>
-                <w:sz w:val="22"/>
-                <w:szCs w:val="22"/>
                 <w:lang w:val="en-US" w:eastAsia="en-US"/>
               </w:rPr>
             </w:pPr>
@@ -971,20 +770,15 @@
         </w:tc>
         <w:tc>
           <w:tcPr>
-            <w:tcW w:w="1714" w:type="dxa"/>
+            <w:tcW w:w="556" w:type="pct"/>
             <w:tcBorders>
               <w:top w:val="single" w:color="auto" w:sz="4" w:space="0"/>
             </w:tcBorders>
           </w:tcPr>
           <w:p>
             <w:pPr>
-              <w:cnfStyle w:val="000000100000" w:firstRow="0" w:lastRow="0" w:firstColumn="0" w:lastColumn="0" w:oddVBand="0" w:evenVBand="0" w:oddHBand="1" w:evenHBand="0" w:firstRowFirstColumn="0" w:firstRowLastColumn="0" w:lastRowFirstColumn="0" w:lastRowLastColumn="0"/>
+              <w:pStyle w:val="NoSpacing"/>
               <w:rPr>
-                <w:rFonts w:ascii="Segoe UI Semibold" w:hAnsi="Segoe UI Semibold" w:cs="Segoe UI Semibold"/>
-                <w:b/>
-                <w:bCs/>
-                <w:sz w:val="22"/>
-                <w:szCs w:val="22"/>
                 <w:lang w:val="en-US" w:eastAsia="en-US"/>
               </w:rPr>
             </w:pPr>
@@ -994,13 +788,8 @@
       <w:sdt>
         <w:sdtPr>
           <w:rPr>
-            <w:rFonts w:cs="Arial" w:asciiTheme="minorHAnsi" w:hAnsiTheme="minorHAnsi" w:eastAsiaTheme="minorEastAsia"/>
-            <w:bCs w:val="0"/>
-            <w:kern w:val="2"/>
-            <w:sz w:val="22"/>
-            <w:szCs w:val="22"/>
             <w:lang w:val="en-US" w:eastAsia="en-US"/>
-            <w14:ligatures w14:val="standardContextual"/>
+            <w14:numSpacing w14:val="tabular"/>
           </w:rPr>
           <w:alias w:val="Repeater: SalesLineBuffer_Integer"/>
           <w:tag w:val="#BC:InsertRepeater,DataItems/SalesLineBuffer_Integer"/>
@@ -1014,21 +803,15 @@
         </w:sdtPr>
         <w:sdtEndPr>
           <w:rPr>
-            <w:rFonts w:ascii="Segoe UI" w:hAnsi="Segoe UI" w:cstheme="minorBidi"/>
-            <w:lang w:val="en-DK" w:eastAsia="en-DK"/>
+            <w:lang/>
           </w:rPr>
         </w:sdtEndPr>
         <w:sdtContent>
           <w:sdt>
             <w:sdtPr>
               <w:rPr>
-                <w:rFonts w:cs="Arial" w:asciiTheme="minorHAnsi" w:hAnsiTheme="minorHAnsi" w:eastAsiaTheme="minorEastAsia"/>
-                <w:bCs w:val="0"/>
-                <w:kern w:val="2"/>
-                <w:sz w:val="22"/>
-                <w:szCs w:val="22"/>
                 <w:lang w:val="en-US" w:eastAsia="en-US"/>
-                <w14:ligatures w14:val="standardContextual"/>
+                <w14:numSpacing w14:val="tabular"/>
               </w:rPr>
               <w:id w:val="2102145000"/>
               <w15:color w:val="808080"/>
@@ -1036,28 +819,21 @@
             </w:sdtPr>
             <w:sdtEndPr>
               <w:rPr>
-                <w:rFonts w:cstheme="minorBidi"/>
-                <w:sz w:val="24"/>
-                <w:szCs w:val="24"/>
-                <w:lang w:val="en-DK" w:eastAsia="en-DK"/>
+                <w:lang/>
               </w:rPr>
             </w:sdtEndPr>
             <w:sdtContent>
               <w:tr>
                 <w:trPr>
                   <w:cnfStyle w:val="000000010000" w:firstRow="0" w:lastRow="0" w:firstColumn="0" w:lastColumn="0" w:oddVBand="0" w:evenVBand="0" w:oddHBand="0" w:evenHBand="1" w:firstRowFirstColumn="0" w:firstRowLastColumn="0" w:lastRowFirstColumn="0" w:lastRowLastColumn="0"/>
+                  <w:cantSplit/>
                   <w:trHeight w:val="490"/>
                 </w:trPr>
                 <w:sdt>
                   <w:sdtPr>
                     <w:rPr>
-                      <w:rFonts w:cs="Arial" w:asciiTheme="minorHAnsi" w:hAnsiTheme="minorHAnsi" w:eastAsiaTheme="minorEastAsia"/>
-                      <w:bCs w:val="0"/>
-                      <w:kern w:val="2"/>
-                      <w:sz w:val="22"/>
-                      <w:szCs w:val="22"/>
                       <w:lang w:val="en-US" w:eastAsia="en-US"/>
-                      <w14:ligatures w14:val="standardContextual"/>
+                      <w14:numSpacing w14:val="tabular"/>
                     </w:rPr>
                     <w:alias w:val="SalesLineBuffer_BilltoCustomerNo"/>
                     <w:tag w:val="#BC:InsertDataItem,DataItems/SalesLineBuffer_Integer/SalesLineBuffer_BilltoCustomerNo"/>
@@ -1071,33 +847,24 @@
                   </w:sdtPr>
                   <w:sdtEndPr>
                     <w:rPr>
-                      <w:rFonts w:ascii="Segoe UI" w:hAnsi="Segoe UI" w:eastAsia="Aptos"/>
-                      <w:kern w:val="0"/>
-                      <w14:ligatures w14:val="none"/>
+                      <w14:numSpacing w14:val="default"/>
                     </w:rPr>
                   </w:sdtEndPr>
                   <w:sdtContent>
                     <w:tc>
                       <w:tcPr>
-                        <w:cnfStyle w:val="001000000000" w:firstRow="0" w:lastRow="0" w:firstColumn="1" w:lastColumn="0" w:oddVBand="0" w:evenVBand="0" w:oddHBand="0" w:evenHBand="0" w:firstRowFirstColumn="0" w:firstRowLastColumn="0" w:lastRowFirstColumn="0" w:lastRowLastColumn="0"/>
-                        <w:tcW w:w="1713" w:type="dxa"/>
-                        <w:vAlign w:val="center"/>
+                        <w:tcW w:w="555" w:type="pct"/>
                       </w:tcPr>
                       <w:p>
                         <w:pPr>
+                          <w:pStyle w:val="NoSpacing"/>
                           <w:rPr>
-                            <w:rFonts w:cs="Arial" w:asciiTheme="minorHAnsi" w:hAnsiTheme="minorHAnsi"/>
-                            <w:sz w:val="22"/>
-                            <w:szCs w:val="22"/>
                             <w:lang w:val="en-US" w:eastAsia="en-US"/>
                           </w:rPr>
                         </w:pPr>
                         <w:proofErr w:type="spellStart"/>
                         <w:r>
                           <w:rPr>
-                            <w:rFonts w:cs="Arial" w:asciiTheme="minorHAnsi" w:hAnsiTheme="minorHAnsi"/>
-                            <w:sz w:val="22"/>
-                            <w:szCs w:val="22"/>
                             <w:lang w:val="en-US" w:eastAsia="en-US"/>
                           </w:rPr>
                           <w:t>SalesLineBuffer_BilltoCustomerNo</w:t>
@@ -1110,9 +877,6 @@
                 <w:sdt>
                   <w:sdtPr>
                     <w:rPr>
-                      <w:rFonts w:cs="Arial"/>
-                      <w:sz w:val="22"/>
-                      <w:szCs w:val="22"/>
                       <w:lang w:eastAsia="en-US"/>
                     </w:rPr>
                     <w:alias w:val="SalesLineBuffer_CustomerName"/>
@@ -1128,30 +892,21 @@
                   <w:sdtContent>
                     <w:tc>
                       <w:tcPr>
-                        <w:tcW w:w="1714" w:type="dxa"/>
-                        <w:vAlign w:val="center"/>
+                        <w:tcW w:w="556" w:type="pct"/>
                       </w:tcPr>
                       <w:p>
                         <w:pPr>
-                          <w:cnfStyle w:val="000000010000" w:firstRow="0" w:lastRow="0" w:firstColumn="0" w:lastColumn="0" w:oddVBand="0" w:evenVBand="0" w:oddHBand="0" w:evenHBand="1" w:firstRowFirstColumn="0" w:firstRowLastColumn="0" w:lastRowFirstColumn="0" w:lastRowLastColumn="0"/>
+                          <w:pStyle w:val="NoSpacing"/>
                           <w:rPr>
-                            <w:rFonts w:cs="Arial" w:asciiTheme="minorHAnsi" w:hAnsiTheme="minorHAnsi"/>
-                            <w:sz w:val="22"/>
-                            <w:szCs w:val="22"/>
                             <w:lang w:eastAsia="en-US"/>
                           </w:rPr>
                         </w:pPr>
-                        <w:proofErr w:type="spellStart"/>
                         <w:r>
                           <w:rPr>
-                            <w:rFonts w:cs="Arial" w:asciiTheme="minorHAnsi" w:hAnsiTheme="minorHAnsi"/>
-                            <w:sz w:val="22"/>
-                            <w:szCs w:val="22"/>
                             <w:lang w:eastAsia="en-US"/>
                           </w:rPr>
                           <w:t>SalesLineBuffer_CustomerName</w:t>
                         </w:r>
-                        <w:proofErr w:type="spellEnd"/>
                       </w:p>
                     </w:tc>
                   </w:sdtContent>
@@ -1159,9 +914,6 @@
                 <w:sdt>
                   <w:sdtPr>
                     <w:rPr>
-                      <w:rFonts w:cs="Arial"/>
-                      <w:sz w:val="22"/>
-                      <w:szCs w:val="22"/>
                       <w:lang w:val="en-US" w:eastAsia="en-US"/>
                     </w:rPr>
                     <w:alias w:val="SalesLineBuffer_CurrencyCode"/>
@@ -1177,25 +929,18 @@
                   <w:sdtContent>
                     <w:tc>
                       <w:tcPr>
-                        <w:tcW w:w="1713" w:type="dxa"/>
-                        <w:vAlign w:val="center"/>
+                        <w:tcW w:w="555" w:type="pct"/>
                       </w:tcPr>
                       <w:p>
                         <w:pPr>
-                          <w:cnfStyle w:val="000000010000" w:firstRow="0" w:lastRow="0" w:firstColumn="0" w:lastColumn="0" w:oddVBand="0" w:evenVBand="0" w:oddHBand="0" w:evenHBand="1" w:firstRowFirstColumn="0" w:firstRowLastColumn="0" w:lastRowFirstColumn="0" w:lastRowLastColumn="0"/>
+                          <w:pStyle w:val="NoSpacing"/>
                           <w:rPr>
-                            <w:rFonts w:cs="Arial" w:asciiTheme="minorHAnsi" w:hAnsiTheme="minorHAnsi"/>
-                            <w:sz w:val="22"/>
-                            <w:szCs w:val="22"/>
                             <w:lang w:val="en-US" w:eastAsia="en-US"/>
                           </w:rPr>
                         </w:pPr>
                         <w:proofErr w:type="spellStart"/>
                         <w:r>
                           <w:rPr>
-                            <w:rFonts w:cs="Arial" w:asciiTheme="minorHAnsi" w:hAnsiTheme="minorHAnsi"/>
-                            <w:sz w:val="22"/>
-                            <w:szCs w:val="22"/>
                             <w:lang w:val="en-US" w:eastAsia="en-US"/>
                           </w:rPr>
                           <w:t>SalesLineBuffer_CurrencyCode</w:t>
@@ -1207,10 +952,6 @@
                 </w:sdt>
                 <w:sdt>
                   <w:sdtPr>
-                    <w:rPr>
-                      <w:sz w:val="22"/>
-                      <w:szCs w:val="22"/>
-                    </w:rPr>
                     <w:alias w:val="SalesLineBuffer_SalesAmtOnOrder1"/>
                     <w:tag w:val="#BC:InsertDataItem,DataItems/SalesLineBuffer_Integer/SalesLineBuffer_SalesAmtOnOrder1"/>
                     <w:id w:val="1244072183"/>
@@ -1224,25 +965,14 @@
                   <w:sdtContent>
                     <w:tc>
                       <w:tcPr>
-                        <w:tcW w:w="1714" w:type="dxa"/>
-                        <w:vAlign w:val="center"/>
+                        <w:tcW w:w="556" w:type="pct"/>
                       </w:tcPr>
                       <w:p>
                         <w:pPr>
+                          <w:pStyle w:val="BCNumber"/>
                           <w:jc w:val="right"/>
-                          <w:cnfStyle w:val="000000010000" w:firstRow="0" w:lastRow="0" w:firstColumn="0" w:lastColumn="0" w:oddVBand="0" w:evenVBand="0" w:oddHBand="0" w:evenHBand="1" w:firstRowFirstColumn="0" w:firstRowLastColumn="0" w:lastRowFirstColumn="0" w:lastRowLastColumn="0"/>
-                          <w:rPr>
-                            <w:rFonts w:asciiTheme="minorHAnsi" w:hAnsiTheme="minorHAnsi"/>
-                            <w:sz w:val="22"/>
-                            <w:szCs w:val="22"/>
-                          </w:rPr>
                         </w:pPr>
                         <w:r>
-                          <w:rPr>
-                            <w:rFonts w:asciiTheme="minorHAnsi" w:hAnsiTheme="minorHAnsi"/>
-                            <w:sz w:val="22"/>
-                            <w:szCs w:val="22"/>
-                          </w:rPr>
                           <w:t>SalesLineBuffer_SalesAmtOnOrder1</w:t>
                         </w:r>
                       </w:p>
@@ -1251,10 +981,6 @@
                 </w:sdt>
                 <w:sdt>
                   <w:sdtPr>
-                    <w:rPr>
-                      <w:sz w:val="22"/>
-                      <w:szCs w:val="22"/>
-                    </w:rPr>
                     <w:alias w:val="SalesLineBuffer_SalesAmtOnOrder2"/>
                     <w:tag w:val="#BC:InsertDataItem,DataItems/SalesLineBuffer_Integer/SalesLineBuffer_SalesAmtOnOrder2"/>
                     <w:id w:val="-1714265182"/>
@@ -1268,23 +994,14 @@
                   <w:sdtContent>
                     <w:tc>
                       <w:tcPr>
-                        <w:tcW w:w="1713" w:type="dxa"/>
-                        <w:vAlign w:val="center"/>
+                        <w:tcW w:w="555" w:type="pct"/>
                       </w:tcPr>
                       <w:p>
                         <w:pPr>
+                          <w:pStyle w:val="BCNumber"/>
                           <w:jc w:val="right"/>
-                          <w:cnfStyle w:val="000000010000" w:firstRow="0" w:lastRow="0" w:firstColumn="0" w:lastColumn="0" w:oddVBand="0" w:evenVBand="0" w:oddHBand="0" w:evenHBand="1" w:firstRowFirstColumn="0" w:firstRowLastColumn="0" w:lastRowFirstColumn="0" w:lastRowLastColumn="0"/>
-                          <w:rPr>
-                            <w:sz w:val="22"/>
-                            <w:szCs w:val="22"/>
-                          </w:rPr>
                         </w:pPr>
                         <w:r>
-                          <w:rPr>
-                            <w:sz w:val="22"/>
-                            <w:szCs w:val="22"/>
-                          </w:rPr>
                           <w:t>SalesLineBuffer_SalesAmtOnOrder2</w:t>
                         </w:r>
                       </w:p>
@@ -1293,10 +1010,6 @@
                 </w:sdt>
                 <w:sdt>
                   <w:sdtPr>
-                    <w:rPr>
-                      <w:sz w:val="22"/>
-                      <w:szCs w:val="22"/>
-                    </w:rPr>
                     <w:alias w:val="SalesLineBuffer_SalesAmtOnOrder3"/>
                     <w:tag w:val="#BC:InsertDataItem,DataItems/SalesLineBuffer_Integer/SalesLineBuffer_SalesAmtOnOrder3"/>
                     <w:id w:val="1896621078"/>
@@ -1310,23 +1023,14 @@
                   <w:sdtContent>
                     <w:tc>
                       <w:tcPr>
-                        <w:tcW w:w="1714" w:type="dxa"/>
-                        <w:vAlign w:val="center"/>
+                        <w:tcW w:w="556" w:type="pct"/>
                       </w:tcPr>
                       <w:p>
                         <w:pPr>
+                          <w:pStyle w:val="BCNumber"/>
                           <w:jc w:val="right"/>
-                          <w:cnfStyle w:val="000000010000" w:firstRow="0" w:lastRow="0" w:firstColumn="0" w:lastColumn="0" w:oddVBand="0" w:evenVBand="0" w:oddHBand="0" w:evenHBand="1" w:firstRowFirstColumn="0" w:firstRowLastColumn="0" w:lastRowFirstColumn="0" w:lastRowLastColumn="0"/>
-                          <w:rPr>
-                            <w:sz w:val="22"/>
-                            <w:szCs w:val="22"/>
-                          </w:rPr>
                         </w:pPr>
                         <w:r>
-                          <w:rPr>
-                            <w:sz w:val="22"/>
-                            <w:szCs w:val="22"/>
-                          </w:rPr>
                           <w:t>SalesLineBuffer_SalesAmtOnOrder3</w:t>
                         </w:r>
                       </w:p>
@@ -1335,10 +1039,6 @@
                 </w:sdt>
                 <w:sdt>
                   <w:sdtPr>
-                    <w:rPr>
-                      <w:sz w:val="22"/>
-                      <w:szCs w:val="22"/>
-                    </w:rPr>
                     <w:alias w:val="SalesLineBuffer_SalesAmtOnOrder4"/>
                     <w:tag w:val="#BC:InsertDataItem,DataItems/SalesLineBuffer_Integer/SalesLineBuffer_SalesAmtOnOrder4"/>
                     <w:id w:val="390697345"/>
@@ -1352,23 +1052,14 @@
                   <w:sdtContent>
                     <w:tc>
                       <w:tcPr>
-                        <w:tcW w:w="1713" w:type="dxa"/>
-                        <w:vAlign w:val="center"/>
+                        <w:tcW w:w="555" w:type="pct"/>
                       </w:tcPr>
                       <w:p>
                         <w:pPr>
+                          <w:pStyle w:val="BCNumber"/>
                           <w:jc w:val="right"/>
-                          <w:cnfStyle w:val="000000010000" w:firstRow="0" w:lastRow="0" w:firstColumn="0" w:lastColumn="0" w:oddVBand="0" w:evenVBand="0" w:oddHBand="0" w:evenHBand="1" w:firstRowFirstColumn="0" w:firstRowLastColumn="0" w:lastRowFirstColumn="0" w:lastRowLastColumn="0"/>
-                          <w:rPr>
-                            <w:sz w:val="22"/>
-                            <w:szCs w:val="22"/>
-                          </w:rPr>
                         </w:pPr>
                         <w:r>
-                          <w:rPr>
-                            <w:sz w:val="22"/>
-                            <w:szCs w:val="22"/>
-                          </w:rPr>
                           <w:t>SalesLineBuffer_SalesAmtOnOrder4</w:t>
                         </w:r>
                       </w:p>
@@ -1377,10 +1068,6 @@
                 </w:sdt>
                 <w:sdt>
                   <w:sdtPr>
-                    <w:rPr>
-                      <w:sz w:val="22"/>
-                      <w:szCs w:val="22"/>
-                    </w:rPr>
                     <w:alias w:val="SalesLineBuffer_SalesAmtOnOrder5"/>
                     <w:tag w:val="#BC:InsertDataItem,DataItems/SalesLineBuffer_Integer/SalesLineBuffer_SalesAmtOnOrder5"/>
                     <w:id w:val="-359358845"/>
@@ -1394,23 +1081,14 @@
                   <w:sdtContent>
                     <w:tc>
                       <w:tcPr>
-                        <w:tcW w:w="1714" w:type="dxa"/>
-                        <w:vAlign w:val="center"/>
+                        <w:tcW w:w="556" w:type="pct"/>
                       </w:tcPr>
                       <w:p>
                         <w:pPr>
+                          <w:pStyle w:val="BCNumber"/>
                           <w:jc w:val="right"/>
-                          <w:cnfStyle w:val="000000010000" w:firstRow="0" w:lastRow="0" w:firstColumn="0" w:lastColumn="0" w:oddVBand="0" w:evenVBand="0" w:oddHBand="0" w:evenHBand="1" w:firstRowFirstColumn="0" w:firstRowLastColumn="0" w:lastRowFirstColumn="0" w:lastRowLastColumn="0"/>
-                          <w:rPr>
-                            <w:sz w:val="22"/>
-                            <w:szCs w:val="22"/>
-                          </w:rPr>
                         </w:pPr>
                         <w:r>
-                          <w:rPr>
-                            <w:sz w:val="22"/>
-                            <w:szCs w:val="22"/>
-                          </w:rPr>
                           <w:t>SalesLineBuffer_SalesAmtOnOrder5</w:t>
                         </w:r>
                       </w:p>
@@ -1419,10 +1097,6 @@
                 </w:sdt>
                 <w:sdt>
                   <w:sdtPr>
-                    <w:rPr>
-                      <w:sz w:val="22"/>
-                      <w:szCs w:val="22"/>
-                    </w:rPr>
                     <w:alias w:val="SalesLineBuffer_SalesOrderAmount"/>
                     <w:tag w:val="#BC:InsertDataItem,DataItems/SalesLineBuffer_Integer/SalesLineBuffer_SalesOrderAmount"/>
                     <w:id w:val="-204107439"/>
@@ -1436,27 +1110,16 @@
                   <w:sdtContent>
                     <w:tc>
                       <w:tcPr>
-                        <w:tcW w:w="1714" w:type="dxa"/>
-                        <w:vAlign w:val="center"/>
+                        <w:tcW w:w="556" w:type="pct"/>
                       </w:tcPr>
                       <w:p>
                         <w:pPr>
+                          <w:pStyle w:val="BCNumber"/>
                           <w:jc w:val="right"/>
-                          <w:cnfStyle w:val="000000010000" w:firstRow="0" w:lastRow="0" w:firstColumn="0" w:lastColumn="0" w:oddVBand="0" w:evenVBand="0" w:oddHBand="0" w:evenHBand="1" w:firstRowFirstColumn="0" w:firstRowLastColumn="0" w:lastRowFirstColumn="0" w:lastRowLastColumn="0"/>
-                          <w:rPr>
-                            <w:sz w:val="22"/>
-                            <w:szCs w:val="22"/>
-                          </w:rPr>
                         </w:pPr>
-                        <w:proofErr w:type="spellStart"/>
                         <w:r>
-                          <w:rPr>
-                            <w:sz w:val="22"/>
-                            <w:szCs w:val="22"/>
-                          </w:rPr>
                           <w:t>SalesLineBuffer_SalesOrderAmount</w:t>
                         </w:r>
-                        <w:proofErr w:type="spellEnd"/>
                       </w:p>
                     </w:tc>
                   </w:sdtContent>
@@ -1470,186 +1133,124 @@
     <w:p>
       <w:pPr>
         <w:spacing w:after="0" w:line="240" w:lineRule="auto"/>
-        <w:rPr>
-          <w:sz w:val="12"/>
-          <w:szCs w:val="12"/>
-        </w:rPr>
       </w:pPr>
     </w:p>
     <w:tbl>
       <w:tblPr>
-        <w:tblStyle w:val="CLSequoiatablestyle021"/>
-        <w:tblW w:w="15422" w:type="dxa"/>
+        <w:tblStyle w:val="BCTotalsTable"/>
+        <w:tblW w:w="5000" w:type="pct"/>
         <w:tblBorders>
           <w:top w:val="single" w:color="auto" w:sz="4" w:space="0"/>
           <w:bottom w:val="single" w:color="auto" w:sz="8" w:space="0"/>
         </w:tblBorders>
-        <w:tblLayout w:type="fixed"/>
-        <w:tblLook w:val="04A0" w:firstRow="1" w:lastRow="0" w:firstColumn="1" w:lastColumn="0" w:noHBand="0" w:noVBand="1"/>
+        <w:tblLook w:val="0640" w:firstRow="0" w:lastRow="1" w:firstColumn="0" w:lastColumn="0" w:noHBand="1" w:noVBand="1"/>
+        <w:tblCaption w:val="Table 3"/>
+        <w:tblDescription w:val="Document totals."/>
       </w:tblPr>
       <w:tblGrid>
-        <w:gridCol w:w="1713"/>
-        <w:gridCol w:w="1714"/>
-        <w:gridCol w:w="1713"/>
-        <w:gridCol w:w="1714"/>
-        <w:gridCol w:w="1713"/>
-        <w:gridCol w:w="1714"/>
-        <w:gridCol w:w="1713"/>
-        <w:gridCol w:w="1714"/>
-        <w:gridCol w:w="1714"/>
+        <w:gridCol w:w="1339"/>
+        <w:gridCol w:w="235"/>
+        <w:gridCol w:w="234"/>
+        <w:gridCol w:w="2332"/>
+        <w:gridCol w:w="2332"/>
+        <w:gridCol w:w="2332"/>
+        <w:gridCol w:w="2332"/>
+        <w:gridCol w:w="2332"/>
+        <w:gridCol w:w="2218"/>
       </w:tblGrid>
       <w:tr>
         <w:trPr>
-          <w:cnfStyle w:val="100000000000" w:firstRow="1" w:lastRow="0" w:firstColumn="0" w:lastColumn="0" w:oddVBand="0" w:evenVBand="0" w:oddHBand="0" w:evenHBand="0" w:firstRowFirstColumn="0" w:firstRowLastColumn="0" w:lastRowFirstColumn="0" w:lastRowLastColumn="0"/>
+          <w:cnfStyle w:val="010000000000" w:firstRow="0" w:lastRow="1" w:firstColumn="0" w:lastColumn="0" w:oddVBand="0" w:evenVBand="0" w:oddHBand="0" w:evenHBand="0" w:firstRowFirstColumn="0" w:firstRowLastColumn="0" w:lastRowFirstColumn="0" w:lastRowLastColumn="0"/>
+          <w:cantSplit/>
           <w:trHeight w:val="490"/>
         </w:trPr>
         <w:sdt>
           <w:sdtPr>
-            <w:rPr>
-              <w:rFonts w:ascii="Segoe UI Semibold" w:hAnsi="Segoe UI Semibold" w:cs="Segoe UI Semibold" w:eastAsiaTheme="minorHAnsi"/>
-              <w:b/>
-              <w:sz w:val="22"/>
-              <w:szCs w:val="22"/>
-            </w:rPr>
             <w:alias w:val="Totals_TotalText"/>
             <w:tag w:val="#BC:InsertDataItem,DataItems/Totals/Totals_TotalText"/>
             <w:id w:val="-1377154425"/>
             <w:placeholder>
               <w:docPart w:val="DefaultPlaceholder_-1854013440"/>
             </w:placeholder>
+            <w:dataBinding w:prefixMappings="xmlns:ns0='urn:microsoft-dynamics-nav/reports/Customer_Order_Summary/107/'" w:xpath="/ns0:NavWordReportXmlPart[1]/ns0:Totals[1]/ns0:Totals_TotalText[1]" w:storeItemID="{00000000-0000-0000-0000-000000000000}"/>
             <w15:color w:val="808080"/>
             <w:text/>
-            <w:dataBinding w:prefixMappings="xmlns:ns0='urn:microsoft-dynamics-nav/reports/Customer_Order_Summary/107/'" w:xpath="/ns0:NavWordReportXmlPart[1]/ns0:Totals[1]/ns0:Totals_TotalText[1]"/>
           </w:sdtPr>
           <w:sdtContent>
             <w:tc>
               <w:tcPr>
-                <w:cnfStyle w:val="001000000000" w:firstRow="0" w:lastRow="0" w:firstColumn="1" w:lastColumn="0" w:oddVBand="0" w:evenVBand="0" w:oddHBand="0" w:evenHBand="0" w:firstRowFirstColumn="0" w:firstRowLastColumn="0" w:lastRowFirstColumn="0" w:lastRowLastColumn="0"/>
-                <w:tcW w:w="1713" w:type="dxa"/>
+                <w:tcW w:w="555" w:type="pct"/>
                 <w:tcBorders>
                   <w:bottom w:val="none" w:color="auto" w:sz="0" w:space="0"/>
                 </w:tcBorders>
               </w:tcPr>
               <w:p>
                 <w:pPr>
-                  <w:pStyle w:val="Heading2"/>
+                  <w:pStyle w:val="BCLabel0"/>
                   <w:spacing w:before="120" w:after="120"/>
-                  <w:rPr>
-                    <w:rFonts w:ascii="Segoe UI Semibold" w:hAnsi="Segoe UI Semibold" w:cs="Segoe UI Semibold" w:eastAsiaTheme="minorHAnsi"/>
-                    <w:b/>
-                    <w:bCs w:val="0"/>
-                    <w:sz w:val="22"/>
-                    <w:szCs w:val="22"/>
-                  </w:rPr>
                 </w:pPr>
-                <w:proofErr w:type="spellStart"/>
                 <w:r>
-                  <w:rPr>
-                    <w:rFonts w:ascii="Segoe UI Semibold" w:hAnsi="Segoe UI Semibold" w:cs="Segoe UI Semibold" w:eastAsiaTheme="minorHAnsi"/>
-                    <w:b/>
-                    <w:bCs w:val="0"/>
-                    <w:sz w:val="22"/>
-                    <w:szCs w:val="22"/>
-                  </w:rPr>
                   <w:t>Totals_TotalText</w:t>
                 </w:r>
-                <w:proofErr w:type="spellEnd"/>
               </w:p>
             </w:tc>
           </w:sdtContent>
         </w:sdt>
         <w:tc>
           <w:tcPr>
-            <w:tcW w:w="1714" w:type="dxa"/>
+            <w:tcW w:w="556" w:type="pct"/>
             <w:tcBorders>
               <w:bottom w:val="none" w:color="auto" w:sz="0" w:space="0"/>
             </w:tcBorders>
           </w:tcPr>
           <w:p>
             <w:pPr>
-              <w:pStyle w:val="Heading2"/>
+              <w:pStyle w:val="BCLabel0"/>
               <w:spacing w:before="120" w:after="120"/>
-              <w:cnfStyle w:val="100000000000" w:firstRow="1" w:lastRow="0" w:firstColumn="0" w:lastColumn="0" w:oddVBand="0" w:evenVBand="0" w:oddHBand="0" w:evenHBand="0" w:firstRowFirstColumn="0" w:firstRowLastColumn="0" w:lastRowFirstColumn="0" w:lastRowLastColumn="0"/>
-              <w:rPr>
-                <w:rFonts w:ascii="Segoe UI Semibold" w:hAnsi="Segoe UI Semibold" w:cs="Segoe UI Semibold"/>
-                <w:b/>
-                <w:bCs w:val="0"/>
-                <w:sz w:val="22"/>
-                <w:szCs w:val="22"/>
-              </w:rPr>
             </w:pPr>
           </w:p>
         </w:tc>
         <w:tc>
           <w:tcPr>
-            <w:tcW w:w="1713" w:type="dxa"/>
+            <w:tcW w:w="555" w:type="pct"/>
             <w:tcBorders>
               <w:bottom w:val="none" w:color="auto" w:sz="0" w:space="0"/>
             </w:tcBorders>
           </w:tcPr>
           <w:p>
             <w:pPr>
-              <w:pStyle w:val="Heading2"/>
+              <w:pStyle w:val="BCLabel0"/>
               <w:spacing w:before="120" w:after="120"/>
-              <w:cnfStyle w:val="100000000000" w:firstRow="1" w:lastRow="0" w:firstColumn="0" w:lastColumn="0" w:oddVBand="0" w:evenVBand="0" w:oddHBand="0" w:evenHBand="0" w:firstRowFirstColumn="0" w:firstRowLastColumn="0" w:lastRowFirstColumn="0" w:lastRowLastColumn="0"/>
-              <w:rPr>
-                <w:rFonts w:ascii="Segoe UI Semibold" w:hAnsi="Segoe UI Semibold" w:cs="Segoe UI Semibold"/>
-                <w:b/>
-                <w:bCs w:val="0"/>
-                <w:sz w:val="22"/>
-                <w:szCs w:val="22"/>
-              </w:rPr>
             </w:pPr>
           </w:p>
         </w:tc>
         <w:sdt>
           <w:sdtPr>
-            <w:rPr>
-              <w:rFonts w:ascii="Segoe UI Semibold" w:hAnsi="Segoe UI Semibold" w:cs="Segoe UI Semibold"/>
-              <w:b/>
-              <w:sz w:val="22"/>
-              <w:szCs w:val="22"/>
-            </w:rPr>
             <w:alias w:val="Totals_Sales_Amt_On_Order1"/>
             <w:tag w:val="#BC:InsertDataItem,DataItems/Totals/Totals_Sales_Amt_On_Order1"/>
             <w:id w:val="646405163"/>
             <w:placeholder>
               <w:docPart w:val="DefaultPlaceholder_-1854013440"/>
             </w:placeholder>
+            <w:dataBinding w:prefixMappings="xmlns:ns0='urn:microsoft-dynamics-nav/reports/Customer_Order_Summary/107/'" w:xpath="/ns0:NavWordReportXmlPart[1]/ns0:Totals[1]/ns0:Totals_Sales_Amt_On_Order1[1]" w:storeItemID="{00000000-0000-0000-0000-000000000000}"/>
             <w15:color w:val="808080"/>
             <w:text/>
-            <w:dataBinding w:prefixMappings="xmlns:ns0='urn:microsoft-dynamics-nav/reports/Customer_Order_Summary/107/'" w:xpath="/ns0:NavWordReportXmlPart[1]/ns0:Totals[1]/ns0:Totals_Sales_Amt_On_Order1[1]"/>
           </w:sdtPr>
           <w:sdtContent>
             <w:tc>
               <w:tcPr>
-                <w:tcW w:w="1714" w:type="dxa"/>
+                <w:tcW w:w="556" w:type="pct"/>
                 <w:tcBorders>
                   <w:bottom w:val="none" w:color="auto" w:sz="0" w:space="0"/>
                 </w:tcBorders>
               </w:tcPr>
               <w:p>
                 <w:pPr>
-                  <w:pStyle w:val="Heading2"/>
+                  <w:pStyle w:val="BCLabelNumber0"/>
                   <w:spacing w:before="120" w:after="120"/>
                   <w:jc w:val="right"/>
-                  <w:cnfStyle w:val="100000000000" w:firstRow="1" w:lastRow="0" w:firstColumn="0" w:lastColumn="0" w:oddVBand="0" w:evenVBand="0" w:oddHBand="0" w:evenHBand="0" w:firstRowFirstColumn="0" w:firstRowLastColumn="0" w:lastRowFirstColumn="0" w:lastRowLastColumn="0"/>
-                  <w:rPr>
-                    <w:rFonts w:ascii="Segoe UI Semibold" w:hAnsi="Segoe UI Semibold" w:cs="Segoe UI Semibold"/>
-                    <w:b/>
-                    <w:bCs w:val="0"/>
-                    <w:sz w:val="22"/>
-                    <w:szCs w:val="22"/>
-                  </w:rPr>
                 </w:pPr>
                 <w:r>
-                  <w:rPr>
-                    <w:rFonts w:ascii="Segoe UI Semibold" w:hAnsi="Segoe UI Semibold" w:cs="Segoe UI Semibold"/>
-                    <w:b/>
-                    <w:bCs w:val="0"/>
-                    <w:sz w:val="22"/>
-                    <w:szCs w:val="22"/>
-                  </w:rPr>
                   <w:t>Totals_Sales_Amt_On_Order1</w:t>
                 </w:r>
               </w:p>
@@ -1658,52 +1259,31 @@
         </w:sdt>
         <w:sdt>
           <w:sdtPr>
-            <w:rPr>
-              <w:rFonts w:ascii="Segoe UI Semibold" w:hAnsi="Segoe UI Semibold" w:cs="Segoe UI Semibold"/>
-              <w:b/>
-              <w:sz w:val="22"/>
-              <w:szCs w:val="22"/>
-            </w:rPr>
             <w:alias w:val="Totals_Sales_Amt_On_Order2"/>
             <w:tag w:val="#BC:InsertDataItem,DataItems/Totals/Totals_Sales_Amt_On_Order2"/>
             <w:id w:val="1656334550"/>
             <w:placeholder>
               <w:docPart w:val="DefaultPlaceholder_-1854013440"/>
             </w:placeholder>
+            <w:dataBinding w:prefixMappings="xmlns:ns0='urn:microsoft-dynamics-nav/reports/Customer_Order_Summary/107/'" w:xpath="/ns0:NavWordReportXmlPart[1]/ns0:Totals[1]/ns0:Totals_Sales_Amt_On_Order2[1]" w:storeItemID="{00000000-0000-0000-0000-000000000000}"/>
             <w15:color w:val="808080"/>
             <w:text/>
-            <w:dataBinding w:prefixMappings="xmlns:ns0='urn:microsoft-dynamics-nav/reports/Customer_Order_Summary/107/'" w:xpath="/ns0:NavWordReportXmlPart[1]/ns0:Totals[1]/ns0:Totals_Sales_Amt_On_Order2[1]"/>
           </w:sdtPr>
           <w:sdtContent>
             <w:tc>
               <w:tcPr>
-                <w:tcW w:w="1713" w:type="dxa"/>
+                <w:tcW w:w="555" w:type="pct"/>
                 <w:tcBorders>
                   <w:bottom w:val="none" w:color="auto" w:sz="0" w:space="0"/>
                 </w:tcBorders>
               </w:tcPr>
               <w:p>
                 <w:pPr>
-                  <w:pStyle w:val="Heading2"/>
+                  <w:pStyle w:val="BCLabelNumber0"/>
                   <w:spacing w:before="120" w:after="120"/>
                   <w:jc w:val="right"/>
-                  <w:cnfStyle w:val="100000000000" w:firstRow="1" w:lastRow="0" w:firstColumn="0" w:lastColumn="0" w:oddVBand="0" w:evenVBand="0" w:oddHBand="0" w:evenHBand="0" w:firstRowFirstColumn="0" w:firstRowLastColumn="0" w:lastRowFirstColumn="0" w:lastRowLastColumn="0"/>
-                  <w:rPr>
-                    <w:rFonts w:ascii="Segoe UI Semibold" w:hAnsi="Segoe UI Semibold" w:cs="Segoe UI Semibold"/>
-                    <w:b/>
-                    <w:bCs w:val="0"/>
-                    <w:sz w:val="22"/>
-                    <w:szCs w:val="22"/>
-                  </w:rPr>
                 </w:pPr>
                 <w:r>
-                  <w:rPr>
-                    <w:rFonts w:ascii="Segoe UI Semibold" w:hAnsi="Segoe UI Semibold" w:cs="Segoe UI Semibold"/>
-                    <w:b/>
-                    <w:bCs w:val="0"/>
-                    <w:sz w:val="22"/>
-                    <w:szCs w:val="22"/>
-                  </w:rPr>
                   <w:t>Totals_Sales_Amt_On_Order2</w:t>
                 </w:r>
               </w:p>
@@ -1712,52 +1292,31 @@
         </w:sdt>
         <w:sdt>
           <w:sdtPr>
-            <w:rPr>
-              <w:rFonts w:ascii="Segoe UI Semibold" w:hAnsi="Segoe UI Semibold" w:cs="Segoe UI Semibold"/>
-              <w:b/>
-              <w:sz w:val="22"/>
-              <w:szCs w:val="22"/>
-            </w:rPr>
             <w:alias w:val="Totals_Sales_Amt_On_Order3"/>
             <w:tag w:val="#BC:InsertDataItem,DataItems/Totals/Totals_Sales_Amt_On_Order3"/>
             <w:id w:val="1054747466"/>
             <w:placeholder>
               <w:docPart w:val="DefaultPlaceholder_-1854013440"/>
             </w:placeholder>
+            <w:dataBinding w:prefixMappings="xmlns:ns0='urn:microsoft-dynamics-nav/reports/Customer_Order_Summary/107/'" w:xpath="/ns0:NavWordReportXmlPart[1]/ns0:Totals[1]/ns0:Totals_Sales_Amt_On_Order3[1]" w:storeItemID="{00000000-0000-0000-0000-000000000000}"/>
             <w15:color w:val="808080"/>
             <w:text/>
-            <w:dataBinding w:prefixMappings="xmlns:ns0='urn:microsoft-dynamics-nav/reports/Customer_Order_Summary/107/'" w:xpath="/ns0:NavWordReportXmlPart[1]/ns0:Totals[1]/ns0:Totals_Sales_Amt_On_Order3[1]"/>
           </w:sdtPr>
           <w:sdtContent>
             <w:tc>
               <w:tcPr>
-                <w:tcW w:w="1714" w:type="dxa"/>
+                <w:tcW w:w="556" w:type="pct"/>
                 <w:tcBorders>
                   <w:bottom w:val="none" w:color="auto" w:sz="0" w:space="0"/>
                 </w:tcBorders>
               </w:tcPr>
               <w:p>
                 <w:pPr>
-                  <w:pStyle w:val="Heading2"/>
+                  <w:pStyle w:val="BCLabelNumber0"/>
                   <w:spacing w:before="120" w:after="120"/>
                   <w:jc w:val="right"/>
-                  <w:cnfStyle w:val="100000000000" w:firstRow="1" w:lastRow="0" w:firstColumn="0" w:lastColumn="0" w:oddVBand="0" w:evenVBand="0" w:oddHBand="0" w:evenHBand="0" w:firstRowFirstColumn="0" w:firstRowLastColumn="0" w:lastRowFirstColumn="0" w:lastRowLastColumn="0"/>
-                  <w:rPr>
-                    <w:rFonts w:ascii="Segoe UI Semibold" w:hAnsi="Segoe UI Semibold" w:cs="Segoe UI Semibold"/>
-                    <w:b/>
-                    <w:bCs w:val="0"/>
-                    <w:sz w:val="22"/>
-                    <w:szCs w:val="22"/>
-                  </w:rPr>
                 </w:pPr>
                 <w:r>
-                  <w:rPr>
-                    <w:rFonts w:ascii="Segoe UI Semibold" w:hAnsi="Segoe UI Semibold" w:cs="Segoe UI Semibold"/>
-                    <w:b/>
-                    <w:bCs w:val="0"/>
-                    <w:sz w:val="22"/>
-                    <w:szCs w:val="22"/>
-                  </w:rPr>
                   <w:t>Totals_Sales_Amt_On_Order3</w:t>
                 </w:r>
               </w:p>
@@ -1766,52 +1325,31 @@
         </w:sdt>
         <w:sdt>
           <w:sdtPr>
-            <w:rPr>
-              <w:rFonts w:ascii="Segoe UI Semibold" w:hAnsi="Segoe UI Semibold" w:cs="Segoe UI Semibold"/>
-              <w:b/>
-              <w:sz w:val="22"/>
-              <w:szCs w:val="22"/>
-            </w:rPr>
             <w:alias w:val="Totals_Sales_Amt_On_Order4"/>
             <w:tag w:val="#BC:InsertDataItem,DataItems/Totals/Totals_Sales_Amt_On_Order4"/>
             <w:id w:val="1352692387"/>
             <w:placeholder>
               <w:docPart w:val="DefaultPlaceholder_-1854013440"/>
             </w:placeholder>
+            <w:dataBinding w:prefixMappings="xmlns:ns0='urn:microsoft-dynamics-nav/reports/Customer_Order_Summary/107/'" w:xpath="/ns0:NavWordReportXmlPart[1]/ns0:Totals[1]/ns0:Totals_Sales_Amt_On_Order4[1]" w:storeItemID="{00000000-0000-0000-0000-000000000000}"/>
             <w15:color w:val="808080"/>
             <w:text/>
-            <w:dataBinding w:prefixMappings="xmlns:ns0='urn:microsoft-dynamics-nav/reports/Customer_Order_Summary/107/'" w:xpath="/ns0:NavWordReportXmlPart[1]/ns0:Totals[1]/ns0:Totals_Sales_Amt_On_Order4[1]"/>
           </w:sdtPr>
           <w:sdtContent>
             <w:tc>
               <w:tcPr>
-                <w:tcW w:w="1713" w:type="dxa"/>
+                <w:tcW w:w="555" w:type="pct"/>
                 <w:tcBorders>
                   <w:bottom w:val="none" w:color="auto" w:sz="0" w:space="0"/>
                 </w:tcBorders>
               </w:tcPr>
               <w:p>
                 <w:pPr>
-                  <w:pStyle w:val="Heading2"/>
+                  <w:pStyle w:val="BCLabelNumber0"/>
                   <w:spacing w:before="120" w:after="120"/>
                   <w:jc w:val="right"/>
-                  <w:cnfStyle w:val="100000000000" w:firstRow="1" w:lastRow="0" w:firstColumn="0" w:lastColumn="0" w:oddVBand="0" w:evenVBand="0" w:oddHBand="0" w:evenHBand="0" w:firstRowFirstColumn="0" w:firstRowLastColumn="0" w:lastRowFirstColumn="0" w:lastRowLastColumn="0"/>
-                  <w:rPr>
-                    <w:rFonts w:ascii="Segoe UI Semibold" w:hAnsi="Segoe UI Semibold" w:cs="Segoe UI Semibold"/>
-                    <w:b/>
-                    <w:bCs w:val="0"/>
-                    <w:sz w:val="22"/>
-                    <w:szCs w:val="22"/>
-                  </w:rPr>
                 </w:pPr>
                 <w:r>
-                  <w:rPr>
-                    <w:rFonts w:ascii="Segoe UI Semibold" w:hAnsi="Segoe UI Semibold" w:cs="Segoe UI Semibold"/>
-                    <w:b/>
-                    <w:bCs w:val="0"/>
-                    <w:sz w:val="22"/>
-                    <w:szCs w:val="22"/>
-                  </w:rPr>
                   <w:t>Totals_Sales_Amt_On_Order4</w:t>
                 </w:r>
               </w:p>
@@ -1820,52 +1358,31 @@
         </w:sdt>
         <w:sdt>
           <w:sdtPr>
-            <w:rPr>
-              <w:rFonts w:ascii="Segoe UI Semibold" w:hAnsi="Segoe UI Semibold" w:cs="Segoe UI Semibold"/>
-              <w:b/>
-              <w:sz w:val="22"/>
-              <w:szCs w:val="22"/>
-            </w:rPr>
             <w:alias w:val="Totals_Sales_Amt_On_Order5"/>
             <w:tag w:val="#BC:InsertDataItem,DataItems/Totals/Totals_Sales_Amt_On_Order5"/>
             <w:id w:val="-1958173930"/>
             <w:placeholder>
               <w:docPart w:val="DefaultPlaceholder_-1854013440"/>
             </w:placeholder>
+            <w:dataBinding w:prefixMappings="xmlns:ns0='urn:microsoft-dynamics-nav/reports/Customer_Order_Summary/107/'" w:xpath="/ns0:NavWordReportXmlPart[1]/ns0:Totals[1]/ns0:Totals_Sales_Amt_On_Order5[1]" w:storeItemID="{00000000-0000-0000-0000-000000000000}"/>
             <w15:color w:val="808080"/>
             <w:text/>
-            <w:dataBinding w:prefixMappings="xmlns:ns0='urn:microsoft-dynamics-nav/reports/Customer_Order_Summary/107/'" w:xpath="/ns0:NavWordReportXmlPart[1]/ns0:Totals[1]/ns0:Totals_Sales_Amt_On_Order5[1]"/>
           </w:sdtPr>
           <w:sdtContent>
             <w:tc>
               <w:tcPr>
-                <w:tcW w:w="1714" w:type="dxa"/>
+                <w:tcW w:w="556" w:type="pct"/>
                 <w:tcBorders>
                   <w:bottom w:val="none" w:color="auto" w:sz="0" w:space="0"/>
                 </w:tcBorders>
               </w:tcPr>
               <w:p>
                 <w:pPr>
-                  <w:pStyle w:val="Heading2"/>
+                  <w:pStyle w:val="BCLabelNumber0"/>
                   <w:spacing w:before="120" w:after="120"/>
                   <w:jc w:val="right"/>
-                  <w:cnfStyle w:val="100000000000" w:firstRow="1" w:lastRow="0" w:firstColumn="0" w:lastColumn="0" w:oddVBand="0" w:evenVBand="0" w:oddHBand="0" w:evenHBand="0" w:firstRowFirstColumn="0" w:firstRowLastColumn="0" w:lastRowFirstColumn="0" w:lastRowLastColumn="0"/>
-                  <w:rPr>
-                    <w:rFonts w:ascii="Segoe UI Semibold" w:hAnsi="Segoe UI Semibold" w:cs="Segoe UI Semibold"/>
-                    <w:b/>
-                    <w:bCs w:val="0"/>
-                    <w:sz w:val="22"/>
-                    <w:szCs w:val="22"/>
-                  </w:rPr>
                 </w:pPr>
                 <w:r>
-                  <w:rPr>
-                    <w:rFonts w:ascii="Segoe UI Semibold" w:hAnsi="Segoe UI Semibold" w:cs="Segoe UI Semibold"/>
-                    <w:b/>
-                    <w:bCs w:val="0"/>
-                    <w:sz w:val="22"/>
-                    <w:szCs w:val="22"/>
-                  </w:rPr>
                   <w:t>Totals_Sales_Amt_On_Order5</w:t>
                 </w:r>
               </w:p>
@@ -1874,56 +1391,33 @@
         </w:sdt>
         <w:sdt>
           <w:sdtPr>
-            <w:rPr>
-              <w:rFonts w:ascii="Segoe UI Semibold" w:hAnsi="Segoe UI Semibold" w:cs="Segoe UI Semibold"/>
-              <w:b/>
-              <w:sz w:val="22"/>
-              <w:szCs w:val="22"/>
-            </w:rPr>
             <w:alias w:val="Totals_Sales_Order_Amount"/>
             <w:tag w:val="#BC:InsertDataItem,DataItems/Totals/Totals_Sales_Order_Amount"/>
             <w:id w:val="1045720973"/>
             <w:placeholder>
               <w:docPart w:val="DefaultPlaceholder_-1854013440"/>
             </w:placeholder>
+            <w:dataBinding w:prefixMappings="xmlns:ns0='urn:microsoft-dynamics-nav/reports/Customer_Order_Summary/107/'" w:xpath="/ns0:NavWordReportXmlPart[1]/ns0:Totals[1]/ns0:Totals_Sales_Order_Amount[1]" w:storeItemID="{00000000-0000-0000-0000-000000000000}"/>
             <w15:color w:val="808080"/>
             <w:text/>
-            <w:dataBinding w:prefixMappings="xmlns:ns0='urn:microsoft-dynamics-nav/reports/Customer_Order_Summary/107/'" w:xpath="/ns0:NavWordReportXmlPart[1]/ns0:Totals[1]/ns0:Totals_Sales_Order_Amount[1]"/>
           </w:sdtPr>
           <w:sdtContent>
             <w:tc>
               <w:tcPr>
-                <w:tcW w:w="1714" w:type="dxa"/>
+                <w:tcW w:w="556" w:type="pct"/>
                 <w:tcBorders>
                   <w:bottom w:val="none" w:color="auto" w:sz="0" w:space="0"/>
                 </w:tcBorders>
               </w:tcPr>
               <w:p>
                 <w:pPr>
-                  <w:pStyle w:val="Heading2"/>
+                  <w:pStyle w:val="BCLabelNumber0"/>
                   <w:spacing w:before="120" w:after="120"/>
                   <w:jc w:val="right"/>
-                  <w:cnfStyle w:val="100000000000" w:firstRow="1" w:lastRow="0" w:firstColumn="0" w:lastColumn="0" w:oddVBand="0" w:evenVBand="0" w:oddHBand="0" w:evenHBand="0" w:firstRowFirstColumn="0" w:firstRowLastColumn="0" w:lastRowFirstColumn="0" w:lastRowLastColumn="0"/>
-                  <w:rPr>
-                    <w:rFonts w:ascii="Segoe UI Semibold" w:hAnsi="Segoe UI Semibold" w:cs="Segoe UI Semibold"/>
-                    <w:b/>
-                    <w:bCs w:val="0"/>
-                    <w:sz w:val="22"/>
-                    <w:szCs w:val="22"/>
-                  </w:rPr>
                 </w:pPr>
-                <w:proofErr w:type="spellStart"/>
                 <w:r>
-                  <w:rPr>
-                    <w:rFonts w:ascii="Segoe UI Semibold" w:hAnsi="Segoe UI Semibold" w:cs="Segoe UI Semibold"/>
-                    <w:b/>
-                    <w:bCs w:val="0"/>
-                    <w:sz w:val="22"/>
-                    <w:szCs w:val="22"/>
-                  </w:rPr>
                   <w:t>Totals_Sales_Order_Amount</w:t>
                 </w:r>
-                <w:proofErr w:type="spellEnd"/>
               </w:p>
             </w:tc>
           </w:sdtContent>
@@ -1963,7 +1457,7 @@
         <w:kern w:val="2"/>
         <w:sz w:val="24"/>
         <w:szCs w:val="24"/>
-        <w:lang w:val="en-DK" w:eastAsia="en-DK" w:bidi="ar-SA"/>
+        <w:lang w:bidi="ar-SA"/>
         <w14:ligatures w14:val="standardContextual"/>
       </w:rPr>
     </w:rPrDefault>
@@ -2470,7 +1964,7 @@
       <w:kern w:val="0"/>
       <w:sz w:val="20"/>
       <w:szCs w:val="20"/>
-      <w:lang w:val="en-DK" w:eastAsia="en-DK"/>
+      <w:lang w:val="en-US" w:eastAsia="en-US"/>
       <w14:ligatures w14:val="none"/>
     </w:rPr>
     <w:tblPr/>
@@ -2663,11 +2157,354 @@
       <w:color w:val="666666"/>
     </w:rPr>
   </w:style>
+  <w:style w:type="paragraph" w:styleId="Header">
+    <w:name w:val="header"/>
+    <w:basedOn w:val="Normal"/>
+    <w:link w:val="HeaderChar"/>
+    <w:uiPriority w:val="99"/>
+    <w:unhideWhenUsed/>
+    <w:rsid w:val="006830DE"/>
+    <w:pPr>
+      <w:tabs>
+        <w:tab w:val="center" w:pos="4513"/>
+        <w:tab w:val="right" w:pos="9026"/>
+      </w:tabs>
+      <w:spacing w:after="0" w:line="240" w:lineRule="auto"/>
+    </w:pPr>
+    <w:rPr>
+      <w:lang w:val="en-AU" w:eastAsia="zh-CN"/>
+    </w:rPr>
+  </w:style>
+  <w:style w:type="character" w:customStyle="1" w:styleId="HeaderChar">
+    <w:name w:val="Header Char"/>
+    <w:basedOn w:val="DefaultParagraphFont"/>
+    <w:link w:val="Header"/>
+    <w:uiPriority w:val="99"/>
+    <w:rsid w:val="006830DE"/>
+    <w:rPr>
+      <w:lang w:val="en-AU" w:eastAsia="zh-CN"/>
+    </w:rPr>
+  </w:style>
+  <w:style w:type="table" w:styleId="PlainTable1">
+    <w:name w:val="Plain Table 1"/>
+    <w:basedOn w:val="TableNormal"/>
+    <w:uiPriority w:val="41"/>
+    <w:rsid w:val="00634355"/>
+    <w:pPr>
+      <w:spacing w:after="0" w:line="240" w:lineRule="auto"/>
+    </w:pPr>
+    <w:rPr>
+      <w:lang w:val="en-AU" w:eastAsia="ja-JP"/>
+    </w:rPr>
+    <w:tblPr>
+      <w:tblStyleRowBandSize w:val="1"/>
+      <w:tblStyleColBandSize w:val="1"/>
+      <w:tblBorders>
+        <w:top w:val="single" w:sz="4" w:space="0" w:color="BFBFBF" w:themeColor="background1" w:themeShade="BF"/>
+        <w:left w:val="single" w:sz="4" w:space="0" w:color="BFBFBF" w:themeColor="background1" w:themeShade="BF"/>
+        <w:bottom w:val="single" w:sz="4" w:space="0" w:color="BFBFBF" w:themeColor="background1" w:themeShade="BF"/>
+        <w:right w:val="single" w:sz="4" w:space="0" w:color="BFBFBF" w:themeColor="background1" w:themeShade="BF"/>
+        <w:insideH w:val="single" w:sz="4" w:space="0" w:color="BFBFBF" w:themeColor="background1" w:themeShade="BF"/>
+        <w:insideV w:val="single" w:sz="4" w:space="0" w:color="BFBFBF" w:themeColor="background1" w:themeShade="BF"/>
+      </w:tblBorders>
+    </w:tblPr>
+    <w:tblStylePr w:type="firstRow">
+      <w:rPr>
+        <w:b/>
+        <w:bCs/>
+      </w:rPr>
+    </w:tblStylePr>
+    <w:tblStylePr w:type="lastRow">
+      <w:rPr>
+        <w:b/>
+        <w:bCs/>
+      </w:rPr>
+      <w:tblPr/>
+      <w:tcPr>
+        <w:tcBorders>
+          <w:top w:val="double" w:sz="4" w:space="0" w:color="BFBFBF" w:themeColor="background1" w:themeShade="BF"/>
+        </w:tcBorders>
+      </w:tcPr>
+    </w:tblStylePr>
+    <w:tblStylePr w:type="firstCol">
+      <w:rPr>
+        <w:b/>
+        <w:bCs/>
+      </w:rPr>
+    </w:tblStylePr>
+    <w:tblStylePr w:type="lastCol">
+      <w:rPr>
+        <w:b/>
+        <w:bCs/>
+      </w:rPr>
+    </w:tblStylePr>
+    <w:tblStylePr w:type="band1Vert">
+      <w:tblPr/>
+      <w:tcPr>
+        <w:shd w:val="clear" w:color="auto" w:fill="F2F2F2" w:themeFill="background1" w:themeFillShade="F2"/>
+      </w:tcPr>
+    </w:tblStylePr>
+    <w:tblStylePr w:type="band1Horz">
+      <w:tblPr/>
+      <w:tcPr>
+        <w:shd w:val="clear" w:color="auto" w:fill="F2F2F2" w:themeFill="background1" w:themeFillShade="F2"/>
+      </w:tcPr>
+    </w:tblStylePr>
+  </w:style>
+  <w:style w:type="paragraph" w:styleId="NoSpacing">
+    <w:name w:val="No Spacing"/>
+    <w:uiPriority w:val="1"/>
+    <w:qFormat/>
+    <w:rsid w:val="00416FC2"/>
+    <w:pPr>
+      <w:spacing w:after="0" w:line="240" w:lineRule="auto"/>
+    </w:pPr>
+    <w:rPr>
+      <w:rFonts w:eastAsiaTheme="minorHAnsi"/>
+      <w:color w:val="000000" w:themeColor="text1"/>
+    </w:rPr>
+  </w:style>
+  <w:style w:type="paragraph" w:customStyle="1" w:styleId="BCNumber">
+    <w:name w:val="BC Number"/>
+    <w:basedOn w:val="NoSpacing"/>
+    <w:next w:val="Normal"/>
+    <w:uiPriority w:val="2"/>
+    <w:qFormat/>
+    <w:rPr>
+      <w14:numSpacing w14:val="tabular"/>
+    </w:rPr>
+  </w:style>
+  <w:style w:type="paragraph" w:customStyle="1" w:styleId="BCLabel">
+    <w:name w:val="BC Label"/>
+    <w:basedOn w:val="NoSpacing"/>
+    <w:next w:val="Normal"/>
+    <w:uiPriority w:val="2"/>
+    <w:qFormat/>
+    <w:pPr>
+      <w:keepNext/>
+    </w:pPr>
+    <w:rPr>
+      <w:rFonts w:asciiTheme="majorHAnsi" w:eastAsiaTheme="majorEastAsia" w:hAnsiTheme="majorHAnsi" w:cstheme="majorBidi"/>
+    </w:rPr>
+  </w:style>
+  <w:style w:type="paragraph" w:customStyle="1" w:styleId="BCLabelNumber">
+    <w:name w:val="BC Label Number"/>
+    <w:basedOn w:val="BCLabel"/>
+    <w:next w:val="Normal"/>
+    <w:uiPriority w:val="2"/>
+    <w:qFormat/>
+    <w:rPr>
+      <w14:numSpacing w14:val="tabular"/>
+    </w:rPr>
+  </w:style>
+  <w:style w:type="paragraph" w:customStyle="1" w:styleId="BCLabel0">
+    <w:name w:val="BC Label"/>
+    <w:basedOn w:val="NoSpacing"/>
+    <w:next w:val="Normal"/>
+    <w:uiPriority w:val="2"/>
+    <w:qFormat/>
+    <w:pPr>
+      <w:keepNext/>
+    </w:pPr>
+    <w:rPr>
+      <w:rFonts w:asciiTheme="majorHAnsi" w:eastAsiaTheme="majorEastAsia" w:hAnsiTheme="majorHAnsi" w:cstheme="majorBidi"/>
+    </w:rPr>
+  </w:style>
+  <w:style w:type="paragraph" w:customStyle="1" w:styleId="BCLabelNumber0">
+    <w:name w:val="BC Label Number"/>
+    <w:basedOn w:val="BCLabel0"/>
+    <w:next w:val="Normal"/>
+    <w:uiPriority w:val="2"/>
+    <w:qFormat/>
+    <w:rPr>
+      <w14:numSpacing w14:val="tabular"/>
+    </w:rPr>
+  </w:style>
+  <w:style w:type="table" w:customStyle="1" w:styleId="BCBlockTable">
+    <w:name w:val="BC Block Table"/>
+    <w:basedOn w:val="TableNormal"/>
+    <w:uiPriority w:val="99"/>
+    <w:qFormat/>
+    <w:pPr>
+      <w:spacing w:after="0" w:line="240" w:lineRule="auto"/>
+    </w:pPr>
+    <w:tblPr>
+      <w:tblStyleRowBandSize w:val="1"/>
+      <w:tblStyleColBandSize w:val="1"/>
+      <w:tblCellMar>
+        <w:left w:w="0" w:type="dxa"/>
+        <w:right w:w="0" w:type="dxa"/>
+      </w:tblCellMar>
+    </w:tblPr>
+    <w:tblStylePr w:type="firstRow">
+      <w:rPr>
+        <w:rFonts w:asciiTheme="majorHAnsi" w:hAnsiTheme="majorHAnsi" w:cstheme="majorBidi"/>
+      </w:rPr>
+      <w:tblPr/>
+      <w:tcPr>
+        <w:vAlign w:val="top"/>
+      </w:tcPr>
+    </w:tblStylePr>
+  </w:style>
+  <w:style w:type="table" w:customStyle="1" w:styleId="BCDataTable">
+    <w:name w:val="BC Data Table"/>
+    <w:basedOn w:val="TableNormal"/>
+    <w:uiPriority w:val="99"/>
+    <w:qFormat/>
+    <w:pPr>
+      <w:spacing w:after="0" w:line="240" w:lineRule="auto"/>
+    </w:pPr>
+    <w:tblPr>
+      <w:tblStyleRowBandSize w:val="1"/>
+      <w:tblStyleColBandSize w:val="1"/>
+      <w:tblCellMar>
+        <w:left w:w="115" w:type="dxa"/>
+        <w:right w:w="115" w:type="dxa"/>
+      </w:tblCellMar>
+    </w:tblPr>
+    <w:tcPr>
+      <w:vAlign w:val="center"/>
+    </w:tcPr>
+    <w:tblStylePr w:type="firstRow">
+      <w:pPr>
+        <w:spacing w:before="160" w:after="80"/>
+      </w:pPr>
+      <w:rPr>
+        <w:rFonts w:asciiTheme="majorHAnsi" w:hAnsiTheme="majorHAnsi" w:cstheme="majorBidi"/>
+      </w:rPr>
+      <w:tblPr/>
+      <w:tcPr>
+        <w:tcBorders>
+          <w:bottom w:val="single" w:sz="4" w:space="0" w:color="000000" w:themeColor="text1"/>
+        </w:tcBorders>
+        <w:vAlign w:val="top"/>
+      </w:tcPr>
+    </w:tblStylePr>
+    <w:tblStylePr w:type="lastRow">
+      <w:tblPr/>
+      <w:tcPr>
+        <w:tcBorders>
+          <w:bottom w:val="single" w:sz="4" w:space="0" w:color="E8E8E8" w:themeColor="background2"/>
+        </w:tcBorders>
+      </w:tcPr>
+    </w:tblStylePr>
+    <w:tblStylePr w:type="band1Horz">
+      <w:tblPr/>
+      <w:tcPr>
+        <w:shd w:val="clear" w:color="auto" w:fill="auto"/>
+      </w:tcPr>
+    </w:tblStylePr>
+    <w:tblStylePr w:type="band2Horz">
+      <w:tblPr/>
+      <w:tcPr>
+        <w:shd w:val="clear" w:color="auto" w:fill="FAE2D5" w:themeFill="accent2" w:themeFillTint="33"/>
+      </w:tcPr>
+    </w:tblStylePr>
+  </w:style>
+  <w:style w:type="table" w:customStyle="1" w:styleId="BCTotalsTable">
+    <w:name w:val="BC Totals Table"/>
+    <w:basedOn w:val="TableNormal"/>
+    <w:uiPriority w:val="99"/>
+    <w:qFormat/>
+    <w:pPr>
+      <w:spacing w:after="0" w:line="240" w:lineRule="auto"/>
+    </w:pPr>
+    <w:tblPr>
+      <w:tblStyleRowBandSize w:val="1"/>
+      <w:tblStyleColBandSize w:val="1"/>
+      <w:tblCellMar>
+        <w:left w:w="115" w:type="dxa"/>
+        <w:right w:w="115" w:type="dxa"/>
+      </w:tblCellMar>
+    </w:tblPr>
+    <w:tcPr>
+      <w:vAlign w:val="center"/>
+    </w:tcPr>
+    <w:tblStylePr w:type="lastRow">
+      <w:rPr>
+        <w:rFonts w:asciiTheme="majorHAnsi" w:hAnsiTheme="majorHAnsi" w:cstheme="majorBidi"/>
+      </w:rPr>
+      <w:tblPr/>
+      <w:tcPr>
+        <w:tcBorders>
+          <w:top w:val="single" w:sz="4" w:space="0" w:color="000000" w:themeColor="text1"/>
+          <w:bottom w:val="single" w:sz="8" w:space="0" w:color="000000" w:themeColor="text1"/>
+        </w:tcBorders>
+      </w:tcPr>
+    </w:tblStylePr>
+  </w:style>
+  <w:style w:type="table" w:customStyle="1" w:styleId="BCCalculationTable">
+    <w:name w:val="BC Calculation Table"/>
+    <w:basedOn w:val="TableNormal"/>
+    <w:uiPriority w:val="99"/>
+    <w:qFormat/>
+    <w:pPr>
+      <w:spacing w:after="0" w:line="240" w:lineRule="auto"/>
+    </w:pPr>
+    <w:tblPr>
+      <w:tblStyleRowBandSize w:val="1"/>
+      <w:tblStyleColBandSize w:val="1"/>
+      <w:tblCellMar>
+        <w:top w:w="58" w:type="dxa"/>
+        <w:left w:w="0" w:type="dxa"/>
+        <w:bottom w:w="58" w:type="dxa"/>
+        <w:right w:w="0" w:type="dxa"/>
+      </w:tblCellMar>
+    </w:tblPr>
+    <w:tcPr>
+      <w:vAlign w:val="center"/>
+    </w:tcPr>
+    <w:tblStylePr w:type="firstRow">
+      <w:rPr>
+        <w:rFonts w:asciiTheme="majorHAnsi" w:hAnsiTheme="majorHAnsi" w:cstheme="majorBidi"/>
+      </w:rPr>
+      <w:tblPr/>
+      <w:tcPr>
+        <w:vAlign w:val="bottom"/>
+      </w:tcPr>
+    </w:tblStylePr>
+    <w:tblStylePr w:type="lastRow">
+      <w:rPr>
+        <w:rFonts w:asciiTheme="majorHAnsi" w:hAnsiTheme="majorHAnsi" w:cstheme="majorBidi"/>
+      </w:rPr>
+      <w:tblPr/>
+      <w:tcPr>
+        <w:tcBorders>
+          <w:top w:val="single" w:sz="4" w:space="0" w:color="000000" w:themeColor="text1"/>
+        </w:tcBorders>
+      </w:tcPr>
+    </w:tblStylePr>
+  </w:style>
+  <w:style w:type="table" w:customStyle="1" w:styleId="BCSignatureTable">
+    <w:name w:val="BC Signature Table"/>
+    <w:basedOn w:val="TableNormal"/>
+    <w:uiPriority w:val="99"/>
+    <w:qFormat/>
+    <w:pPr>
+      <w:spacing w:after="0" w:line="240" w:lineRule="auto"/>
+    </w:pPr>
+    <w:tblPr>
+      <w:tblStyleRowBandSize w:val="1"/>
+      <w:tblStyleColBandSize w:val="1"/>
+      <w:tblCellMar>
+        <w:left w:w="0" w:type="dxa"/>
+        <w:right w:w="0" w:type="dxa"/>
+      </w:tblCellMar>
+    </w:tblPr>
+    <w:tblStylePr w:type="lastRow">
+      <w:tblPr/>
+      <w:tcPr>
+        <w:tcBorders>
+          <w:bottom w:val="single" w:sz="4" w:space="0" w:color="000000" w:themeColor="text1"/>
+        </w:tcBorders>
+      </w:tcPr>
+    </w:tblStylePr>
+  </w:style>
 </w:styles>
 </file>
 
 <file path=word/glossary/document.xml><?xml version="1.0" encoding="utf-8"?>
-<w:glossaryDocument xmlns:wpc="http://schemas.microsoft.com/office/word/2010/wordprocessingCanvas" xmlns:cx="http://schemas.microsoft.com/office/drawing/2014/chartex" xmlns:cx1="http://schemas.microsoft.com/office/drawing/2015/9/8/chartex" xmlns:cx2="http://schemas.microsoft.com/office/drawing/2015/10/21/chartex" xmlns:cx3="http://schemas.microsoft.com/office/drawing/2016/5/9/chartex" xmlns:cx4="http://schemas.microsoft.com/office/drawing/2016/5/10/chartex" xmlns:cx5="http://schemas.microsoft.com/office/drawing/2016/5/11/chartex" xmlns:cx6="http://schemas.microsoft.com/office/drawing/2016/5/12/chartex" xmlns:cx7="http://schemas.microsoft.com/office/drawing/2016/5/13/chartex" xmlns:cx8="http://schemas.microsoft.com/office/drawing/2016/5/14/chartex" xmlns:mc="http://schemas.openxmlformats.org/markup-compatibility/2006" xmlns:aink="http://schemas.microsoft.com/office/drawing/2016/ink" xmlns:am3d="http://schemas.microsoft.com/office/drawing/2017/model3d" xmlns:o="urn:schemas-microsoft-com:office:office" xmlns:oel="http://schemas.microsoft.com/office/2019/extlst" xmlns:r="http://schemas.openxmlformats.org/officeDocument/2006/relationships" xmlns:m="http://schemas.openxmlformats.org/officeDocument/2006/math" xmlns:v="urn:schemas-microsoft-com:vml" xmlns:wp14="http://schemas.microsoft.com/office/word/2010/wordprocessingDrawing" xmlns:wp="http://schemas.openxmlformats.org/drawingml/2006/wordprocessingDrawing" xmlns:w10="urn:schemas-microsoft-com:office:word" xmlns:w="http://schemas.openxmlformats.org/wordprocessingml/2006/main" xmlns:w14="http://schemas.microsoft.com/office/word/2010/wordml" xmlns:w15="http://schemas.microsoft.com/office/word/2012/wordml" xmlns:w16cex="http://schemas.microsoft.com/office/word/2018/wordml/cex" xmlns:w16cid="http://schemas.microsoft.com/office/word/2016/wordml/cid" xmlns:w16="http://schemas.microsoft.com/office/word/2018/wordml" xmlns:w16du="http://schemas.microsoft.com/office/word/2023/wordml/word16du" xmlns:w16sdtdh="http://schemas.microsoft.com/office/word/2020/wordml/sdtdatahash" xmlns:w16sdtfl="http://schemas.microsoft.com/office/word/2024/wordml/sdtformatlock" xmlns:w16se="http://schemas.microsoft.com/office/word/2015/wordml/symex" xmlns:wpg="http://schemas.microsoft.com/office/word/2010/wordprocessingGroup" xmlns:wpi="http://schemas.microsoft.com/office/word/2010/wordprocessingInk" xmlns:wne="http://schemas.microsoft.com/office/word/2006/wordml" xmlns:wps="http://schemas.microsoft.com/office/word/2010/wordprocessingShape" mc:Ignorable="w14 w15 w16se w16cid w16 w16cex w16sdtdh w16sdtfl w16du wp14">
+<w:glossaryDocument xmlns:wpc="http://schemas.microsoft.com/office/word/2010/wordprocessingCanvas" xmlns:cx="http://schemas.microsoft.com/office/drawing/2014/chartex" xmlns:cx1="http://schemas.microsoft.com/office/drawing/2015/9/8/chartex" xmlns:cx2="http://schemas.microsoft.com/office/drawing/2015/10/21/chartex" xmlns:cx3="http://schemas.microsoft.com/office/drawing/2016/5/9/chartex" xmlns:cx4="http://schemas.microsoft.com/office/drawing/2016/5/10/chartex" xmlns:cx5="http://schemas.microsoft.com/office/drawing/2016/5/11/chartex" xmlns:cx6="http://schemas.microsoft.com/office/drawing/2016/5/12/chartex" xmlns:cx7="http://schemas.microsoft.com/office/drawing/2016/5/13/chartex" xmlns:cx8="http://schemas.microsoft.com/office/drawing/2016/5/14/chartex" xmlns:mc="http://schemas.openxmlformats.org/markup-compatibility/2006" xmlns:aink="http://schemas.microsoft.com/office/drawing/2016/ink" xmlns:am3d="http://schemas.microsoft.com/office/drawing/2017/model3d" xmlns:o="urn:schemas-microsoft-com:office:office" xmlns:oel="http://schemas.microsoft.com/office/2019/extlst" xmlns:r="http://schemas.openxmlformats.org/officeDocument/2006/relationships" xmlns:m="http://schemas.openxmlformats.org/officeDocument/2006/math" xmlns:v="urn:schemas-microsoft-com:vml" xmlns:wp14="http://schemas.microsoft.com/office/word/2010/wordprocessingDrawing" xmlns:wp="http://schemas.openxmlformats.org/drawingml/2006/wordprocessingDrawing" xmlns:w10="urn:schemas-microsoft-com:office:word" xmlns:w="http://schemas.openxmlformats.org/wordprocessingml/2006/main" xmlns:w14="http://schemas.microsoft.com/office/word/2010/wordml" xmlns:w15="http://schemas.microsoft.com/office/word/2012/wordml" xmlns:w16cei="http://schemas.microsoft.com/office/word/2026/wordml/cei" xmlns:w16cex="http://schemas.microsoft.com/office/word/2018/wordml/cex" xmlns:w16cid="http://schemas.microsoft.com/office/word/2016/wordml/cid" xmlns:w16="http://schemas.microsoft.com/office/word/2018/wordml" xmlns:w16du="http://schemas.microsoft.com/office/word/2023/wordml/word16du" xmlns:w16sdtdh="http://schemas.microsoft.com/office/word/2020/wordml/sdtdatahash" xmlns:w16sdtfl="http://schemas.microsoft.com/office/word/2024/wordml/sdtformatlock" xmlns:w16se="http://schemas.microsoft.com/office/word/2015/wordml/symex" xmlns:wpg="http://schemas.microsoft.com/office/word/2010/wordprocessingGroup" xmlns:wpi="http://schemas.microsoft.com/office/word/2010/wordprocessingInk" xmlns:wne="http://schemas.microsoft.com/office/word/2006/wordml" xmlns:wps="http://schemas.microsoft.com/office/word/2010/wordprocessingShape" mc:Ignorable="w14 w15 w16se w16cid w16 w16cex w16sdtdh w16sdtfl w16du wp14">
   <w:docParts>
     <w:docPart>
       <w:docPartPr>
@@ -2750,6 +2587,93 @@
         </w:p>
       </w:docPartBody>
     </w:docPart>
+    <w:docPart>
+      <w:docPartPr>
+        <w:name w:val="5F2903C5364142F592C70983355C4059"/>
+        <w:category>
+          <w:name w:val="General"/>
+          <w:gallery w:val="placeholder"/>
+        </w:category>
+        <w:types>
+          <w:type w:val="bbPlcHdr"/>
+        </w:types>
+        <w:behaviors>
+          <w:behavior w:val="content"/>
+        </w:behaviors>
+        <w:guid w:val="{5FA82CE5-54A4-4FA7-A2B3-3EDE52449F0A}"/>
+      </w:docPartPr>
+      <w:docPartBody>
+        <w:p>
+          <w:pPr>
+            <w:pStyle w:val="5F2903C5364142F592C70983355C4059"/>
+          </w:pPr>
+          <w:r>
+            <w:rPr>
+              <w:rStyle w:val="PlaceholderText"/>
+            </w:rPr>
+            <w:t>Click or tap here to enter text.</w:t>
+          </w:r>
+        </w:p>
+      </w:docPartBody>
+    </w:docPart>
+    <w:docPart>
+      <w:docPartPr>
+        <w:name w:val="5CF7C4BFCF934A4AA31A1EB8FF20C82F"/>
+        <w:category>
+          <w:name w:val="General"/>
+          <w:gallery w:val="placeholder"/>
+        </w:category>
+        <w:types>
+          <w:type w:val="bbPlcHdr"/>
+        </w:types>
+        <w:behaviors>
+          <w:behavior w:val="content"/>
+        </w:behaviors>
+        <w:guid w:val="{4BAB32E0-69FB-4A2F-964B-1ABFF4B21B6E}"/>
+      </w:docPartPr>
+      <w:docPartBody>
+        <w:p>
+          <w:pPr>
+            <w:pStyle w:val="5CF7C4BFCF934A4AA31A1EB8FF20C82F"/>
+          </w:pPr>
+          <w:r>
+            <w:rPr>
+              <w:rStyle w:val="PlaceholderText"/>
+            </w:rPr>
+            <w:t>Click or tap here to enter text.</w:t>
+          </w:r>
+        </w:p>
+      </w:docPartBody>
+    </w:docPart>
+    <w:docPart>
+      <w:docPartPr>
+        <w:name w:val="3C8D664EF9864DDCAD46BF7DABA46242"/>
+        <w:category>
+          <w:name w:val="General"/>
+          <w:gallery w:val="placeholder"/>
+        </w:category>
+        <w:types>
+          <w:type w:val="bbPlcHdr"/>
+        </w:types>
+        <w:behaviors>
+          <w:behavior w:val="content"/>
+        </w:behaviors>
+        <w:guid w:val="{440170F7-77EC-43DF-B942-C612B47BC3C5}"/>
+      </w:docPartPr>
+      <w:docPartBody>
+        <w:p>
+          <w:pPr>
+            <w:pStyle w:val="3C8D664EF9864DDCAD46BF7DABA46242"/>
+          </w:pPr>
+          <w:r>
+            <w:rPr>
+              <w:rStyle w:val="PlaceholderText"/>
+            </w:rPr>
+            <w:t>Click or tap here to enter text.</w:t>
+          </w:r>
+        </w:p>
+      </w:docPartBody>
+    </w:docPart>
   </w:docParts>
 </w:glossaryDocument>
 </file>
@@ -2796,13 +2720,6 @@
     <w:pitch w:val="variable"/>
     <w:sig w:usb0="E4002EFF" w:usb1="C000E47F" w:usb2="00000009" w:usb3="00000000" w:csb0="000001FF" w:csb1="00000000"/>
   </w:font>
-  <w:font w:name="Arial">
-    <w:panose1 w:val="020B0604020202020204"/>
-    <w:charset w:val="00"/>
-    <w:family w:val="swiss"/>
-    <w:pitch w:val="variable"/>
-    <w:sig w:usb0="E0002EFF" w:usb1="C000785B" w:usb2="00000009" w:usb3="00000000" w:csb0="000001FF" w:csb1="00000000"/>
-  </w:font>
 </w:fonts>
 </file>
 
@@ -2810,6 +2727,7 @@
 <w:settings xmlns:mc="http://schemas.openxmlformats.org/markup-compatibility/2006" xmlns:o="urn:schemas-microsoft-com:office:office" xmlns:r="http://schemas.openxmlformats.org/officeDocument/2006/relationships" xmlns:m="http://schemas.openxmlformats.org/officeDocument/2006/math" xmlns:v="urn:schemas-microsoft-com:vml" xmlns:w10="urn:schemas-microsoft-com:office:word" xmlns:w="http://schemas.openxmlformats.org/wordprocessingml/2006/main" xmlns:w14="http://schemas.microsoft.com/office/word/2010/wordml" xmlns:w15="http://schemas.microsoft.com/office/word/2012/wordml" xmlns:w16cex="http://schemas.microsoft.com/office/word/2018/wordml/cex" xmlns:w16cid="http://schemas.microsoft.com/office/word/2016/wordml/cid" xmlns:w16="http://schemas.microsoft.com/office/word/2018/wordml" xmlns:w16du="http://schemas.microsoft.com/office/word/2023/wordml/word16du" xmlns:w16sdtdh="http://schemas.microsoft.com/office/word/2020/wordml/sdtdatahash" xmlns:w16sdtfl="http://schemas.microsoft.com/office/word/2024/wordml/sdtformatlock" xmlns:w16se="http://schemas.microsoft.com/office/word/2015/wordml/symex" xmlns:sl="http://schemas.openxmlformats.org/schemaLibrary/2006/main" mc:Ignorable="w14 w15 w16se w16cid w16 w16cex w16sdtdh w16sdtfl w16du">
   <w:view w:val="normal"/>
   <w:defaultTabStop w:val="720"/>
+  <w:hyphenationZone w:val="425"/>
   <w:characterSpacingControl w:val="doNotCompress"/>
   <w:compat>
     <w:useFELayout/>
@@ -2822,12 +2740,18 @@
   </w:compat>
   <w:rsids>
     <w:rsidRoot w:val="002A7083"/>
+    <w:rsid w:val="000B0067"/>
     <w:rsid w:val="00150D08"/>
+    <w:rsid w:val="0023545D"/>
+    <w:rsid w:val="00251397"/>
     <w:rsid w:val="002A7083"/>
+    <w:rsid w:val="006203BB"/>
     <w:rsid w:val="007D00DC"/>
+    <w:rsid w:val="0089231B"/>
     <w:rsid w:val="008C3096"/>
     <w:rsid w:val="00AA0C52"/>
     <w:rsid w:val="00C4474E"/>
+    <w:rsid w:val="00E5711F"/>
     <w:rsid w:val="00E84B36"/>
   </w:rsids>
   <m:mathPr>
@@ -2843,9 +2767,9 @@
     <m:intLim m:val="subSup"/>
     <m:naryLim m:val="undOvr"/>
   </m:mathPr>
-  <w:themeFontLang w:val="en-DK"/>
+  <w:themeFontLang/>
   <w:clrSchemeMapping w:bg1="light1" w:t1="dark1" w:bg2="light2" w:t2="dark2" w:accent1="accent1" w:accent2="accent2" w:accent3="accent3" w:accent4="accent4" w:accent5="accent5" w:accent6="accent6" w:hyperlink="hyperlink" w:followedHyperlink="followedHyperlink"/>
-  <w:decimalSymbol w:val=","/>
+  <w:decimalSymbol w:val="."/>
   <w:listSeparator w:val=","/>
   <w15:chartTrackingRefBased/>
 </w:settings>
@@ -2860,7 +2784,7 @@
         <w:kern w:val="2"/>
         <w:sz w:val="24"/>
         <w:szCs w:val="24"/>
-        <w:lang w:val="en-DK" w:eastAsia="en-DK" w:bidi="ar-SA"/>
+        <w:lang w:bidi="ar-SA"/>
         <w14:ligatures w14:val="standardContextual"/>
       </w:rPr>
     </w:rPrDefault>
@@ -3284,7 +3208,7 @@
     <w:basedOn w:val="DefaultParagraphFont"/>
     <w:uiPriority w:val="99"/>
     <w:semiHidden/>
-    <w:rsid w:val="00C4474E"/>
+    <w:rsid w:val="0089231B"/>
     <w:rPr>
       <w:color w:val="666666"/>
     </w:rPr>
@@ -3292,6 +3216,27 @@
   <w:style w:type="paragraph" w:customStyle="1" w:styleId="6942C0ACC20B4FA3A455AB8BDDEAFE2F">
     <w:name w:val="6942C0ACC20B4FA3A455AB8BDDEAFE2F"/>
     <w:rsid w:val="002A7083"/>
+  </w:style>
+  <w:style w:type="paragraph" w:customStyle="1" w:styleId="5F2903C5364142F592C70983355C4059">
+    <w:name w:val="5F2903C5364142F592C70983355C4059"/>
+    <w:rsid w:val="0089231B"/>
+    <w:rPr>
+      <w:lang w:val="da-DK" w:eastAsia="da-DK"/>
+    </w:rPr>
+  </w:style>
+  <w:style w:type="paragraph" w:customStyle="1" w:styleId="5CF7C4BFCF934A4AA31A1EB8FF20C82F">
+    <w:name w:val="5CF7C4BFCF934A4AA31A1EB8FF20C82F"/>
+    <w:rsid w:val="0089231B"/>
+    <w:rPr>
+      <w:lang w:val="da-DK" w:eastAsia="da-DK"/>
+    </w:rPr>
+  </w:style>
+  <w:style w:type="paragraph" w:customStyle="1" w:styleId="3C8D664EF9864DDCAD46BF7DABA46242">
+    <w:name w:val="3C8D664EF9864DDCAD46BF7DABA46242"/>
+    <w:rsid w:val="0089231B"/>
+    <w:rPr>
+      <w:lang w:val="da-DK" w:eastAsia="da-DK"/>
+    </w:rPr>
   </w:style>
 </w:styles>
 </file>
@@ -4414,4 +4359,10 @@
     <ds:schemaRef ds:uri="urn:microsoft-dynamics-businesscentral/internal/extended/reports/Customer_Order_Summary/107/"/>
   </ds:schemaRefs>
 </ds:datastoreItem>
+</file>
+
+<file path=docMetadata/LabelInfo.xml><?xml version="1.0" encoding="utf-8"?>
+<clbl:labelList xmlns:clbl="http://schemas.microsoft.com/office/2020/mipLabelMetadata">
+  <clbl:label id="{f42aa342-8706-4288-bd11-ebb85995028c}" enabled="1" method="Standard" siteId="{72f988bf-86f1-41af-91ab-2d7cd011db47}" contentBits="0" removed="0"/>
+</clbl:labelList>
 </file>
</xml_diff>

<commit_message>
Replace the three Sales report layouts with the versions from features/643211/migrate-existing-word-report-layouts-to-composite-document-report-structure
Takes the 6 files (3 .Report.al + 3 *Body.docx) verbatim from that branch,
tip 8443b74356, for:

- Report 107 Customer - Order Summary
- Report 114 Salesperson - Sales Statistics
- Report 115 Salesperson - Commission

Co-Authored-By: Claude Opus 5 (1M context) <noreply@anthropic.com>
</commit_message>
<xml_diff>
--- a/src/Layers/W1/BaseApp/Sales/Reports/CustomerOrderSummaryBody.docx
+++ b/src/Layers/W1/BaseApp/Sales/Reports/CustomerOrderSummaryBody.docx
@@ -1,6 +1,6 @@
 
 <file path=word/document.xml><?xml version="1.0" encoding="utf-8"?>
-<w:document xmlns:wpc="http://schemas.microsoft.com/office/word/2010/wordprocessingCanvas" xmlns:cx="http://schemas.microsoft.com/office/drawing/2014/chartex" xmlns:cx1="http://schemas.microsoft.com/office/drawing/2015/9/8/chartex" xmlns:cx2="http://schemas.microsoft.com/office/drawing/2015/10/21/chartex" xmlns:cx3="http://schemas.microsoft.com/office/drawing/2016/5/9/chartex" xmlns:cx4="http://schemas.microsoft.com/office/drawing/2016/5/10/chartex" xmlns:cx5="http://schemas.microsoft.com/office/drawing/2016/5/11/chartex" xmlns:cx6="http://schemas.microsoft.com/office/drawing/2016/5/12/chartex" xmlns:cx7="http://schemas.microsoft.com/office/drawing/2016/5/13/chartex" xmlns:cx8="http://schemas.microsoft.com/office/drawing/2016/5/14/chartex" xmlns:mc="http://schemas.openxmlformats.org/markup-compatibility/2006" xmlns:aink="http://schemas.microsoft.com/office/drawing/2016/ink" xmlns:am3d="http://schemas.microsoft.com/office/drawing/2017/model3d" xmlns:o="urn:schemas-microsoft-com:office:office" xmlns:oel="http://schemas.microsoft.com/office/2019/extlst" xmlns:r="http://schemas.openxmlformats.org/officeDocument/2006/relationships" xmlns:m="http://schemas.openxmlformats.org/officeDocument/2006/math" xmlns:v="urn:schemas-microsoft-com:vml" xmlns:wp14="http://schemas.microsoft.com/office/word/2010/wordprocessingDrawing" xmlns:wp="http://schemas.openxmlformats.org/drawingml/2006/wordprocessingDrawing" xmlns:w10="urn:schemas-microsoft-com:office:word" xmlns:w="http://schemas.openxmlformats.org/wordprocessingml/2006/main" xmlns:w14="http://schemas.microsoft.com/office/word/2010/wordml" xmlns:w15="http://schemas.microsoft.com/office/word/2012/wordml" xmlns:w16cex="http://schemas.microsoft.com/office/word/2018/wordml/cex" xmlns:w16cid="http://schemas.microsoft.com/office/word/2016/wordml/cid" xmlns:w16="http://schemas.microsoft.com/office/word/2018/wordml" xmlns:w16du="http://schemas.microsoft.com/office/word/2023/wordml/word16du" xmlns:w16sdtdh="http://schemas.microsoft.com/office/word/2020/wordml/sdtdatahash" xmlns:w16sdtfl="http://schemas.microsoft.com/office/word/2024/wordml/sdtformatlock" xmlns:w16se="http://schemas.microsoft.com/office/word/2015/wordml/symex" xmlns:wpg="http://schemas.microsoft.com/office/word/2010/wordprocessingGroup" xmlns:wpi="http://schemas.microsoft.com/office/word/2010/wordprocessingInk" xmlns:wne="http://schemas.microsoft.com/office/word/2006/wordml" xmlns:wps="http://schemas.microsoft.com/office/word/2010/wordprocessingShape" mc:Ignorable="w14 w15 w16se w16cid w16 w16cex w16sdtdh w16sdtfl w16du wp14">
+<w:document xmlns:wpc="http://schemas.microsoft.com/office/word/2010/wordprocessingCanvas" xmlns:cx="http://schemas.microsoft.com/office/drawing/2014/chartex" xmlns:cx1="http://schemas.microsoft.com/office/drawing/2015/9/8/chartex" xmlns:cx2="http://schemas.microsoft.com/office/drawing/2015/10/21/chartex" xmlns:cx3="http://schemas.microsoft.com/office/drawing/2016/5/9/chartex" xmlns:cx4="http://schemas.microsoft.com/office/drawing/2016/5/10/chartex" xmlns:cx5="http://schemas.microsoft.com/office/drawing/2016/5/11/chartex" xmlns:cx6="http://schemas.microsoft.com/office/drawing/2016/5/12/chartex" xmlns:cx7="http://schemas.microsoft.com/office/drawing/2016/5/13/chartex" xmlns:cx8="http://schemas.microsoft.com/office/drawing/2016/5/14/chartex" xmlns:mc="http://schemas.openxmlformats.org/markup-compatibility/2006" xmlns:aink="http://schemas.microsoft.com/office/drawing/2016/ink" xmlns:am3d="http://schemas.microsoft.com/office/drawing/2017/model3d" xmlns:o="urn:schemas-microsoft-com:office:office" xmlns:oel="http://schemas.microsoft.com/office/2019/extlst" xmlns:r="http://schemas.openxmlformats.org/officeDocument/2006/relationships" xmlns:m="http://schemas.openxmlformats.org/officeDocument/2006/math" xmlns:v="urn:schemas-microsoft-com:vml" xmlns:wp14="http://schemas.microsoft.com/office/word/2010/wordprocessingDrawing" xmlns:wp="http://schemas.openxmlformats.org/drawingml/2006/wordprocessingDrawing" xmlns:w10="urn:schemas-microsoft-com:office:word" xmlns:w="http://schemas.openxmlformats.org/wordprocessingml/2006/main" xmlns:w14="http://schemas.microsoft.com/office/word/2010/wordml" xmlns:w15="http://schemas.microsoft.com/office/word/2012/wordml" xmlns:w16cei="http://schemas.microsoft.com/office/word/2026/wordml/cei" xmlns:w16cex="http://schemas.microsoft.com/office/word/2018/wordml/cex" xmlns:w16cid="http://schemas.microsoft.com/office/word/2016/wordml/cid" xmlns:w16="http://schemas.microsoft.com/office/word/2018/wordml" xmlns:w16du="http://schemas.microsoft.com/office/word/2023/wordml/word16du" xmlns:w16sdtdh="http://schemas.microsoft.com/office/word/2020/wordml/sdtdatahash" xmlns:w16sdtfl="http://schemas.microsoft.com/office/word/2024/wordml/sdtformatlock" xmlns:w16se="http://schemas.microsoft.com/office/word/2015/wordml/symex" xmlns:wpg="http://schemas.microsoft.com/office/word/2010/wordprocessingGroup" xmlns:wpi="http://schemas.microsoft.com/office/word/2010/wordprocessingInk" xmlns:wne="http://schemas.microsoft.com/office/word/2006/wordml" xmlns:wps="http://schemas.microsoft.com/office/word/2010/wordprocessingShape" mc:Ignorable="w14 w15 w16se w16cid w16 w16cex w16sdtdh w16sdtfl w16du wp14">
   <w:body>
     <w:tbl>
       <w:tblPr>
@@ -32,7 +32,7 @@
             <w:placeholder>
               <w:docPart w:val="6942C0ACC20B4FA3A455AB8BDDEAFE2F"/>
             </w:placeholder>
-            <w:dataBinding w:prefixMappings="xmlns:ns0='urn:microsoft-dynamics-nav/reports/Customer_Order_Summary/107/'" w:xpath="/ns0:NavWordReportXmlPart[1]/ns0:Labels[1]/ns0:OutstandingOrdersLbl[1]" w:storeItemID="{935A1A8B-FBD8-496F-9CFA-0DAB10C40436}"/>
+            <w:dataBinding w:prefixMappings="xmlns:ns0='urn:microsoft-dynamics-nav/reports/Customer_Order_Summary/107/'" w:xpath="/ns0:NavWordReportXmlPart[1]/ns0:Labels[1]/ns0:OutstandingOrdersLbl[1]" w:storeItemID="{00000000-0000-0000-0000-000000000000}"/>
             <w15:color w:val="808080"/>
             <w:text/>
           </w:sdtPr>
@@ -61,7 +61,7 @@
             <w:placeholder>
               <w:docPart w:val="6942C0ACC20B4FA3A455AB8BDDEAFE2F"/>
             </w:placeholder>
-            <w:dataBinding w:prefixMappings="xmlns:ns0='urn:microsoft-dynamics-nav/reports/Customer_Order_Summary/107/'" w:xpath="/ns0:NavWordReportXmlPart[1]/ns0:Customer[1]/ns0:AllAmountsAreInLCYTxt[1]" w:storeItemID="{935A1A8B-FBD8-496F-9CFA-0DAB10C40436}"/>
+            <w:dataBinding w:prefixMappings="xmlns:ns0='urn:microsoft-dynamics-nav/reports/Customer_Order_Summary/107/'" w:xpath="/ns0:NavWordReportXmlPart[1]/ns0:Customer[1]/ns0:AllAmountsAreInLCYTxt[1]" w:storeItemID="{00000000-0000-0000-0000-000000000000}"/>
             <w15:color w:val="808080"/>
             <w:text/>
           </w:sdtPr>
@@ -90,7 +90,7 @@
             <w:placeholder>
               <w:docPart w:val="6942C0ACC20B4FA3A455AB8BDDEAFE2F"/>
             </w:placeholder>
-            <w:dataBinding w:prefixMappings="xmlns:ns0='urn:microsoft-dynamics-nav/reports/Customer_Order_Summary/107/'" w:xpath="/ns0:NavWordReportXmlPart[1]/ns0:Customer[1]/ns0:CustFilter[1]" w:storeItemID="{935A1A8B-FBD8-496F-9CFA-0DAB10C40436}"/>
+            <w:dataBinding w:prefixMappings="xmlns:ns0='urn:microsoft-dynamics-nav/reports/Customer_Order_Summary/107/'" w:xpath="/ns0:NavWordReportXmlPart[1]/ns0:Customer[1]/ns0:CustFilter[1]" w:storeItemID="{00000000-0000-0000-0000-000000000000}"/>
             <w15:color w:val="808080"/>
             <w:text/>
           </w:sdtPr>
@@ -216,29 +216,25 @@
       <w:pPr>
         <w:spacing w:after="0"/>
       </w:pPr>
-      <w:r>
-        <w:tab/>
-      </w:r>
     </w:p>
     <w:tbl>
       <w:tblPr>
         <w:tblStyle w:val="BCDataTable"/>
         <w:tblW w:w="5000" w:type="pct"/>
-        <w:tblLayout w:type="fixed"/>
         <w:tblLook w:val="0420" w:firstRow="1" w:lastRow="0" w:firstColumn="0" w:lastColumn="0" w:noHBand="0" w:noVBand="1"/>
         <w:tblCaption w:val="Data Table Block"/>
         <w:tblDescription w:val="Document lines. Column headers in the first row."/>
       </w:tblPr>
       <w:tblGrid>
-        <w:gridCol w:w="1552"/>
-        <w:gridCol w:w="3671"/>
-        <w:gridCol w:w="863"/>
-        <w:gridCol w:w="1600"/>
-        <w:gridCol w:w="1600"/>
-        <w:gridCol w:w="1600"/>
-        <w:gridCol w:w="1600"/>
-        <w:gridCol w:w="1600"/>
-        <w:gridCol w:w="1600"/>
+        <w:gridCol w:w="1728"/>
+        <w:gridCol w:w="1643"/>
+        <w:gridCol w:w="1579"/>
+        <w:gridCol w:w="1792"/>
+        <w:gridCol w:w="1792"/>
+        <w:gridCol w:w="1792"/>
+        <w:gridCol w:w="1792"/>
+        <w:gridCol w:w="1792"/>
+        <w:gridCol w:w="1776"/>
       </w:tblGrid>
       <w:tr>
         <w:trPr>
@@ -255,14 +251,14 @@
             <w:placeholder>
               <w:docPart w:val="DefaultPlaceholder_-1854013440"/>
             </w:placeholder>
-            <w:dataBinding w:prefixMappings="xmlns:ns0='urn:microsoft-dynamics-nav/reports/Customer_Order_Summary/107/'" w:xpath="/ns0:NavWordReportXmlPart[1]/ns0:Labels[1]/ns0:CustomerNoLbl[1]" w:storeItemID="{935A1A8B-FBD8-496F-9CFA-0DAB10C40436}"/>
+            <w:dataBinding w:prefixMappings="xmlns:ns0='urn:microsoft-dynamics-nav/reports/Customer_Order_Summary/107/'" w:xpath="/ns0:NavWordReportXmlPart[1]/ns0:Labels[1]/ns0:CustomerNoLbl[1]" w:storeItemID="{00000000-0000-0000-0000-000000000000}"/>
             <w15:color w:val="808080"/>
             <w:text/>
           </w:sdtPr>
           <w:sdtContent>
             <w:tc>
               <w:tcPr>
-                <w:tcW w:w="495" w:type="pct"/>
+                <w:tcW w:w="555" w:type="pct"/>
                 <w:tcBorders>
                   <w:bottom w:val="single" w:color="auto" w:sz="4" w:space="0"/>
                 </w:tcBorders>
@@ -286,14 +282,14 @@
             <w:placeholder>
               <w:docPart w:val="DefaultPlaceholder_-1854013440"/>
             </w:placeholder>
-            <w:dataBinding w:prefixMappings="xmlns:ns0='urn:microsoft-dynamics-nav/reports/Customer_Order_Summary/107/'" w:xpath="/ns0:NavWordReportXmlPart[1]/ns0:Labels[1]/ns0:CustomerNameLbl[1]" w:storeItemID="{935A1A8B-FBD8-496F-9CFA-0DAB10C40436}"/>
+            <w:dataBinding w:prefixMappings="xmlns:ns0='urn:microsoft-dynamics-nav/reports/Customer_Order_Summary/107/'" w:xpath="/ns0:NavWordReportXmlPart[1]/ns0:Labels[1]/ns0:CustomerNameLbl[1]" w:storeItemID="{00000000-0000-0000-0000-000000000000}"/>
             <w15:color w:val="808080"/>
             <w:text/>
           </w:sdtPr>
           <w:sdtContent>
             <w:tc>
               <w:tcPr>
-                <w:tcW w:w="1170" w:type="pct"/>
+                <w:tcW w:w="556" w:type="pct"/>
                 <w:tcBorders>
                   <w:bottom w:val="single" w:color="auto" w:sz="4" w:space="0"/>
                 </w:tcBorders>
@@ -309,19 +305,37 @@
             </w:tc>
           </w:sdtContent>
         </w:sdt>
-        <w:tc>
-          <w:tcPr>
-            <w:tcW w:w="275" w:type="pct"/>
-            <w:tcBorders>
-              <w:bottom w:val="single" w:color="auto" w:sz="4" w:space="0"/>
-            </w:tcBorders>
-          </w:tcPr>
-          <w:p>
-            <w:pPr>
-              <w:pStyle w:val="BCLabel0"/>
-            </w:pPr>
-          </w:p>
-        </w:tc>
+        <w:sdt>
+          <w:sdtPr>
+            <w:alias w:val="CurrencyCode_SalesLineCaption"/>
+            <w:tag w:val="#BC:InsertDataItem,Labels/CurrencyCode_SalesLineCaption"/>
+            <w:id w:val="-1944988925"/>
+            <w:placeholder>
+              <w:docPart w:val="DefaultPlaceholder_-1854013440"/>
+            </w:placeholder>
+            <w:dataBinding w:prefixMappings="xmlns:ns0='urn:microsoft-dynamics-nav/reports/Customer_Order_Summary/107/'" w:xpath="/ns0:NavWordReportXmlPart[1]/ns0:Labels[1]/ns0:CurrencyCode_SalesLineCaption[1]" w:storeItemID="{00000000-0000-0000-0000-000000000000}"/>
+            <w15:color w:val="808080"/>
+            <w:text/>
+          </w:sdtPr>
+          <w:sdtContent>
+            <w:tc>
+              <w:tcPr>
+                <w:tcW w:w="555" w:type="pct"/>
+                <w:tcBorders>
+                  <w:bottom w:val="single" w:color="auto" w:sz="4" w:space="0"/>
+                </w:tcBorders>
+              </w:tcPr>
+              <w:p>
+                <w:pPr>
+                  <w:pStyle w:val="BCLabel0"/>
+                </w:pPr>
+                <w:r>
+                  <w:t>CurrencyCode_SalesLineCaption</w:t>
+                </w:r>
+              </w:p>
+            </w:tc>
+          </w:sdtContent>
+        </w:sdt>
         <w:sdt>
           <w:sdtPr>
             <w:alias w:val="Before1Lbl"/>
@@ -330,14 +344,14 @@
             <w:placeholder>
               <w:docPart w:val="DefaultPlaceholder_-1854013440"/>
             </w:placeholder>
-            <w:dataBinding w:prefixMappings="xmlns:ns0='urn:microsoft-dynamics-nav/reports/Customer_Order_Summary/107/'" w:xpath="/ns0:NavWordReportXmlPart[1]/ns0:Labels[1]/ns0:Before1Lbl[1]" w:storeItemID="{935A1A8B-FBD8-496F-9CFA-0DAB10C40436}"/>
+            <w:dataBinding w:prefixMappings="xmlns:ns0='urn:microsoft-dynamics-nav/reports/Customer_Order_Summary/107/'" w:xpath="/ns0:NavWordReportXmlPart[1]/ns0:Labels[1]/ns0:Before1Lbl[1]" w:storeItemID="{00000000-0000-0000-0000-000000000000}"/>
             <w15:color w:val="808080"/>
             <w:text/>
           </w:sdtPr>
           <w:sdtContent>
             <w:tc>
               <w:tcPr>
-                <w:tcW w:w="510" w:type="pct"/>
+                <w:tcW w:w="556" w:type="pct"/>
                 <w:tcBorders>
                   <w:bottom w:val="single" w:color="auto" w:sz="4" w:space="0"/>
                 </w:tcBorders>
@@ -356,7 +370,7 @@
         </w:sdt>
         <w:tc>
           <w:tcPr>
-            <w:tcW w:w="510" w:type="pct"/>
+            <w:tcW w:w="555" w:type="pct"/>
             <w:tcBorders>
               <w:bottom w:val="single" w:color="auto" w:sz="4" w:space="0"/>
             </w:tcBorders>
@@ -369,7 +383,7 @@
               <w:placeholder>
                 <w:docPart w:val="DefaultPlaceholder_-1854013440"/>
               </w:placeholder>
-              <w:dataBinding w:prefixMappings="xmlns:ns0='urn:microsoft-dynamics-nav/reports/Customer_Order_Summary/107/'" w:xpath="/ns0:NavWordReportXmlPart[1]/ns0:Customer[1]/ns0:PeriodStartDate1[1]" w:storeItemID="{935A1A8B-FBD8-496F-9CFA-0DAB10C40436}"/>
+              <w:dataBinding w:prefixMappings="xmlns:ns0='urn:microsoft-dynamics-nav/reports/Customer_Order_Summary/107/'" w:xpath="/ns0:NavWordReportXmlPart[1]/ns0:Customer[1]/ns0:PeriodStartDate1[1]" w:storeItemID="{00000000-0000-0000-0000-000000000000}"/>
               <w15:color w:val="808080"/>
               <w:text/>
             </w:sdtPr>
@@ -411,7 +425,7 @@
         </w:tc>
         <w:tc>
           <w:tcPr>
-            <w:tcW w:w="510" w:type="pct"/>
+            <w:tcW w:w="556" w:type="pct"/>
             <w:tcBorders>
               <w:bottom w:val="single" w:color="auto" w:sz="4" w:space="0"/>
             </w:tcBorders>
@@ -424,7 +438,7 @@
               <w:placeholder>
                 <w:docPart w:val="DefaultPlaceholder_-1854013440"/>
               </w:placeholder>
-              <w:dataBinding w:prefixMappings="xmlns:ns0='urn:microsoft-dynamics-nav/reports/Customer_Order_Summary/107/'" w:xpath="/ns0:NavWordReportXmlPart[1]/ns0:Customer[1]/ns0:PeriodStartDate2[1]" w:storeItemID="{935A1A8B-FBD8-496F-9CFA-0DAB10C40436}"/>
+              <w:dataBinding w:prefixMappings="xmlns:ns0='urn:microsoft-dynamics-nav/reports/Customer_Order_Summary/107/'" w:xpath="/ns0:NavWordReportXmlPart[1]/ns0:Customer[1]/ns0:PeriodStartDate2[1]" w:storeItemID="{00000000-0000-0000-0000-000000000000}"/>
               <w15:color w:val="808080"/>
               <w:text/>
             </w:sdtPr>
@@ -466,7 +480,7 @@
         </w:tc>
         <w:tc>
           <w:tcPr>
-            <w:tcW w:w="510" w:type="pct"/>
+            <w:tcW w:w="555" w:type="pct"/>
             <w:tcBorders>
               <w:bottom w:val="single" w:color="auto" w:sz="4" w:space="0"/>
             </w:tcBorders>
@@ -479,7 +493,7 @@
               <w:placeholder>
                 <w:docPart w:val="DefaultPlaceholder_-1854013440"/>
               </w:placeholder>
-              <w:dataBinding w:prefixMappings="xmlns:ns0='urn:microsoft-dynamics-nav/reports/Customer_Order_Summary/107/'" w:xpath="/ns0:NavWordReportXmlPart[1]/ns0:Customer[1]/ns0:PeriodStartDate3[1]" w:storeItemID="{935A1A8B-FBD8-496F-9CFA-0DAB10C40436}"/>
+              <w:dataBinding w:prefixMappings="xmlns:ns0='urn:microsoft-dynamics-nav/reports/Customer_Order_Summary/107/'" w:xpath="/ns0:NavWordReportXmlPart[1]/ns0:Customer[1]/ns0:PeriodStartDate3[1]" w:storeItemID="{00000000-0000-0000-0000-000000000000}"/>
               <w15:color w:val="808080"/>
               <w:text/>
             </w:sdtPr>
@@ -521,7 +535,7 @@
         </w:tc>
         <w:tc>
           <w:tcPr>
-            <w:tcW w:w="510" w:type="pct"/>
+            <w:tcW w:w="556" w:type="pct"/>
             <w:tcBorders>
               <w:bottom w:val="single" w:color="auto" w:sz="4" w:space="0"/>
             </w:tcBorders>
@@ -540,7 +554,7 @@
               <w:placeholder>
                 <w:docPart w:val="DefaultPlaceholder_-1854013440"/>
               </w:placeholder>
-              <w:dataBinding w:prefixMappings="xmlns:ns0='urn:microsoft-dynamics-nav/reports/Customer_Order_Summary/107/'" w:xpath="/ns0:NavWordReportXmlPart[1]/ns0:Labels[1]/ns0:After1Lbl[1]" w:storeItemID="{935A1A8B-FBD8-496F-9CFA-0DAB10C40436}"/>
+              <w:dataBinding w:prefixMappings="xmlns:ns0='urn:microsoft-dynamics-nav/reports/Customer_Order_Summary/107/'" w:xpath="/ns0:NavWordReportXmlPart[1]/ns0:Labels[1]/ns0:After1Lbl[1]" w:storeItemID="{00000000-0000-0000-0000-000000000000}"/>
               <w15:color w:val="808080"/>
               <w:text/>
             </w:sdtPr>
@@ -559,7 +573,7 @@
         </w:tc>
         <w:tc>
           <w:tcPr>
-            <w:tcW w:w="510" w:type="pct"/>
+            <w:tcW w:w="556" w:type="pct"/>
             <w:tcBorders>
               <w:bottom w:val="single" w:color="auto" w:sz="4" w:space="0"/>
             </w:tcBorders>
@@ -578,7 +592,7 @@
               <w:placeholder>
                 <w:docPart w:val="DefaultPlaceholder_-1854013440"/>
               </w:placeholder>
-              <w:dataBinding w:prefixMappings="xmlns:ns0='urn:microsoft-dynamics-nav/reports/Customer_Order_Summary/107/'" w:xpath="/ns0:NavWordReportXmlPart[1]/ns0:Labels[1]/ns0:TotalCaptionLbl[1]" w:storeItemID="{935A1A8B-FBD8-496F-9CFA-0DAB10C40436}"/>
+              <w:dataBinding w:prefixMappings="xmlns:ns0='urn:microsoft-dynamics-nav/reports/Customer_Order_Summary/107/'" w:xpath="/ns0:NavWordReportXmlPart[1]/ns0:Labels[1]/ns0:TotalCaptionLbl[1]" w:storeItemID="{00000000-0000-0000-0000-000000000000}"/>
               <w15:color w:val="808080"/>
               <w:text/>
             </w:sdtPr>
@@ -604,7 +618,7 @@
         </w:trPr>
         <w:tc>
           <w:tcPr>
-            <w:tcW w:w="495" w:type="pct"/>
+            <w:tcW w:w="555" w:type="pct"/>
             <w:tcBorders>
               <w:top w:val="single" w:color="auto" w:sz="4" w:space="0"/>
             </w:tcBorders>
@@ -620,7 +634,7 @@
         </w:tc>
         <w:tc>
           <w:tcPr>
-            <w:tcW w:w="1170" w:type="pct"/>
+            <w:tcW w:w="556" w:type="pct"/>
             <w:tcBorders>
               <w:top w:val="single" w:color="auto" w:sz="4" w:space="0"/>
             </w:tcBorders>
@@ -636,7 +650,7 @@
         </w:tc>
         <w:tc>
           <w:tcPr>
-            <w:tcW w:w="275" w:type="pct"/>
+            <w:tcW w:w="555" w:type="pct"/>
             <w:tcBorders>
               <w:top w:val="single" w:color="auto" w:sz="4" w:space="0"/>
             </w:tcBorders>
@@ -652,7 +666,7 @@
         </w:tc>
         <w:tc>
           <w:tcPr>
-            <w:tcW w:w="510" w:type="pct"/>
+            <w:tcW w:w="556" w:type="pct"/>
             <w:tcBorders>
               <w:top w:val="single" w:color="auto" w:sz="4" w:space="0"/>
             </w:tcBorders>
@@ -668,7 +682,7 @@
         </w:tc>
         <w:tc>
           <w:tcPr>
-            <w:tcW w:w="510" w:type="pct"/>
+            <w:tcW w:w="555" w:type="pct"/>
             <w:tcBorders>
               <w:top w:val="single" w:color="auto" w:sz="4" w:space="0"/>
             </w:tcBorders>
@@ -684,7 +698,7 @@
         </w:tc>
         <w:tc>
           <w:tcPr>
-            <w:tcW w:w="510" w:type="pct"/>
+            <w:tcW w:w="556" w:type="pct"/>
             <w:tcBorders>
               <w:top w:val="single" w:color="auto" w:sz="4" w:space="0"/>
             </w:tcBorders>
@@ -700,7 +714,7 @@
         </w:tc>
         <w:tc>
           <w:tcPr>
-            <w:tcW w:w="510" w:type="pct"/>
+            <w:tcW w:w="555" w:type="pct"/>
             <w:tcBorders>
               <w:top w:val="single" w:color="auto" w:sz="4" w:space="0"/>
             </w:tcBorders>
@@ -716,7 +730,7 @@
         </w:tc>
         <w:tc>
           <w:tcPr>
-            <w:tcW w:w="510" w:type="pct"/>
+            <w:tcW w:w="556" w:type="pct"/>
             <w:tcBorders>
               <w:top w:val="single" w:color="auto" w:sz="4" w:space="0"/>
             </w:tcBorders>
@@ -732,7 +746,7 @@
         </w:tc>
         <w:tc>
           <w:tcPr>
-            <w:tcW w:w="510" w:type="pct"/>
+            <w:tcW w:w="556" w:type="pct"/>
             <w:tcBorders>
               <w:top w:val="single" w:color="auto" w:sz="4" w:space="0"/>
             </w:tcBorders>
@@ -759,7 +773,7 @@
           <w:placeholder>
             <w:docPart w:val="3003D6BF65584CF3A8C37BF79B780AA8"/>
           </w:placeholder>
-          <w15:dataBinding w:prefixMappings="xmlns:ns0='urn:microsoft-dynamics-nav/reports/Customer_Order_Summary/107/' " w:xpath="/ns0:NavWordReportXmlPart[1]/ns0:SalesLineBuffer_Integer" w:storeItemID="{935A1A8B-FBD8-496F-9CFA-0DAB10C40436}"/>
+          <w15:dataBinding w:prefixMappings="xmlns:ns0='urn:microsoft-dynamics-nav/reports/Customer_Order_Summary/107/'" w:xpath="/ns0:NavWordReportXmlPart[1]/ns0:SalesLineBuffer_Integer" w:storeItemID="{00000000-0000-0000-0000-000000000000}"/>
           <w15:color w:val="808080"/>
           <w15:repeatingSection/>
         </w:sdtPr>
@@ -779,7 +793,7 @@
                 <w:trPr>
                   <w:cnfStyle w:val="000000010000" w:firstRow="0" w:lastRow="0" w:firstColumn="0" w:lastColumn="0" w:oddVBand="0" w:evenVBand="0" w:oddHBand="0" w:evenHBand="1" w:firstRowFirstColumn="0" w:firstRowLastColumn="0" w:lastRowFirstColumn="0" w:lastRowLastColumn="0"/>
                   <w:cantSplit/>
-                  <w:trHeight w:val="230" w:hRule="exact"/>
+                  <w:trHeight w:val="490"/>
                 </w:trPr>
                 <w:sdt>
                   <w:sdtPr>
@@ -793,7 +807,7 @@
                     <w:placeholder>
                       <w:docPart w:val="DefaultPlaceholder_-1854013440"/>
                     </w:placeholder>
-                    <w:dataBinding w:prefixMappings="xmlns:ns0='urn:microsoft-dynamics-nav/reports/Customer_Order_Summary/107/'" w:xpath="/ns0:NavWordReportXmlPart[1]/ns0:SalesLineBuffer_Integer[1]/ns0:SalesLineBuffer_BilltoCustomerNo[1]" w:storeItemID="{935A1A8B-FBD8-496F-9CFA-0DAB10C40436}"/>
+                    <w:dataBinding w:prefixMappings="xmlns:ns0='urn:microsoft-dynamics-nav/reports/Customer_Order_Summary/107/'" w:xpath="/ns0:NavWordReportXmlPart[1]/ns0:SalesLineBuffer_Integer[1]/ns0:SalesLineBuffer_BilltoCustomerNo[1]" w:storeItemID="{00000000-0000-0000-0000-000000000000}"/>
                     <w15:color w:val="808080"/>
                     <w:text/>
                   </w:sdtPr>
@@ -805,7 +819,7 @@
                   <w:sdtContent>
                     <w:tc>
                       <w:tcPr>
-                        <w:tcW w:w="495" w:type="pct"/>
+                        <w:tcW w:w="555" w:type="pct"/>
                       </w:tcPr>
                       <w:p>
                         <w:pPr>
@@ -837,14 +851,14 @@
                     <w:placeholder>
                       <w:docPart w:val="DefaultPlaceholder_-1854013440"/>
                     </w:placeholder>
-                    <w:dataBinding w:prefixMappings="xmlns:ns0='urn:microsoft-dynamics-nav/reports/Customer_Order_Summary/107/'" w:xpath="/ns0:NavWordReportXmlPart[1]/ns0:SalesLineBuffer_Integer[1]/ns0:SalesLineBuffer_CustomerName[1]" w:storeItemID="{935A1A8B-FBD8-496F-9CFA-0DAB10C40436}"/>
+                    <w:dataBinding w:prefixMappings="xmlns:ns0='urn:microsoft-dynamics-nav/reports/Customer_Order_Summary/107/'" w:xpath="/ns0:NavWordReportXmlPart[1]/ns0:SalesLineBuffer_Integer[1]/ns0:SalesLineBuffer_CustomerName[1]" w:storeItemID="{00000000-0000-0000-0000-000000000000}"/>
                     <w15:color w:val="808080"/>
                     <w:text/>
                   </w:sdtPr>
                   <w:sdtContent>
                     <w:tc>
                       <w:tcPr>
-                        <w:tcW w:w="1170" w:type="pct"/>
+                        <w:tcW w:w="556" w:type="pct"/>
                       </w:tcPr>
                       <w:p>
                         <w:pPr>
@@ -874,14 +888,14 @@
                     <w:placeholder>
                       <w:docPart w:val="DefaultPlaceholder_-1854013440"/>
                     </w:placeholder>
-                    <w:dataBinding w:prefixMappings="xmlns:ns0='urn:microsoft-dynamics-nav/reports/Customer_Order_Summary/107/'" w:xpath="/ns0:NavWordReportXmlPart[1]/ns0:SalesLineBuffer_Integer[1]/ns0:SalesLineBuffer_CurrencyCode[1]" w:storeItemID="{935A1A8B-FBD8-496F-9CFA-0DAB10C40436}"/>
+                    <w:dataBinding w:prefixMappings="xmlns:ns0='urn:microsoft-dynamics-nav/reports/Customer_Order_Summary/107/'" w:xpath="/ns0:NavWordReportXmlPart[1]/ns0:SalesLineBuffer_Integer[1]/ns0:SalesLineBuffer_CurrencyCode[1]" w:storeItemID="{00000000-0000-0000-0000-000000000000}"/>
                     <w15:color w:val="808080"/>
                     <w:text/>
                   </w:sdtPr>
                   <w:sdtContent>
                     <w:tc>
                       <w:tcPr>
-                        <w:tcW w:w="275" w:type="pct"/>
+                        <w:tcW w:w="555" w:type="pct"/>
                       </w:tcPr>
                       <w:p>
                         <w:pPr>
@@ -910,14 +924,14 @@
                     <w:placeholder>
                       <w:docPart w:val="DefaultPlaceholder_-1854013440"/>
                     </w:placeholder>
-                    <w:dataBinding w:prefixMappings="xmlns:ns0='urn:microsoft-dynamics-nav/reports/Customer_Order_Summary/107/'" w:xpath="/ns0:NavWordReportXmlPart[1]/ns0:SalesLineBuffer_Integer[1]/ns0:SalesLineBuffer_SalesAmtOnOrder1[1]" w:storeItemID="{935A1A8B-FBD8-496F-9CFA-0DAB10C40436}"/>
+                    <w:dataBinding w:prefixMappings="xmlns:ns0='urn:microsoft-dynamics-nav/reports/Customer_Order_Summary/107/'" w:xpath="/ns0:NavWordReportXmlPart[1]/ns0:SalesLineBuffer_Integer[1]/ns0:SalesLineBuffer_SalesAmtOnOrder1[1]" w:storeItemID="{00000000-0000-0000-0000-000000000000}"/>
                     <w15:color w:val="808080"/>
                     <w:text/>
                   </w:sdtPr>
                   <w:sdtContent>
                     <w:tc>
                       <w:tcPr>
-                        <w:tcW w:w="510" w:type="pct"/>
+                        <w:tcW w:w="556" w:type="pct"/>
                       </w:tcPr>
                       <w:p>
                         <w:pPr>
@@ -939,14 +953,14 @@
                     <w:placeholder>
                       <w:docPart w:val="DefaultPlaceholder_-1854013440"/>
                     </w:placeholder>
-                    <w:dataBinding w:prefixMappings="xmlns:ns0='urn:microsoft-dynamics-nav/reports/Customer_Order_Summary/107/'" w:xpath="/ns0:NavWordReportXmlPart[1]/ns0:SalesLineBuffer_Integer[1]/ns0:SalesLineBuffer_SalesAmtOnOrder2[1]" w:storeItemID="{935A1A8B-FBD8-496F-9CFA-0DAB10C40436}"/>
+                    <w:dataBinding w:prefixMappings="xmlns:ns0='urn:microsoft-dynamics-nav/reports/Customer_Order_Summary/107/'" w:xpath="/ns0:NavWordReportXmlPart[1]/ns0:SalesLineBuffer_Integer[1]/ns0:SalesLineBuffer_SalesAmtOnOrder2[1]" w:storeItemID="{00000000-0000-0000-0000-000000000000}"/>
                     <w15:color w:val="808080"/>
                     <w:text/>
                   </w:sdtPr>
                   <w:sdtContent>
                     <w:tc>
                       <w:tcPr>
-                        <w:tcW w:w="510" w:type="pct"/>
+                        <w:tcW w:w="555" w:type="pct"/>
                       </w:tcPr>
                       <w:p>
                         <w:pPr>
@@ -968,14 +982,14 @@
                     <w:placeholder>
                       <w:docPart w:val="DefaultPlaceholder_-1854013440"/>
                     </w:placeholder>
-                    <w:dataBinding w:prefixMappings="xmlns:ns0='urn:microsoft-dynamics-nav/reports/Customer_Order_Summary/107/'" w:xpath="/ns0:NavWordReportXmlPart[1]/ns0:SalesLineBuffer_Integer[1]/ns0:SalesLineBuffer_SalesAmtOnOrder3[1]" w:storeItemID="{935A1A8B-FBD8-496F-9CFA-0DAB10C40436}"/>
+                    <w:dataBinding w:prefixMappings="xmlns:ns0='urn:microsoft-dynamics-nav/reports/Customer_Order_Summary/107/'" w:xpath="/ns0:NavWordReportXmlPart[1]/ns0:SalesLineBuffer_Integer[1]/ns0:SalesLineBuffer_SalesAmtOnOrder3[1]" w:storeItemID="{00000000-0000-0000-0000-000000000000}"/>
                     <w15:color w:val="808080"/>
                     <w:text/>
                   </w:sdtPr>
                   <w:sdtContent>
                     <w:tc>
                       <w:tcPr>
-                        <w:tcW w:w="510" w:type="pct"/>
+                        <w:tcW w:w="556" w:type="pct"/>
                       </w:tcPr>
                       <w:p>
                         <w:pPr>
@@ -997,14 +1011,14 @@
                     <w:placeholder>
                       <w:docPart w:val="DefaultPlaceholder_-1854013440"/>
                     </w:placeholder>
-                    <w:dataBinding w:prefixMappings="xmlns:ns0='urn:microsoft-dynamics-nav/reports/Customer_Order_Summary/107/'" w:xpath="/ns0:NavWordReportXmlPart[1]/ns0:SalesLineBuffer_Integer[1]/ns0:SalesLineBuffer_SalesAmtOnOrder4[1]" w:storeItemID="{935A1A8B-FBD8-496F-9CFA-0DAB10C40436}"/>
+                    <w:dataBinding w:prefixMappings="xmlns:ns0='urn:microsoft-dynamics-nav/reports/Customer_Order_Summary/107/'" w:xpath="/ns0:NavWordReportXmlPart[1]/ns0:SalesLineBuffer_Integer[1]/ns0:SalesLineBuffer_SalesAmtOnOrder4[1]" w:storeItemID="{00000000-0000-0000-0000-000000000000}"/>
                     <w15:color w:val="808080"/>
                     <w:text/>
                   </w:sdtPr>
                   <w:sdtContent>
                     <w:tc>
                       <w:tcPr>
-                        <w:tcW w:w="510" w:type="pct"/>
+                        <w:tcW w:w="555" w:type="pct"/>
                       </w:tcPr>
                       <w:p>
                         <w:pPr>
@@ -1026,14 +1040,14 @@
                     <w:placeholder>
                       <w:docPart w:val="DefaultPlaceholder_-1854013440"/>
                     </w:placeholder>
-                    <w:dataBinding w:prefixMappings="xmlns:ns0='urn:microsoft-dynamics-nav/reports/Customer_Order_Summary/107/'" w:xpath="/ns0:NavWordReportXmlPart[1]/ns0:SalesLineBuffer_Integer[1]/ns0:SalesLineBuffer_SalesAmtOnOrder5[1]" w:storeItemID="{935A1A8B-FBD8-496F-9CFA-0DAB10C40436}"/>
+                    <w:dataBinding w:prefixMappings="xmlns:ns0='urn:microsoft-dynamics-nav/reports/Customer_Order_Summary/107/'" w:xpath="/ns0:NavWordReportXmlPart[1]/ns0:SalesLineBuffer_Integer[1]/ns0:SalesLineBuffer_SalesAmtOnOrder5[1]" w:storeItemID="{00000000-0000-0000-0000-000000000000}"/>
                     <w15:color w:val="808080"/>
                     <w:text/>
                   </w:sdtPr>
                   <w:sdtContent>
                     <w:tc>
                       <w:tcPr>
-                        <w:tcW w:w="510" w:type="pct"/>
+                        <w:tcW w:w="556" w:type="pct"/>
                       </w:tcPr>
                       <w:p>
                         <w:pPr>
@@ -1055,14 +1069,14 @@
                     <w:placeholder>
                       <w:docPart w:val="DefaultPlaceholder_-1854013440"/>
                     </w:placeholder>
-                    <w:dataBinding w:prefixMappings="xmlns:ns0='urn:microsoft-dynamics-nav/reports/Customer_Order_Summary/107/'" w:xpath="/ns0:NavWordReportXmlPart[1]/ns0:SalesLineBuffer_Integer[1]/ns0:SalesLineBuffer_SalesOrderAmount[1]" w:storeItemID="{935A1A8B-FBD8-496F-9CFA-0DAB10C40436}"/>
+                    <w:dataBinding w:prefixMappings="xmlns:ns0='urn:microsoft-dynamics-nav/reports/Customer_Order_Summary/107/'" w:xpath="/ns0:NavWordReportXmlPart[1]/ns0:SalesLineBuffer_Integer[1]/ns0:SalesLineBuffer_SalesOrderAmount[1]" w:storeItemID="{00000000-0000-0000-0000-000000000000}"/>
                     <w15:color w:val="808080"/>
                     <w:text/>
                   </w:sdtPr>
                   <w:sdtContent>
                     <w:tc>
                       <w:tcPr>
-                        <w:tcW w:w="510" w:type="pct"/>
+                        <w:tcW w:w="556" w:type="pct"/>
                       </w:tcPr>
                       <w:p>
                         <w:pPr>
@@ -1090,22 +1104,21 @@
     <w:tbl>
       <w:tblPr>
         <w:tblStyle w:val="BCTotalsTable"/>
-        <w:tblW w:w="5005" w:type="pct"/>
-        <w:tblLayout w:type="fixed"/>
+        <w:tblW w:w="5000" w:type="pct"/>
         <w:tblLook w:val="0640" w:firstRow="0" w:lastRow="1" w:firstColumn="0" w:lastColumn="0" w:noHBand="1" w:noVBand="1"/>
         <w:tblCaption w:val="Table 3"/>
         <w:tblDescription w:val="Document totals."/>
       </w:tblPr>
       <w:tblGrid>
-        <w:gridCol w:w="1553"/>
-        <w:gridCol w:w="3673"/>
-        <w:gridCol w:w="864"/>
-        <w:gridCol w:w="1602"/>
-        <w:gridCol w:w="1602"/>
-        <w:gridCol w:w="1602"/>
-        <w:gridCol w:w="1602"/>
-        <w:gridCol w:w="1602"/>
-        <w:gridCol w:w="1602"/>
+        <w:gridCol w:w="1339"/>
+        <w:gridCol w:w="235"/>
+        <w:gridCol w:w="234"/>
+        <w:gridCol w:w="2332"/>
+        <w:gridCol w:w="2332"/>
+        <w:gridCol w:w="2332"/>
+        <w:gridCol w:w="2332"/>
+        <w:gridCol w:w="2332"/>
+        <w:gridCol w:w="2218"/>
       </w:tblGrid>
       <w:tr>
         <w:trPr>
@@ -1120,14 +1133,14 @@
             <w:placeholder>
               <w:docPart w:val="DefaultPlaceholder_-1854013440"/>
             </w:placeholder>
-            <w:dataBinding w:prefixMappings="xmlns:ns0='urn:microsoft-dynamics-nav/reports/Customer_Order_Summary/107/'" w:xpath="/ns0:NavWordReportXmlPart[1]/ns0:Totals[1]/ns0:Totals_TotalText[1]" w:storeItemID="{935A1A8B-FBD8-496F-9CFA-0DAB10C40436}"/>
+            <w:dataBinding w:prefixMappings="xmlns:ns0='urn:microsoft-dynamics-nav/reports/Customer_Order_Summary/107/'" w:xpath="/ns0:NavWordReportXmlPart[1]/ns0:Totals[1]/ns0:Totals_TotalText[1]" w:storeItemID="{00000000-0000-0000-0000-000000000000}"/>
             <w15:color w:val="808080"/>
             <w:text/>
           </w:sdtPr>
           <w:sdtContent>
             <w:tc>
               <w:tcPr>
-                <w:tcW w:w="495" w:type="pct"/>
+                <w:tcW w:w="555" w:type="pct"/>
               </w:tcPr>
               <w:p>
                 <w:pPr>
@@ -1143,7 +1156,7 @@
         </w:sdt>
         <w:tc>
           <w:tcPr>
-            <w:tcW w:w="1170" w:type="pct"/>
+            <w:tcW w:w="556" w:type="pct"/>
           </w:tcPr>
           <w:p>
             <w:pPr>
@@ -1154,7 +1167,7 @@
         </w:tc>
         <w:tc>
           <w:tcPr>
-            <w:tcW w:w="275" w:type="pct"/>
+            <w:tcW w:w="555" w:type="pct"/>
           </w:tcPr>
           <w:p>
             <w:pPr>
@@ -1174,14 +1187,14 @@
             <w:placeholder>
               <w:docPart w:val="DefaultPlaceholder_-1854013440"/>
             </w:placeholder>
-            <w:dataBinding w:prefixMappings="xmlns:ns0='urn:microsoft-dynamics-nav/reports/Customer_Order_Summary/107/'" w:xpath="/ns0:NavWordReportXmlPart[1]/ns0:Totals[1]/ns0:Totals_Sales_Amt_On_Order1[1]" w:storeItemID="{935A1A8B-FBD8-496F-9CFA-0DAB10C40436}"/>
+            <w:dataBinding w:prefixMappings="xmlns:ns0='urn:microsoft-dynamics-nav/reports/Customer_Order_Summary/107/'" w:xpath="/ns0:NavWordReportXmlPart[1]/ns0:Totals[1]/ns0:Totals_Sales_Amt_On_Order1[1]" w:storeItemID="{00000000-0000-0000-0000-000000000000}"/>
             <w15:color w:val="808080"/>
             <w:text/>
           </w:sdtPr>
           <w:sdtContent>
             <w:tc>
               <w:tcPr>
-                <w:tcW w:w="510" w:type="pct"/>
+                <w:tcW w:w="556" w:type="pct"/>
               </w:tcPr>
               <w:p>
                 <w:pPr>
@@ -1213,14 +1226,14 @@
             <w:placeholder>
               <w:docPart w:val="DefaultPlaceholder_-1854013440"/>
             </w:placeholder>
-            <w:dataBinding w:prefixMappings="xmlns:ns0='urn:microsoft-dynamics-nav/reports/Customer_Order_Summary/107/'" w:xpath="/ns0:NavWordReportXmlPart[1]/ns0:Totals[1]/ns0:Totals_Sales_Amt_On_Order2[1]" w:storeItemID="{935A1A8B-FBD8-496F-9CFA-0DAB10C40436}"/>
+            <w:dataBinding w:prefixMappings="xmlns:ns0='urn:microsoft-dynamics-nav/reports/Customer_Order_Summary/107/'" w:xpath="/ns0:NavWordReportXmlPart[1]/ns0:Totals[1]/ns0:Totals_Sales_Amt_On_Order2[1]" w:storeItemID="{00000000-0000-0000-0000-000000000000}"/>
             <w15:color w:val="808080"/>
             <w:text/>
           </w:sdtPr>
           <w:sdtContent>
             <w:tc>
               <w:tcPr>
-                <w:tcW w:w="510" w:type="pct"/>
+                <w:tcW w:w="555" w:type="pct"/>
               </w:tcPr>
               <w:p>
                 <w:pPr>
@@ -1252,14 +1265,14 @@
             <w:placeholder>
               <w:docPart w:val="DefaultPlaceholder_-1854013440"/>
             </w:placeholder>
-            <w:dataBinding w:prefixMappings="xmlns:ns0='urn:microsoft-dynamics-nav/reports/Customer_Order_Summary/107/'" w:xpath="/ns0:NavWordReportXmlPart[1]/ns0:Totals[1]/ns0:Totals_Sales_Amt_On_Order3[1]" w:storeItemID="{935A1A8B-FBD8-496F-9CFA-0DAB10C40436}"/>
+            <w:dataBinding w:prefixMappings="xmlns:ns0='urn:microsoft-dynamics-nav/reports/Customer_Order_Summary/107/'" w:xpath="/ns0:NavWordReportXmlPart[1]/ns0:Totals[1]/ns0:Totals_Sales_Amt_On_Order3[1]" w:storeItemID="{00000000-0000-0000-0000-000000000000}"/>
             <w15:color w:val="808080"/>
             <w:text/>
           </w:sdtPr>
           <w:sdtContent>
             <w:tc>
               <w:tcPr>
-                <w:tcW w:w="510" w:type="pct"/>
+                <w:tcW w:w="556" w:type="pct"/>
               </w:tcPr>
               <w:p>
                 <w:pPr>
@@ -1291,14 +1304,14 @@
             <w:placeholder>
               <w:docPart w:val="DefaultPlaceholder_-1854013440"/>
             </w:placeholder>
-            <w:dataBinding w:prefixMappings="xmlns:ns0='urn:microsoft-dynamics-nav/reports/Customer_Order_Summary/107/'" w:xpath="/ns0:NavWordReportXmlPart[1]/ns0:Totals[1]/ns0:Totals_Sales_Amt_On_Order4[1]" w:storeItemID="{935A1A8B-FBD8-496F-9CFA-0DAB10C40436}"/>
+            <w:dataBinding w:prefixMappings="xmlns:ns0='urn:microsoft-dynamics-nav/reports/Customer_Order_Summary/107/'" w:xpath="/ns0:NavWordReportXmlPart[1]/ns0:Totals[1]/ns0:Totals_Sales_Amt_On_Order4[1]" w:storeItemID="{00000000-0000-0000-0000-000000000000}"/>
             <w15:color w:val="808080"/>
             <w:text/>
           </w:sdtPr>
           <w:sdtContent>
             <w:tc>
               <w:tcPr>
-                <w:tcW w:w="510" w:type="pct"/>
+                <w:tcW w:w="555" w:type="pct"/>
               </w:tcPr>
               <w:p>
                 <w:pPr>
@@ -1330,14 +1343,14 @@
             <w:placeholder>
               <w:docPart w:val="DefaultPlaceholder_-1854013440"/>
             </w:placeholder>
-            <w:dataBinding w:prefixMappings="xmlns:ns0='urn:microsoft-dynamics-nav/reports/Customer_Order_Summary/107/'" w:xpath="/ns0:NavWordReportXmlPart[1]/ns0:Totals[1]/ns0:Totals_Sales_Amt_On_Order5[1]" w:storeItemID="{935A1A8B-FBD8-496F-9CFA-0DAB10C40436}"/>
+            <w:dataBinding w:prefixMappings="xmlns:ns0='urn:microsoft-dynamics-nav/reports/Customer_Order_Summary/107/'" w:xpath="/ns0:NavWordReportXmlPart[1]/ns0:Totals[1]/ns0:Totals_Sales_Amt_On_Order5[1]" w:storeItemID="{00000000-0000-0000-0000-000000000000}"/>
             <w15:color w:val="808080"/>
             <w:text/>
           </w:sdtPr>
           <w:sdtContent>
             <w:tc>
               <w:tcPr>
-                <w:tcW w:w="510" w:type="pct"/>
+                <w:tcW w:w="556" w:type="pct"/>
               </w:tcPr>
               <w:p>
                 <w:pPr>
@@ -1366,14 +1379,14 @@
             <w:placeholder>
               <w:docPart w:val="DefaultPlaceholder_-1854013440"/>
             </w:placeholder>
-            <w:dataBinding w:prefixMappings="xmlns:ns0='urn:microsoft-dynamics-nav/reports/Customer_Order_Summary/107/'" w:xpath="/ns0:NavWordReportXmlPart[1]/ns0:Totals[1]/ns0:Totals_Sales_Order_Amount[1]" w:storeItemID="{935A1A8B-FBD8-496F-9CFA-0DAB10C40436}"/>
+            <w:dataBinding w:prefixMappings="xmlns:ns0='urn:microsoft-dynamics-nav/reports/Customer_Order_Summary/107/'" w:xpath="/ns0:NavWordReportXmlPart[1]/ns0:Totals[1]/ns0:Totals_Sales_Order_Amount[1]" w:storeItemID="{00000000-0000-0000-0000-000000000000}"/>
             <w15:color w:val="808080"/>
             <w:text/>
           </w:sdtPr>
           <w:sdtContent>
             <w:tc>
               <w:tcPr>
-                <w:tcW w:w="510" w:type="pct"/>
+                <w:tcW w:w="556" w:type="pct"/>
               </w:tcPr>
               <w:p>
                 <w:pPr>
@@ -2470,7 +2483,7 @@
 </file>
 
 <file path=word/glossary/document.xml><?xml version="1.0" encoding="utf-8"?>
-<w:glossaryDocument xmlns:wpc="http://schemas.microsoft.com/office/word/2010/wordprocessingCanvas" xmlns:cx="http://schemas.microsoft.com/office/drawing/2014/chartex" xmlns:cx1="http://schemas.microsoft.com/office/drawing/2015/9/8/chartex" xmlns:cx2="http://schemas.microsoft.com/office/drawing/2015/10/21/chartex" xmlns:cx3="http://schemas.microsoft.com/office/drawing/2016/5/9/chartex" xmlns:cx4="http://schemas.microsoft.com/office/drawing/2016/5/10/chartex" xmlns:cx5="http://schemas.microsoft.com/office/drawing/2016/5/11/chartex" xmlns:cx6="http://schemas.microsoft.com/office/drawing/2016/5/12/chartex" xmlns:cx7="http://schemas.microsoft.com/office/drawing/2016/5/13/chartex" xmlns:cx8="http://schemas.microsoft.com/office/drawing/2016/5/14/chartex" xmlns:mc="http://schemas.openxmlformats.org/markup-compatibility/2006" xmlns:aink="http://schemas.microsoft.com/office/drawing/2016/ink" xmlns:am3d="http://schemas.microsoft.com/office/drawing/2017/model3d" xmlns:o="urn:schemas-microsoft-com:office:office" xmlns:oel="http://schemas.microsoft.com/office/2019/extlst" xmlns:r="http://schemas.openxmlformats.org/officeDocument/2006/relationships" xmlns:m="http://schemas.openxmlformats.org/officeDocument/2006/math" xmlns:v="urn:schemas-microsoft-com:vml" xmlns:wp14="http://schemas.microsoft.com/office/word/2010/wordprocessingDrawing" xmlns:wp="http://schemas.openxmlformats.org/drawingml/2006/wordprocessingDrawing" xmlns:w10="urn:schemas-microsoft-com:office:word" xmlns:w="http://schemas.openxmlformats.org/wordprocessingml/2006/main" xmlns:w14="http://schemas.microsoft.com/office/word/2010/wordml" xmlns:w15="http://schemas.microsoft.com/office/word/2012/wordml" xmlns:w16cex="http://schemas.microsoft.com/office/word/2018/wordml/cex" xmlns:w16cid="http://schemas.microsoft.com/office/word/2016/wordml/cid" xmlns:w16="http://schemas.microsoft.com/office/word/2018/wordml" xmlns:w16du="http://schemas.microsoft.com/office/word/2023/wordml/word16du" xmlns:w16sdtdh="http://schemas.microsoft.com/office/word/2020/wordml/sdtdatahash" xmlns:w16sdtfl="http://schemas.microsoft.com/office/word/2024/wordml/sdtformatlock" xmlns:w16se="http://schemas.microsoft.com/office/word/2015/wordml/symex" xmlns:wpg="http://schemas.microsoft.com/office/word/2010/wordprocessingGroup" xmlns:wpi="http://schemas.microsoft.com/office/word/2010/wordprocessingInk" xmlns:wne="http://schemas.microsoft.com/office/word/2006/wordml" xmlns:wps="http://schemas.microsoft.com/office/word/2010/wordprocessingShape" mc:Ignorable="w14 w15 w16se w16cid w16 w16cex w16sdtdh w16sdtfl w16du wp14">
+<w:glossaryDocument xmlns:wpc="http://schemas.microsoft.com/office/word/2010/wordprocessingCanvas" xmlns:cx="http://schemas.microsoft.com/office/drawing/2014/chartex" xmlns:cx1="http://schemas.microsoft.com/office/drawing/2015/9/8/chartex" xmlns:cx2="http://schemas.microsoft.com/office/drawing/2015/10/21/chartex" xmlns:cx3="http://schemas.microsoft.com/office/drawing/2016/5/9/chartex" xmlns:cx4="http://schemas.microsoft.com/office/drawing/2016/5/10/chartex" xmlns:cx5="http://schemas.microsoft.com/office/drawing/2016/5/11/chartex" xmlns:cx6="http://schemas.microsoft.com/office/drawing/2016/5/12/chartex" xmlns:cx7="http://schemas.microsoft.com/office/drawing/2016/5/13/chartex" xmlns:cx8="http://schemas.microsoft.com/office/drawing/2016/5/14/chartex" xmlns:mc="http://schemas.openxmlformats.org/markup-compatibility/2006" xmlns:aink="http://schemas.microsoft.com/office/drawing/2016/ink" xmlns:am3d="http://schemas.microsoft.com/office/drawing/2017/model3d" xmlns:o="urn:schemas-microsoft-com:office:office" xmlns:oel="http://schemas.microsoft.com/office/2019/extlst" xmlns:r="http://schemas.openxmlformats.org/officeDocument/2006/relationships" xmlns:m="http://schemas.openxmlformats.org/officeDocument/2006/math" xmlns:v="urn:schemas-microsoft-com:vml" xmlns:wp14="http://schemas.microsoft.com/office/word/2010/wordprocessingDrawing" xmlns:wp="http://schemas.openxmlformats.org/drawingml/2006/wordprocessingDrawing" xmlns:w10="urn:schemas-microsoft-com:office:word" xmlns:w="http://schemas.openxmlformats.org/wordprocessingml/2006/main" xmlns:w14="http://schemas.microsoft.com/office/word/2010/wordml" xmlns:w15="http://schemas.microsoft.com/office/word/2012/wordml" xmlns:w16cei="http://schemas.microsoft.com/office/word/2026/wordml/cei" xmlns:w16cex="http://schemas.microsoft.com/office/word/2018/wordml/cex" xmlns:w16cid="http://schemas.microsoft.com/office/word/2016/wordml/cid" xmlns:w16="http://schemas.microsoft.com/office/word/2018/wordml" xmlns:w16du="http://schemas.microsoft.com/office/word/2023/wordml/word16du" xmlns:w16sdtdh="http://schemas.microsoft.com/office/word/2020/wordml/sdtdatahash" xmlns:w16sdtfl="http://schemas.microsoft.com/office/word/2024/wordml/sdtformatlock" xmlns:w16se="http://schemas.microsoft.com/office/word/2015/wordml/symex" xmlns:wpg="http://schemas.microsoft.com/office/word/2010/wordprocessingGroup" xmlns:wpi="http://schemas.microsoft.com/office/word/2010/wordprocessingInk" xmlns:wne="http://schemas.microsoft.com/office/word/2006/wordml" xmlns:wps="http://schemas.microsoft.com/office/word/2010/wordprocessingShape" mc:Ignorable="w14 w15 w16se w16cid w16 w16cex w16sdtdh w16sdtfl w16du wp14">
   <w:docParts>
     <w:docPart>
       <w:docPartPr>
@@ -2711,10 +2724,8 @@
     <w:rsid w:val="0023545D"/>
     <w:rsid w:val="00251397"/>
     <w:rsid w:val="002A7083"/>
-    <w:rsid w:val="00565ECE"/>
     <w:rsid w:val="006203BB"/>
     <w:rsid w:val="007D00DC"/>
-    <w:rsid w:val="00812141"/>
     <w:rsid w:val="00817E50"/>
     <w:rsid w:val="0089231B"/>
     <w:rsid w:val="008C3096"/>
@@ -2723,7 +2734,6 @@
     <w:rsid w:val="00C4474E"/>
     <w:rsid w:val="00E5711F"/>
     <w:rsid w:val="00E84B36"/>
-    <w:rsid w:val="00FE2E14"/>
   </w:rsids>
   <m:mathPr>
     <m:mathFont m:val="Cambria Math"/>
@@ -2740,7 +2750,7 @@
   </m:mathPr>
   <w:themeFontLang w:val="da-DK"/>
   <w:clrSchemeMapping w:bg1="light1" w:t1="dark1" w:bg2="light2" w:t2="dark2" w:accent1="accent1" w:accent2="accent2" w:accent3="accent3" w:accent4="accent4" w:accent5="accent5" w:accent6="accent6" w:hyperlink="hyperlink" w:followedHyperlink="followedHyperlink"/>
-  <w:decimalSymbol w:val="."/>
+  <w:decimalSymbol w:val=","/>
   <w:listSeparator w:val=","/>
   <w15:chartTrackingRefBased/>
 </w:settings>
@@ -3902,7 +3912,9 @@
  < / N a v W o r d R e p o r t X m l P a r t > 
 </file>
 
-<file path=customXml/item2.xml>��< ? x m l   v e r s i o n = " 1 . 0 "   e n c o d i n g = " u t f - 1 6 " ? > < N a v W o r d R e p o r t X m l P a r t   x m l n s = " u r n : m i c r o s o f t - d y n a m i c s - b u s i n e s s c e n t r a l / i n t e r n a l / e x t e n d e d / r e p o r t s / C u s t o m e r _ O r d e r _ S u m m a r y / 1 0 7 / " > +<file path=customXml/item2.xml>��< ? x m l   v e r s i o n = " 1 . 0 "   e n c o d i n g = " u t f - 1 6 " ? > + 
+ < N a v W o r d R e p o r t X m l P a r t   x m l n s = " u r n : m i c r o s o f t - d y n a m i c s - b u s i n e s s c e n t r a l / i n t e r n a l / e x t e n d e d / r e p o r t s / C u s t o m e r _ O r d e r _ S u m m a r y / 1 0 7 / " >   
      < B C R e p o r t I n f o r m a t i o n >   

</xml_diff>

<commit_message>
Moved to smaller slice
</commit_message>
<xml_diff>
--- a/src/Layers/W1/BaseApp/Sales/Reports/CustomerOrderSummaryBody.docx
+++ b/src/Layers/W1/BaseApp/Sales/Reports/CustomerOrderSummaryBody.docx
@@ -1,6 +1,6 @@
 
 <file path=word/document.xml><?xml version="1.0" encoding="utf-8"?>
-<w:document xmlns:wpc="http://schemas.microsoft.com/office/word/2010/wordprocessingCanvas" xmlns:cx="http://schemas.microsoft.com/office/drawing/2014/chartex" xmlns:cx1="http://schemas.microsoft.com/office/drawing/2015/9/8/chartex" xmlns:cx2="http://schemas.microsoft.com/office/drawing/2015/10/21/chartex" xmlns:cx3="http://schemas.microsoft.com/office/drawing/2016/5/9/chartex" xmlns:cx4="http://schemas.microsoft.com/office/drawing/2016/5/10/chartex" xmlns:cx5="http://schemas.microsoft.com/office/drawing/2016/5/11/chartex" xmlns:cx6="http://schemas.microsoft.com/office/drawing/2016/5/12/chartex" xmlns:cx7="http://schemas.microsoft.com/office/drawing/2016/5/13/chartex" xmlns:cx8="http://schemas.microsoft.com/office/drawing/2016/5/14/chartex" xmlns:mc="http://schemas.openxmlformats.org/markup-compatibility/2006" xmlns:aink="http://schemas.microsoft.com/office/drawing/2016/ink" xmlns:am3d="http://schemas.microsoft.com/office/drawing/2017/model3d" xmlns:o="urn:schemas-microsoft-com:office:office" xmlns:oel="http://schemas.microsoft.com/office/2019/extlst" xmlns:r="http://schemas.openxmlformats.org/officeDocument/2006/relationships" xmlns:m="http://schemas.openxmlformats.org/officeDocument/2006/math" xmlns:v="urn:schemas-microsoft-com:vml" xmlns:wp14="http://schemas.microsoft.com/office/word/2010/wordprocessingDrawing" xmlns:wp="http://schemas.openxmlformats.org/drawingml/2006/wordprocessingDrawing" xmlns:w10="urn:schemas-microsoft-com:office:word" xmlns:w="http://schemas.openxmlformats.org/wordprocessingml/2006/main" xmlns:w14="http://schemas.microsoft.com/office/word/2010/wordml" xmlns:w15="http://schemas.microsoft.com/office/word/2012/wordml" xmlns:w16cei="http://schemas.microsoft.com/office/word/2026/wordml/cei" xmlns:w16cex="http://schemas.microsoft.com/office/word/2018/wordml/cex" xmlns:w16cid="http://schemas.microsoft.com/office/word/2016/wordml/cid" xmlns:w16="http://schemas.microsoft.com/office/word/2018/wordml" xmlns:w16du="http://schemas.microsoft.com/office/word/2023/wordml/word16du" xmlns:w16sdtdh="http://schemas.microsoft.com/office/word/2020/wordml/sdtdatahash" xmlns:w16sdtfl="http://schemas.microsoft.com/office/word/2024/wordml/sdtformatlock" xmlns:w16se="http://schemas.microsoft.com/office/word/2015/wordml/symex" xmlns:wpg="http://schemas.microsoft.com/office/word/2010/wordprocessingGroup" xmlns:wpi="http://schemas.microsoft.com/office/word/2010/wordprocessingInk" xmlns:wne="http://schemas.microsoft.com/office/word/2006/wordml" xmlns:wps="http://schemas.microsoft.com/office/word/2010/wordprocessingShape" mc:Ignorable="w14 w15 w16se w16cid w16 w16cex w16sdtdh w16sdtfl w16du wp14">
+<w:document xmlns:wpc="http://schemas.microsoft.com/office/word/2010/wordprocessingCanvas" xmlns:cx="http://schemas.microsoft.com/office/drawing/2014/chartex" xmlns:cx1="http://schemas.microsoft.com/office/drawing/2015/9/8/chartex" xmlns:cx2="http://schemas.microsoft.com/office/drawing/2015/10/21/chartex" xmlns:cx3="http://schemas.microsoft.com/office/drawing/2016/5/9/chartex" xmlns:cx4="http://schemas.microsoft.com/office/drawing/2016/5/10/chartex" xmlns:cx5="http://schemas.microsoft.com/office/drawing/2016/5/11/chartex" xmlns:cx6="http://schemas.microsoft.com/office/drawing/2016/5/12/chartex" xmlns:cx7="http://schemas.microsoft.com/office/drawing/2016/5/13/chartex" xmlns:cx8="http://schemas.microsoft.com/office/drawing/2016/5/14/chartex" xmlns:mc="http://schemas.openxmlformats.org/markup-compatibility/2006" xmlns:aink="http://schemas.microsoft.com/office/drawing/2016/ink" xmlns:am3d="http://schemas.microsoft.com/office/drawing/2017/model3d" xmlns:o="urn:schemas-microsoft-com:office:office" xmlns:oel="http://schemas.microsoft.com/office/2019/extlst" xmlns:r="http://schemas.openxmlformats.org/officeDocument/2006/relationships" xmlns:m="http://schemas.openxmlformats.org/officeDocument/2006/math" xmlns:v="urn:schemas-microsoft-com:vml" xmlns:wp14="http://schemas.microsoft.com/office/word/2010/wordprocessingDrawing" xmlns:wp="http://schemas.openxmlformats.org/drawingml/2006/wordprocessingDrawing" xmlns:w10="urn:schemas-microsoft-com:office:word" xmlns:w="http://schemas.openxmlformats.org/wordprocessingml/2006/main" xmlns:w14="http://schemas.microsoft.com/office/word/2010/wordml" xmlns:w15="http://schemas.microsoft.com/office/word/2012/wordml" xmlns:w16cex="http://schemas.microsoft.com/office/word/2018/wordml/cex" xmlns:w16cid="http://schemas.microsoft.com/office/word/2016/wordml/cid" xmlns:w16="http://schemas.microsoft.com/office/word/2018/wordml" xmlns:w16du="http://schemas.microsoft.com/office/word/2023/wordml/word16du" xmlns:w16sdtdh="http://schemas.microsoft.com/office/word/2020/wordml/sdtdatahash" xmlns:w16sdtfl="http://schemas.microsoft.com/office/word/2024/wordml/sdtformatlock" xmlns:w16se="http://schemas.microsoft.com/office/word/2015/wordml/symex" xmlns:wpg="http://schemas.microsoft.com/office/word/2010/wordprocessingGroup" xmlns:wpi="http://schemas.microsoft.com/office/word/2010/wordprocessingInk" xmlns:wne="http://schemas.microsoft.com/office/word/2006/wordml" xmlns:wps="http://schemas.microsoft.com/office/word/2010/wordprocessingShape" mc:Ignorable="w14 w15 w16se w16cid w16 w16cex w16sdtdh w16sdtfl w16du wp14">
   <w:body>
     <w:tbl>
       <w:tblPr>
@@ -32,7 +32,7 @@
             <w:placeholder>
               <w:docPart w:val="6942C0ACC20B4FA3A455AB8BDDEAFE2F"/>
             </w:placeholder>
-            <w:dataBinding w:prefixMappings="xmlns:ns0='urn:microsoft-dynamics-nav/reports/Customer_Order_Summary/107/'" w:xpath="/ns0:NavWordReportXmlPart[1]/ns0:Labels[1]/ns0:OutstandingOrdersLbl[1]" w:storeItemID="{00000000-0000-0000-0000-000000000000}"/>
+            <w:dataBinding w:prefixMappings="xmlns:ns0='urn:microsoft-dynamics-nav/reports/Customer_Order_Summary/107/'" w:xpath="/ns0:NavWordReportXmlPart[1]/ns0:Labels[1]/ns0:OutstandingOrdersLbl[1]" w:storeItemID="{935A1A8B-FBD8-496F-9CFA-0DAB10C40436}"/>
             <w15:color w:val="808080"/>
             <w:text/>
           </w:sdtPr>
@@ -61,7 +61,7 @@
             <w:placeholder>
               <w:docPart w:val="6942C0ACC20B4FA3A455AB8BDDEAFE2F"/>
             </w:placeholder>
-            <w:dataBinding w:prefixMappings="xmlns:ns0='urn:microsoft-dynamics-nav/reports/Customer_Order_Summary/107/'" w:xpath="/ns0:NavWordReportXmlPart[1]/ns0:Customer[1]/ns0:AllAmountsAreInLCYTxt[1]" w:storeItemID="{00000000-0000-0000-0000-000000000000}"/>
+            <w:dataBinding w:prefixMappings="xmlns:ns0='urn:microsoft-dynamics-nav/reports/Customer_Order_Summary/107/'" w:xpath="/ns0:NavWordReportXmlPart[1]/ns0:Customer[1]/ns0:AllAmountsAreInLCYTxt[1]" w:storeItemID="{935A1A8B-FBD8-496F-9CFA-0DAB10C40436}"/>
             <w15:color w:val="808080"/>
             <w:text/>
           </w:sdtPr>
@@ -90,7 +90,7 @@
             <w:placeholder>
               <w:docPart w:val="6942C0ACC20B4FA3A455AB8BDDEAFE2F"/>
             </w:placeholder>
-            <w:dataBinding w:prefixMappings="xmlns:ns0='urn:microsoft-dynamics-nav/reports/Customer_Order_Summary/107/'" w:xpath="/ns0:NavWordReportXmlPart[1]/ns0:Customer[1]/ns0:CustFilter[1]" w:storeItemID="{00000000-0000-0000-0000-000000000000}"/>
+            <w:dataBinding w:prefixMappings="xmlns:ns0='urn:microsoft-dynamics-nav/reports/Customer_Order_Summary/107/'" w:xpath="/ns0:NavWordReportXmlPart[1]/ns0:Customer[1]/ns0:CustFilter[1]" w:storeItemID="{935A1A8B-FBD8-496F-9CFA-0DAB10C40436}"/>
             <w15:color w:val="808080"/>
             <w:text/>
           </w:sdtPr>
@@ -216,25 +216,29 @@
       <w:pPr>
         <w:spacing w:after="0"/>
       </w:pPr>
+      <w:r>
+        <w:tab/>
+      </w:r>
     </w:p>
     <w:tbl>
       <w:tblPr>
         <w:tblStyle w:val="BCDataTable"/>
         <w:tblW w:w="5000" w:type="pct"/>
+        <w:tblLayout w:type="fixed"/>
         <w:tblLook w:val="0420" w:firstRow="1" w:lastRow="0" w:firstColumn="0" w:lastColumn="0" w:noHBand="0" w:noVBand="1"/>
         <w:tblCaption w:val="Data Table Block"/>
         <w:tblDescription w:val="Document lines. Column headers in the first row."/>
       </w:tblPr>
       <w:tblGrid>
-        <w:gridCol w:w="1728"/>
-        <w:gridCol w:w="1643"/>
-        <w:gridCol w:w="1579"/>
-        <w:gridCol w:w="1792"/>
-        <w:gridCol w:w="1792"/>
-        <w:gridCol w:w="1792"/>
-        <w:gridCol w:w="1792"/>
-        <w:gridCol w:w="1792"/>
-        <w:gridCol w:w="1776"/>
+        <w:gridCol w:w="1552"/>
+        <w:gridCol w:w="3671"/>
+        <w:gridCol w:w="863"/>
+        <w:gridCol w:w="1600"/>
+        <w:gridCol w:w="1600"/>
+        <w:gridCol w:w="1600"/>
+        <w:gridCol w:w="1600"/>
+        <w:gridCol w:w="1600"/>
+        <w:gridCol w:w="1600"/>
       </w:tblGrid>
       <w:tr>
         <w:trPr>
@@ -251,14 +255,14 @@
             <w:placeholder>
               <w:docPart w:val="DefaultPlaceholder_-1854013440"/>
             </w:placeholder>
-            <w:dataBinding w:prefixMappings="xmlns:ns0='urn:microsoft-dynamics-nav/reports/Customer_Order_Summary/107/'" w:xpath="/ns0:NavWordReportXmlPart[1]/ns0:Labels[1]/ns0:CustomerNoLbl[1]" w:storeItemID="{00000000-0000-0000-0000-000000000000}"/>
+            <w:dataBinding w:prefixMappings="xmlns:ns0='urn:microsoft-dynamics-nav/reports/Customer_Order_Summary/107/'" w:xpath="/ns0:NavWordReportXmlPart[1]/ns0:Labels[1]/ns0:CustomerNoLbl[1]" w:storeItemID="{935A1A8B-FBD8-496F-9CFA-0DAB10C40436}"/>
             <w15:color w:val="808080"/>
             <w:text/>
           </w:sdtPr>
           <w:sdtContent>
             <w:tc>
               <w:tcPr>
-                <w:tcW w:w="555" w:type="pct"/>
+                <w:tcW w:w="495" w:type="pct"/>
                 <w:tcBorders>
                   <w:bottom w:val="single" w:color="auto" w:sz="4" w:space="0"/>
                 </w:tcBorders>
@@ -282,14 +286,14 @@
             <w:placeholder>
               <w:docPart w:val="DefaultPlaceholder_-1854013440"/>
             </w:placeholder>
-            <w:dataBinding w:prefixMappings="xmlns:ns0='urn:microsoft-dynamics-nav/reports/Customer_Order_Summary/107/'" w:xpath="/ns0:NavWordReportXmlPart[1]/ns0:Labels[1]/ns0:CustomerNameLbl[1]" w:storeItemID="{00000000-0000-0000-0000-000000000000}"/>
+            <w:dataBinding w:prefixMappings="xmlns:ns0='urn:microsoft-dynamics-nav/reports/Customer_Order_Summary/107/'" w:xpath="/ns0:NavWordReportXmlPart[1]/ns0:Labels[1]/ns0:CustomerNameLbl[1]" w:storeItemID="{935A1A8B-FBD8-496F-9CFA-0DAB10C40436}"/>
             <w15:color w:val="808080"/>
             <w:text/>
           </w:sdtPr>
           <w:sdtContent>
             <w:tc>
               <w:tcPr>
-                <w:tcW w:w="556" w:type="pct"/>
+                <w:tcW w:w="1170" w:type="pct"/>
                 <w:tcBorders>
                   <w:bottom w:val="single" w:color="auto" w:sz="4" w:space="0"/>
                 </w:tcBorders>
@@ -305,37 +309,19 @@
             </w:tc>
           </w:sdtContent>
         </w:sdt>
-        <w:sdt>
-          <w:sdtPr>
-            <w:alias w:val="CurrencyCode_SalesLineCaption"/>
-            <w:tag w:val="#BC:InsertDataItem,Labels/CurrencyCode_SalesLineCaption"/>
-            <w:id w:val="-1944988925"/>
-            <w:placeholder>
-              <w:docPart w:val="DefaultPlaceholder_-1854013440"/>
-            </w:placeholder>
-            <w:dataBinding w:prefixMappings="xmlns:ns0='urn:microsoft-dynamics-nav/reports/Customer_Order_Summary/107/'" w:xpath="/ns0:NavWordReportXmlPart[1]/ns0:Labels[1]/ns0:CurrencyCode_SalesLineCaption[1]" w:storeItemID="{00000000-0000-0000-0000-000000000000}"/>
-            <w15:color w:val="808080"/>
-            <w:text/>
-          </w:sdtPr>
-          <w:sdtContent>
-            <w:tc>
-              <w:tcPr>
-                <w:tcW w:w="555" w:type="pct"/>
-                <w:tcBorders>
-                  <w:bottom w:val="single" w:color="auto" w:sz="4" w:space="0"/>
-                </w:tcBorders>
-              </w:tcPr>
-              <w:p>
-                <w:pPr>
-                  <w:pStyle w:val="BCLabel0"/>
-                </w:pPr>
-                <w:r>
-                  <w:t>CurrencyCode_SalesLineCaption</w:t>
-                </w:r>
-              </w:p>
-            </w:tc>
-          </w:sdtContent>
-        </w:sdt>
+        <w:tc>
+          <w:tcPr>
+            <w:tcW w:w="275" w:type="pct"/>
+            <w:tcBorders>
+              <w:bottom w:val="single" w:color="auto" w:sz="4" w:space="0"/>
+            </w:tcBorders>
+          </w:tcPr>
+          <w:p>
+            <w:pPr>
+              <w:pStyle w:val="BCLabel0"/>
+            </w:pPr>
+          </w:p>
+        </w:tc>
         <w:sdt>
           <w:sdtPr>
             <w:alias w:val="Before1Lbl"/>
@@ -344,14 +330,14 @@
             <w:placeholder>
               <w:docPart w:val="DefaultPlaceholder_-1854013440"/>
             </w:placeholder>
-            <w:dataBinding w:prefixMappings="xmlns:ns0='urn:microsoft-dynamics-nav/reports/Customer_Order_Summary/107/'" w:xpath="/ns0:NavWordReportXmlPart[1]/ns0:Labels[1]/ns0:Before1Lbl[1]" w:storeItemID="{00000000-0000-0000-0000-000000000000}"/>
+            <w:dataBinding w:prefixMappings="xmlns:ns0='urn:microsoft-dynamics-nav/reports/Customer_Order_Summary/107/'" w:xpath="/ns0:NavWordReportXmlPart[1]/ns0:Labels[1]/ns0:Before1Lbl[1]" w:storeItemID="{935A1A8B-FBD8-496F-9CFA-0DAB10C40436}"/>
             <w15:color w:val="808080"/>
             <w:text/>
           </w:sdtPr>
           <w:sdtContent>
             <w:tc>
               <w:tcPr>
-                <w:tcW w:w="556" w:type="pct"/>
+                <w:tcW w:w="510" w:type="pct"/>
                 <w:tcBorders>
                   <w:bottom w:val="single" w:color="auto" w:sz="4" w:space="0"/>
                 </w:tcBorders>
@@ -370,7 +356,7 @@
         </w:sdt>
         <w:tc>
           <w:tcPr>
-            <w:tcW w:w="555" w:type="pct"/>
+            <w:tcW w:w="510" w:type="pct"/>
             <w:tcBorders>
               <w:bottom w:val="single" w:color="auto" w:sz="4" w:space="0"/>
             </w:tcBorders>
@@ -383,7 +369,7 @@
               <w:placeholder>
                 <w:docPart w:val="DefaultPlaceholder_-1854013440"/>
               </w:placeholder>
-              <w:dataBinding w:prefixMappings="xmlns:ns0='urn:microsoft-dynamics-nav/reports/Customer_Order_Summary/107/'" w:xpath="/ns0:NavWordReportXmlPart[1]/ns0:Customer[1]/ns0:PeriodStartDate1[1]" w:storeItemID="{00000000-0000-0000-0000-000000000000}"/>
+              <w:dataBinding w:prefixMappings="xmlns:ns0='urn:microsoft-dynamics-nav/reports/Customer_Order_Summary/107/'" w:xpath="/ns0:NavWordReportXmlPart[1]/ns0:Customer[1]/ns0:PeriodStartDate1[1]" w:storeItemID="{935A1A8B-FBD8-496F-9CFA-0DAB10C40436}"/>
               <w15:color w:val="808080"/>
               <w:text/>
             </w:sdtPr>
@@ -425,7 +411,7 @@
         </w:tc>
         <w:tc>
           <w:tcPr>
-            <w:tcW w:w="556" w:type="pct"/>
+            <w:tcW w:w="510" w:type="pct"/>
             <w:tcBorders>
               <w:bottom w:val="single" w:color="auto" w:sz="4" w:space="0"/>
             </w:tcBorders>
@@ -438,7 +424,7 @@
               <w:placeholder>
                 <w:docPart w:val="DefaultPlaceholder_-1854013440"/>
               </w:placeholder>
-              <w:dataBinding w:prefixMappings="xmlns:ns0='urn:microsoft-dynamics-nav/reports/Customer_Order_Summary/107/'" w:xpath="/ns0:NavWordReportXmlPart[1]/ns0:Customer[1]/ns0:PeriodStartDate2[1]" w:storeItemID="{00000000-0000-0000-0000-000000000000}"/>
+              <w:dataBinding w:prefixMappings="xmlns:ns0='urn:microsoft-dynamics-nav/reports/Customer_Order_Summary/107/'" w:xpath="/ns0:NavWordReportXmlPart[1]/ns0:Customer[1]/ns0:PeriodStartDate2[1]" w:storeItemID="{935A1A8B-FBD8-496F-9CFA-0DAB10C40436}"/>
               <w15:color w:val="808080"/>
               <w:text/>
             </w:sdtPr>
@@ -480,7 +466,7 @@
         </w:tc>
         <w:tc>
           <w:tcPr>
-            <w:tcW w:w="555" w:type="pct"/>
+            <w:tcW w:w="510" w:type="pct"/>
             <w:tcBorders>
               <w:bottom w:val="single" w:color="auto" w:sz="4" w:space="0"/>
             </w:tcBorders>
@@ -493,7 +479,7 @@
               <w:placeholder>
                 <w:docPart w:val="DefaultPlaceholder_-1854013440"/>
               </w:placeholder>
-              <w:dataBinding w:prefixMappings="xmlns:ns0='urn:microsoft-dynamics-nav/reports/Customer_Order_Summary/107/'" w:xpath="/ns0:NavWordReportXmlPart[1]/ns0:Customer[1]/ns0:PeriodStartDate3[1]" w:storeItemID="{00000000-0000-0000-0000-000000000000}"/>
+              <w:dataBinding w:prefixMappings="xmlns:ns0='urn:microsoft-dynamics-nav/reports/Customer_Order_Summary/107/'" w:xpath="/ns0:NavWordReportXmlPart[1]/ns0:Customer[1]/ns0:PeriodStartDate3[1]" w:storeItemID="{935A1A8B-FBD8-496F-9CFA-0DAB10C40436}"/>
               <w15:color w:val="808080"/>
               <w:text/>
             </w:sdtPr>
@@ -535,7 +521,7 @@
         </w:tc>
         <w:tc>
           <w:tcPr>
-            <w:tcW w:w="556" w:type="pct"/>
+            <w:tcW w:w="510" w:type="pct"/>
             <w:tcBorders>
               <w:bottom w:val="single" w:color="auto" w:sz="4" w:space="0"/>
             </w:tcBorders>
@@ -554,7 +540,7 @@
               <w:placeholder>
                 <w:docPart w:val="DefaultPlaceholder_-1854013440"/>
               </w:placeholder>
-              <w:dataBinding w:prefixMappings="xmlns:ns0='urn:microsoft-dynamics-nav/reports/Customer_Order_Summary/107/'" w:xpath="/ns0:NavWordReportXmlPart[1]/ns0:Labels[1]/ns0:After1Lbl[1]" w:storeItemID="{00000000-0000-0000-0000-000000000000}"/>
+              <w:dataBinding w:prefixMappings="xmlns:ns0='urn:microsoft-dynamics-nav/reports/Customer_Order_Summary/107/'" w:xpath="/ns0:NavWordReportXmlPart[1]/ns0:Labels[1]/ns0:After1Lbl[1]" w:storeItemID="{935A1A8B-FBD8-496F-9CFA-0DAB10C40436}"/>
               <w15:color w:val="808080"/>
               <w:text/>
             </w:sdtPr>
@@ -573,7 +559,7 @@
         </w:tc>
         <w:tc>
           <w:tcPr>
-            <w:tcW w:w="556" w:type="pct"/>
+            <w:tcW w:w="510" w:type="pct"/>
             <w:tcBorders>
               <w:bottom w:val="single" w:color="auto" w:sz="4" w:space="0"/>
             </w:tcBorders>
@@ -592,7 +578,7 @@
               <w:placeholder>
                 <w:docPart w:val="DefaultPlaceholder_-1854013440"/>
               </w:placeholder>
-              <w:dataBinding w:prefixMappings="xmlns:ns0='urn:microsoft-dynamics-nav/reports/Customer_Order_Summary/107/'" w:xpath="/ns0:NavWordReportXmlPart[1]/ns0:Labels[1]/ns0:TotalCaptionLbl[1]" w:storeItemID="{00000000-0000-0000-0000-000000000000}"/>
+              <w:dataBinding w:prefixMappings="xmlns:ns0='urn:microsoft-dynamics-nav/reports/Customer_Order_Summary/107/'" w:xpath="/ns0:NavWordReportXmlPart[1]/ns0:Labels[1]/ns0:TotalCaptionLbl[1]" w:storeItemID="{935A1A8B-FBD8-496F-9CFA-0DAB10C40436}"/>
               <w15:color w:val="808080"/>
               <w:text/>
             </w:sdtPr>
@@ -618,7 +604,7 @@
         </w:trPr>
         <w:tc>
           <w:tcPr>
-            <w:tcW w:w="555" w:type="pct"/>
+            <w:tcW w:w="495" w:type="pct"/>
             <w:tcBorders>
               <w:top w:val="single" w:color="auto" w:sz="4" w:space="0"/>
             </w:tcBorders>
@@ -634,7 +620,7 @@
         </w:tc>
         <w:tc>
           <w:tcPr>
-            <w:tcW w:w="556" w:type="pct"/>
+            <w:tcW w:w="1170" w:type="pct"/>
             <w:tcBorders>
               <w:top w:val="single" w:color="auto" w:sz="4" w:space="0"/>
             </w:tcBorders>
@@ -650,7 +636,7 @@
         </w:tc>
         <w:tc>
           <w:tcPr>
-            <w:tcW w:w="555" w:type="pct"/>
+            <w:tcW w:w="275" w:type="pct"/>
             <w:tcBorders>
               <w:top w:val="single" w:color="auto" w:sz="4" w:space="0"/>
             </w:tcBorders>
@@ -666,7 +652,7 @@
         </w:tc>
         <w:tc>
           <w:tcPr>
-            <w:tcW w:w="556" w:type="pct"/>
+            <w:tcW w:w="510" w:type="pct"/>
             <w:tcBorders>
               <w:top w:val="single" w:color="auto" w:sz="4" w:space="0"/>
             </w:tcBorders>
@@ -682,7 +668,7 @@
         </w:tc>
         <w:tc>
           <w:tcPr>
-            <w:tcW w:w="555" w:type="pct"/>
+            <w:tcW w:w="510" w:type="pct"/>
             <w:tcBorders>
               <w:top w:val="single" w:color="auto" w:sz="4" w:space="0"/>
             </w:tcBorders>
@@ -698,7 +684,7 @@
         </w:tc>
         <w:tc>
           <w:tcPr>
-            <w:tcW w:w="556" w:type="pct"/>
+            <w:tcW w:w="510" w:type="pct"/>
             <w:tcBorders>
               <w:top w:val="single" w:color="auto" w:sz="4" w:space="0"/>
             </w:tcBorders>
@@ -714,7 +700,7 @@
         </w:tc>
         <w:tc>
           <w:tcPr>
-            <w:tcW w:w="555" w:type="pct"/>
+            <w:tcW w:w="510" w:type="pct"/>
             <w:tcBorders>
               <w:top w:val="single" w:color="auto" w:sz="4" w:space="0"/>
             </w:tcBorders>
@@ -730,7 +716,7 @@
         </w:tc>
         <w:tc>
           <w:tcPr>
-            <w:tcW w:w="556" w:type="pct"/>
+            <w:tcW w:w="510" w:type="pct"/>
             <w:tcBorders>
               <w:top w:val="single" w:color="auto" w:sz="4" w:space="0"/>
             </w:tcBorders>
@@ -746,7 +732,7 @@
         </w:tc>
         <w:tc>
           <w:tcPr>
-            <w:tcW w:w="556" w:type="pct"/>
+            <w:tcW w:w="510" w:type="pct"/>
             <w:tcBorders>
               <w:top w:val="single" w:color="auto" w:sz="4" w:space="0"/>
             </w:tcBorders>
@@ -773,7 +759,7 @@
           <w:placeholder>
             <w:docPart w:val="3003D6BF65584CF3A8C37BF79B780AA8"/>
           </w:placeholder>
-          <w15:dataBinding w:prefixMappings="xmlns:ns0='urn:microsoft-dynamics-nav/reports/Customer_Order_Summary/107/'" w:xpath="/ns0:NavWordReportXmlPart[1]/ns0:SalesLineBuffer_Integer" w:storeItemID="{00000000-0000-0000-0000-000000000000}"/>
+          <w15:dataBinding w:prefixMappings="xmlns:ns0='urn:microsoft-dynamics-nav/reports/Customer_Order_Summary/107/' " w:xpath="/ns0:NavWordReportXmlPart[1]/ns0:SalesLineBuffer_Integer" w:storeItemID="{935A1A8B-FBD8-496F-9CFA-0DAB10C40436}"/>
           <w15:color w:val="808080"/>
           <w15:repeatingSection/>
         </w:sdtPr>
@@ -793,7 +779,7 @@
                 <w:trPr>
                   <w:cnfStyle w:val="000000010000" w:firstRow="0" w:lastRow="0" w:firstColumn="0" w:lastColumn="0" w:oddVBand="0" w:evenVBand="0" w:oddHBand="0" w:evenHBand="1" w:firstRowFirstColumn="0" w:firstRowLastColumn="0" w:lastRowFirstColumn="0" w:lastRowLastColumn="0"/>
                   <w:cantSplit/>
-                  <w:trHeight w:val="490"/>
+                  <w:trHeight w:val="230" w:hRule="exact"/>
                 </w:trPr>
                 <w:sdt>
                   <w:sdtPr>
@@ -807,7 +793,7 @@
                     <w:placeholder>
                       <w:docPart w:val="DefaultPlaceholder_-1854013440"/>
                     </w:placeholder>
-                    <w:dataBinding w:prefixMappings="xmlns:ns0='urn:microsoft-dynamics-nav/reports/Customer_Order_Summary/107/'" w:xpath="/ns0:NavWordReportXmlPart[1]/ns0:SalesLineBuffer_Integer[1]/ns0:SalesLineBuffer_BilltoCustomerNo[1]" w:storeItemID="{00000000-0000-0000-0000-000000000000}"/>
+                    <w:dataBinding w:prefixMappings="xmlns:ns0='urn:microsoft-dynamics-nav/reports/Customer_Order_Summary/107/'" w:xpath="/ns0:NavWordReportXmlPart[1]/ns0:SalesLineBuffer_Integer[1]/ns0:SalesLineBuffer_BilltoCustomerNo[1]" w:storeItemID="{935A1A8B-FBD8-496F-9CFA-0DAB10C40436}"/>
                     <w15:color w:val="808080"/>
                     <w:text/>
                   </w:sdtPr>
@@ -819,7 +805,7 @@
                   <w:sdtContent>
                     <w:tc>
                       <w:tcPr>
-                        <w:tcW w:w="555" w:type="pct"/>
+                        <w:tcW w:w="495" w:type="pct"/>
                       </w:tcPr>
                       <w:p>
                         <w:pPr>
@@ -851,14 +837,14 @@
                     <w:placeholder>
                       <w:docPart w:val="DefaultPlaceholder_-1854013440"/>
                     </w:placeholder>
-                    <w:dataBinding w:prefixMappings="xmlns:ns0='urn:microsoft-dynamics-nav/reports/Customer_Order_Summary/107/'" w:xpath="/ns0:NavWordReportXmlPart[1]/ns0:SalesLineBuffer_Integer[1]/ns0:SalesLineBuffer_CustomerName[1]" w:storeItemID="{00000000-0000-0000-0000-000000000000}"/>
+                    <w:dataBinding w:prefixMappings="xmlns:ns0='urn:microsoft-dynamics-nav/reports/Customer_Order_Summary/107/'" w:xpath="/ns0:NavWordReportXmlPart[1]/ns0:SalesLineBuffer_Integer[1]/ns0:SalesLineBuffer_CustomerName[1]" w:storeItemID="{935A1A8B-FBD8-496F-9CFA-0DAB10C40436}"/>
                     <w15:color w:val="808080"/>
                     <w:text/>
                   </w:sdtPr>
                   <w:sdtContent>
                     <w:tc>
                       <w:tcPr>
-                        <w:tcW w:w="556" w:type="pct"/>
+                        <w:tcW w:w="1170" w:type="pct"/>
                       </w:tcPr>
                       <w:p>
                         <w:pPr>
@@ -888,14 +874,14 @@
                     <w:placeholder>
                       <w:docPart w:val="DefaultPlaceholder_-1854013440"/>
                     </w:placeholder>
-                    <w:dataBinding w:prefixMappings="xmlns:ns0='urn:microsoft-dynamics-nav/reports/Customer_Order_Summary/107/'" w:xpath="/ns0:NavWordReportXmlPart[1]/ns0:SalesLineBuffer_Integer[1]/ns0:SalesLineBuffer_CurrencyCode[1]" w:storeItemID="{00000000-0000-0000-0000-000000000000}"/>
+                    <w:dataBinding w:prefixMappings="xmlns:ns0='urn:microsoft-dynamics-nav/reports/Customer_Order_Summary/107/'" w:xpath="/ns0:NavWordReportXmlPart[1]/ns0:SalesLineBuffer_Integer[1]/ns0:SalesLineBuffer_CurrencyCode[1]" w:storeItemID="{935A1A8B-FBD8-496F-9CFA-0DAB10C40436}"/>
                     <w15:color w:val="808080"/>
                     <w:text/>
                   </w:sdtPr>
                   <w:sdtContent>
                     <w:tc>
                       <w:tcPr>
-                        <w:tcW w:w="555" w:type="pct"/>
+                        <w:tcW w:w="275" w:type="pct"/>
                       </w:tcPr>
                       <w:p>
                         <w:pPr>
@@ -924,14 +910,14 @@
                     <w:placeholder>
                       <w:docPart w:val="DefaultPlaceholder_-1854013440"/>
                     </w:placeholder>
-                    <w:dataBinding w:prefixMappings="xmlns:ns0='urn:microsoft-dynamics-nav/reports/Customer_Order_Summary/107/'" w:xpath="/ns0:NavWordReportXmlPart[1]/ns0:SalesLineBuffer_Integer[1]/ns0:SalesLineBuffer_SalesAmtOnOrder1[1]" w:storeItemID="{00000000-0000-0000-0000-000000000000}"/>
+                    <w:dataBinding w:prefixMappings="xmlns:ns0='urn:microsoft-dynamics-nav/reports/Customer_Order_Summary/107/'" w:xpath="/ns0:NavWordReportXmlPart[1]/ns0:SalesLineBuffer_Integer[1]/ns0:SalesLineBuffer_SalesAmtOnOrder1[1]" w:storeItemID="{935A1A8B-FBD8-496F-9CFA-0DAB10C40436}"/>
                     <w15:color w:val="808080"/>
                     <w:text/>
                   </w:sdtPr>
                   <w:sdtContent>
                     <w:tc>
                       <w:tcPr>
-                        <w:tcW w:w="556" w:type="pct"/>
+                        <w:tcW w:w="510" w:type="pct"/>
                       </w:tcPr>
                       <w:p>
                         <w:pPr>
@@ -953,14 +939,14 @@
                     <w:placeholder>
                       <w:docPart w:val="DefaultPlaceholder_-1854013440"/>
                     </w:placeholder>
-                    <w:dataBinding w:prefixMappings="xmlns:ns0='urn:microsoft-dynamics-nav/reports/Customer_Order_Summary/107/'" w:xpath="/ns0:NavWordReportXmlPart[1]/ns0:SalesLineBuffer_Integer[1]/ns0:SalesLineBuffer_SalesAmtOnOrder2[1]" w:storeItemID="{00000000-0000-0000-0000-000000000000}"/>
+                    <w:dataBinding w:prefixMappings="xmlns:ns0='urn:microsoft-dynamics-nav/reports/Customer_Order_Summary/107/'" w:xpath="/ns0:NavWordReportXmlPart[1]/ns0:SalesLineBuffer_Integer[1]/ns0:SalesLineBuffer_SalesAmtOnOrder2[1]" w:storeItemID="{935A1A8B-FBD8-496F-9CFA-0DAB10C40436}"/>
                     <w15:color w:val="808080"/>
                     <w:text/>
                   </w:sdtPr>
                   <w:sdtContent>
                     <w:tc>
                       <w:tcPr>
-                        <w:tcW w:w="555" w:type="pct"/>
+                        <w:tcW w:w="510" w:type="pct"/>
                       </w:tcPr>
                       <w:p>
                         <w:pPr>
@@ -982,14 +968,14 @@
                     <w:placeholder>
                       <w:docPart w:val="DefaultPlaceholder_-1854013440"/>
                     </w:placeholder>
-                    <w:dataBinding w:prefixMappings="xmlns:ns0='urn:microsoft-dynamics-nav/reports/Customer_Order_Summary/107/'" w:xpath="/ns0:NavWordReportXmlPart[1]/ns0:SalesLineBuffer_Integer[1]/ns0:SalesLineBuffer_SalesAmtOnOrder3[1]" w:storeItemID="{00000000-0000-0000-0000-000000000000}"/>
+                    <w:dataBinding w:prefixMappings="xmlns:ns0='urn:microsoft-dynamics-nav/reports/Customer_Order_Summary/107/'" w:xpath="/ns0:NavWordReportXmlPart[1]/ns0:SalesLineBuffer_Integer[1]/ns0:SalesLineBuffer_SalesAmtOnOrder3[1]" w:storeItemID="{935A1A8B-FBD8-496F-9CFA-0DAB10C40436}"/>
                     <w15:color w:val="808080"/>
                     <w:text/>
                   </w:sdtPr>
                   <w:sdtContent>
                     <w:tc>
                       <w:tcPr>
-                        <w:tcW w:w="556" w:type="pct"/>
+                        <w:tcW w:w="510" w:type="pct"/>
                       </w:tcPr>
                       <w:p>
                         <w:pPr>
@@ -1011,14 +997,14 @@
                     <w:placeholder>
                       <w:docPart w:val="DefaultPlaceholder_-1854013440"/>
                     </w:placeholder>
-                    <w:dataBinding w:prefixMappings="xmlns:ns0='urn:microsoft-dynamics-nav/reports/Customer_Order_Summary/107/'" w:xpath="/ns0:NavWordReportXmlPart[1]/ns0:SalesLineBuffer_Integer[1]/ns0:SalesLineBuffer_SalesAmtOnOrder4[1]" w:storeItemID="{00000000-0000-0000-0000-000000000000}"/>
+                    <w:dataBinding w:prefixMappings="xmlns:ns0='urn:microsoft-dynamics-nav/reports/Customer_Order_Summary/107/'" w:xpath="/ns0:NavWordReportXmlPart[1]/ns0:SalesLineBuffer_Integer[1]/ns0:SalesLineBuffer_SalesAmtOnOrder4[1]" w:storeItemID="{935A1A8B-FBD8-496F-9CFA-0DAB10C40436}"/>
                     <w15:color w:val="808080"/>
                     <w:text/>
                   </w:sdtPr>
                   <w:sdtContent>
                     <w:tc>
                       <w:tcPr>
-                        <w:tcW w:w="555" w:type="pct"/>
+                        <w:tcW w:w="510" w:type="pct"/>
                       </w:tcPr>
                       <w:p>
                         <w:pPr>
@@ -1040,14 +1026,14 @@
                     <w:placeholder>
                       <w:docPart w:val="DefaultPlaceholder_-1854013440"/>
                     </w:placeholder>
-                    <w:dataBinding w:prefixMappings="xmlns:ns0='urn:microsoft-dynamics-nav/reports/Customer_Order_Summary/107/'" w:xpath="/ns0:NavWordReportXmlPart[1]/ns0:SalesLineBuffer_Integer[1]/ns0:SalesLineBuffer_SalesAmtOnOrder5[1]" w:storeItemID="{00000000-0000-0000-0000-000000000000}"/>
+                    <w:dataBinding w:prefixMappings="xmlns:ns0='urn:microsoft-dynamics-nav/reports/Customer_Order_Summary/107/'" w:xpath="/ns0:NavWordReportXmlPart[1]/ns0:SalesLineBuffer_Integer[1]/ns0:SalesLineBuffer_SalesAmtOnOrder5[1]" w:storeItemID="{935A1A8B-FBD8-496F-9CFA-0DAB10C40436}"/>
                     <w15:color w:val="808080"/>
                     <w:text/>
                   </w:sdtPr>
                   <w:sdtContent>
                     <w:tc>
                       <w:tcPr>
-                        <w:tcW w:w="556" w:type="pct"/>
+                        <w:tcW w:w="510" w:type="pct"/>
                       </w:tcPr>
                       <w:p>
                         <w:pPr>
@@ -1069,14 +1055,14 @@
                     <w:placeholder>
                       <w:docPart w:val="DefaultPlaceholder_-1854013440"/>
                     </w:placeholder>
-                    <w:dataBinding w:prefixMappings="xmlns:ns0='urn:microsoft-dynamics-nav/reports/Customer_Order_Summary/107/'" w:xpath="/ns0:NavWordReportXmlPart[1]/ns0:SalesLineBuffer_Integer[1]/ns0:SalesLineBuffer_SalesOrderAmount[1]" w:storeItemID="{00000000-0000-0000-0000-000000000000}"/>
+                    <w:dataBinding w:prefixMappings="xmlns:ns0='urn:microsoft-dynamics-nav/reports/Customer_Order_Summary/107/'" w:xpath="/ns0:NavWordReportXmlPart[1]/ns0:SalesLineBuffer_Integer[1]/ns0:SalesLineBuffer_SalesOrderAmount[1]" w:storeItemID="{935A1A8B-FBD8-496F-9CFA-0DAB10C40436}"/>
                     <w15:color w:val="808080"/>
                     <w:text/>
                   </w:sdtPr>
                   <w:sdtContent>
                     <w:tc>
                       <w:tcPr>
-                        <w:tcW w:w="556" w:type="pct"/>
+                        <w:tcW w:w="510" w:type="pct"/>
                       </w:tcPr>
                       <w:p>
                         <w:pPr>
@@ -1104,21 +1090,22 @@
     <w:tbl>
       <w:tblPr>
         <w:tblStyle w:val="BCTotalsTable"/>
-        <w:tblW w:w="5000" w:type="pct"/>
+        <w:tblW w:w="5005" w:type="pct"/>
+        <w:tblLayout w:type="fixed"/>
         <w:tblLook w:val="0640" w:firstRow="0" w:lastRow="1" w:firstColumn="0" w:lastColumn="0" w:noHBand="1" w:noVBand="1"/>
         <w:tblCaption w:val="Table 3"/>
         <w:tblDescription w:val="Document totals."/>
       </w:tblPr>
       <w:tblGrid>
-        <w:gridCol w:w="1339"/>
-        <w:gridCol w:w="235"/>
-        <w:gridCol w:w="234"/>
-        <w:gridCol w:w="2332"/>
-        <w:gridCol w:w="2332"/>
-        <w:gridCol w:w="2332"/>
-        <w:gridCol w:w="2332"/>
-        <w:gridCol w:w="2332"/>
-        <w:gridCol w:w="2218"/>
+        <w:gridCol w:w="1553"/>
+        <w:gridCol w:w="3673"/>
+        <w:gridCol w:w="864"/>
+        <w:gridCol w:w="1602"/>
+        <w:gridCol w:w="1602"/>
+        <w:gridCol w:w="1602"/>
+        <w:gridCol w:w="1602"/>
+        <w:gridCol w:w="1602"/>
+        <w:gridCol w:w="1602"/>
       </w:tblGrid>
       <w:tr>
         <w:trPr>
@@ -1133,14 +1120,14 @@
             <w:placeholder>
               <w:docPart w:val="DefaultPlaceholder_-1854013440"/>
             </w:placeholder>
-            <w:dataBinding w:prefixMappings="xmlns:ns0='urn:microsoft-dynamics-nav/reports/Customer_Order_Summary/107/'" w:xpath="/ns0:NavWordReportXmlPart[1]/ns0:Totals[1]/ns0:Totals_TotalText[1]" w:storeItemID="{00000000-0000-0000-0000-000000000000}"/>
+            <w:dataBinding w:prefixMappings="xmlns:ns0='urn:microsoft-dynamics-nav/reports/Customer_Order_Summary/107/'" w:xpath="/ns0:NavWordReportXmlPart[1]/ns0:Totals[1]/ns0:Totals_TotalText[1]" w:storeItemID="{935A1A8B-FBD8-496F-9CFA-0DAB10C40436}"/>
             <w15:color w:val="808080"/>
             <w:text/>
           </w:sdtPr>
           <w:sdtContent>
             <w:tc>
               <w:tcPr>
-                <w:tcW w:w="555" w:type="pct"/>
+                <w:tcW w:w="495" w:type="pct"/>
               </w:tcPr>
               <w:p>
                 <w:pPr>
@@ -1156,7 +1143,7 @@
         </w:sdt>
         <w:tc>
           <w:tcPr>
-            <w:tcW w:w="556" w:type="pct"/>
+            <w:tcW w:w="1170" w:type="pct"/>
           </w:tcPr>
           <w:p>
             <w:pPr>
@@ -1167,7 +1154,7 @@
         </w:tc>
         <w:tc>
           <w:tcPr>
-            <w:tcW w:w="555" w:type="pct"/>
+            <w:tcW w:w="275" w:type="pct"/>
           </w:tcPr>
           <w:p>
             <w:pPr>
@@ -1187,14 +1174,14 @@
             <w:placeholder>
               <w:docPart w:val="DefaultPlaceholder_-1854013440"/>
             </w:placeholder>
-            <w:dataBinding w:prefixMappings="xmlns:ns0='urn:microsoft-dynamics-nav/reports/Customer_Order_Summary/107/'" w:xpath="/ns0:NavWordReportXmlPart[1]/ns0:Totals[1]/ns0:Totals_Sales_Amt_On_Order1[1]" w:storeItemID="{00000000-0000-0000-0000-000000000000}"/>
+            <w:dataBinding w:prefixMappings="xmlns:ns0='urn:microsoft-dynamics-nav/reports/Customer_Order_Summary/107/'" w:xpath="/ns0:NavWordReportXmlPart[1]/ns0:Totals[1]/ns0:Totals_Sales_Amt_On_Order1[1]" w:storeItemID="{935A1A8B-FBD8-496F-9CFA-0DAB10C40436}"/>
             <w15:color w:val="808080"/>
             <w:text/>
           </w:sdtPr>
           <w:sdtContent>
             <w:tc>
               <w:tcPr>
-                <w:tcW w:w="556" w:type="pct"/>
+                <w:tcW w:w="510" w:type="pct"/>
               </w:tcPr>
               <w:p>
                 <w:pPr>
@@ -1226,14 +1213,14 @@
             <w:placeholder>
               <w:docPart w:val="DefaultPlaceholder_-1854013440"/>
             </w:placeholder>
-            <w:dataBinding w:prefixMappings="xmlns:ns0='urn:microsoft-dynamics-nav/reports/Customer_Order_Summary/107/'" w:xpath="/ns0:NavWordReportXmlPart[1]/ns0:Totals[1]/ns0:Totals_Sales_Amt_On_Order2[1]" w:storeItemID="{00000000-0000-0000-0000-000000000000}"/>
+            <w:dataBinding w:prefixMappings="xmlns:ns0='urn:microsoft-dynamics-nav/reports/Customer_Order_Summary/107/'" w:xpath="/ns0:NavWordReportXmlPart[1]/ns0:Totals[1]/ns0:Totals_Sales_Amt_On_Order2[1]" w:storeItemID="{935A1A8B-FBD8-496F-9CFA-0DAB10C40436}"/>
             <w15:color w:val="808080"/>
             <w:text/>
           </w:sdtPr>
           <w:sdtContent>
             <w:tc>
               <w:tcPr>
-                <w:tcW w:w="555" w:type="pct"/>
+                <w:tcW w:w="510" w:type="pct"/>
               </w:tcPr>
               <w:p>
                 <w:pPr>
@@ -1265,14 +1252,14 @@
             <w:placeholder>
               <w:docPart w:val="DefaultPlaceholder_-1854013440"/>
             </w:placeholder>
-            <w:dataBinding w:prefixMappings="xmlns:ns0='urn:microsoft-dynamics-nav/reports/Customer_Order_Summary/107/'" w:xpath="/ns0:NavWordReportXmlPart[1]/ns0:Totals[1]/ns0:Totals_Sales_Amt_On_Order3[1]" w:storeItemID="{00000000-0000-0000-0000-000000000000}"/>
+            <w:dataBinding w:prefixMappings="xmlns:ns0='urn:microsoft-dynamics-nav/reports/Customer_Order_Summary/107/'" w:xpath="/ns0:NavWordReportXmlPart[1]/ns0:Totals[1]/ns0:Totals_Sales_Amt_On_Order3[1]" w:storeItemID="{935A1A8B-FBD8-496F-9CFA-0DAB10C40436}"/>
             <w15:color w:val="808080"/>
             <w:text/>
           </w:sdtPr>
           <w:sdtContent>
             <w:tc>
               <w:tcPr>
-                <w:tcW w:w="556" w:type="pct"/>
+                <w:tcW w:w="510" w:type="pct"/>
               </w:tcPr>
               <w:p>
                 <w:pPr>
@@ -1304,14 +1291,14 @@
             <w:placeholder>
               <w:docPart w:val="DefaultPlaceholder_-1854013440"/>
             </w:placeholder>
-            <w:dataBinding w:prefixMappings="xmlns:ns0='urn:microsoft-dynamics-nav/reports/Customer_Order_Summary/107/'" w:xpath="/ns0:NavWordReportXmlPart[1]/ns0:Totals[1]/ns0:Totals_Sales_Amt_On_Order4[1]" w:storeItemID="{00000000-0000-0000-0000-000000000000}"/>
+            <w:dataBinding w:prefixMappings="xmlns:ns0='urn:microsoft-dynamics-nav/reports/Customer_Order_Summary/107/'" w:xpath="/ns0:NavWordReportXmlPart[1]/ns0:Totals[1]/ns0:Totals_Sales_Amt_On_Order4[1]" w:storeItemID="{935A1A8B-FBD8-496F-9CFA-0DAB10C40436}"/>
             <w15:color w:val="808080"/>
             <w:text/>
           </w:sdtPr>
           <w:sdtContent>
             <w:tc>
               <w:tcPr>
-                <w:tcW w:w="555" w:type="pct"/>
+                <w:tcW w:w="510" w:type="pct"/>
               </w:tcPr>
               <w:p>
                 <w:pPr>
@@ -1343,14 +1330,14 @@
             <w:placeholder>
               <w:docPart w:val="DefaultPlaceholder_-1854013440"/>
             </w:placeholder>
-            <w:dataBinding w:prefixMappings="xmlns:ns0='urn:microsoft-dynamics-nav/reports/Customer_Order_Summary/107/'" w:xpath="/ns0:NavWordReportXmlPart[1]/ns0:Totals[1]/ns0:Totals_Sales_Amt_On_Order5[1]" w:storeItemID="{00000000-0000-0000-0000-000000000000}"/>
+            <w:dataBinding w:prefixMappings="xmlns:ns0='urn:microsoft-dynamics-nav/reports/Customer_Order_Summary/107/'" w:xpath="/ns0:NavWordReportXmlPart[1]/ns0:Totals[1]/ns0:Totals_Sales_Amt_On_Order5[1]" w:storeItemID="{935A1A8B-FBD8-496F-9CFA-0DAB10C40436}"/>
             <w15:color w:val="808080"/>
             <w:text/>
           </w:sdtPr>
           <w:sdtContent>
             <w:tc>
               <w:tcPr>
-                <w:tcW w:w="556" w:type="pct"/>
+                <w:tcW w:w="510" w:type="pct"/>
               </w:tcPr>
               <w:p>
                 <w:pPr>
@@ -1379,14 +1366,14 @@
             <w:placeholder>
               <w:docPart w:val="DefaultPlaceholder_-1854013440"/>
             </w:placeholder>
-            <w:dataBinding w:prefixMappings="xmlns:ns0='urn:microsoft-dynamics-nav/reports/Customer_Order_Summary/107/'" w:xpath="/ns0:NavWordReportXmlPart[1]/ns0:Totals[1]/ns0:Totals_Sales_Order_Amount[1]" w:storeItemID="{00000000-0000-0000-0000-000000000000}"/>
+            <w:dataBinding w:prefixMappings="xmlns:ns0='urn:microsoft-dynamics-nav/reports/Customer_Order_Summary/107/'" w:xpath="/ns0:NavWordReportXmlPart[1]/ns0:Totals[1]/ns0:Totals_Sales_Order_Amount[1]" w:storeItemID="{935A1A8B-FBD8-496F-9CFA-0DAB10C40436}"/>
             <w15:color w:val="808080"/>
             <w:text/>
           </w:sdtPr>
           <w:sdtContent>
             <w:tc>
               <w:tcPr>
-                <w:tcW w:w="556" w:type="pct"/>
+                <w:tcW w:w="510" w:type="pct"/>
               </w:tcPr>
               <w:p>
                 <w:pPr>
@@ -2483,7 +2470,7 @@
 </file>
 
 <file path=word/glossary/document.xml><?xml version="1.0" encoding="utf-8"?>
-<w:glossaryDocument xmlns:wpc="http://schemas.microsoft.com/office/word/2010/wordprocessingCanvas" xmlns:cx="http://schemas.microsoft.com/office/drawing/2014/chartex" xmlns:cx1="http://schemas.microsoft.com/office/drawing/2015/9/8/chartex" xmlns:cx2="http://schemas.microsoft.com/office/drawing/2015/10/21/chartex" xmlns:cx3="http://schemas.microsoft.com/office/drawing/2016/5/9/chartex" xmlns:cx4="http://schemas.microsoft.com/office/drawing/2016/5/10/chartex" xmlns:cx5="http://schemas.microsoft.com/office/drawing/2016/5/11/chartex" xmlns:cx6="http://schemas.microsoft.com/office/drawing/2016/5/12/chartex" xmlns:cx7="http://schemas.microsoft.com/office/drawing/2016/5/13/chartex" xmlns:cx8="http://schemas.microsoft.com/office/drawing/2016/5/14/chartex" xmlns:mc="http://schemas.openxmlformats.org/markup-compatibility/2006" xmlns:aink="http://schemas.microsoft.com/office/drawing/2016/ink" xmlns:am3d="http://schemas.microsoft.com/office/drawing/2017/model3d" xmlns:o="urn:schemas-microsoft-com:office:office" xmlns:oel="http://schemas.microsoft.com/office/2019/extlst" xmlns:r="http://schemas.openxmlformats.org/officeDocument/2006/relationships" xmlns:m="http://schemas.openxmlformats.org/officeDocument/2006/math" xmlns:v="urn:schemas-microsoft-com:vml" xmlns:wp14="http://schemas.microsoft.com/office/word/2010/wordprocessingDrawing" xmlns:wp="http://schemas.openxmlformats.org/drawingml/2006/wordprocessingDrawing" xmlns:w10="urn:schemas-microsoft-com:office:word" xmlns:w="http://schemas.openxmlformats.org/wordprocessingml/2006/main" xmlns:w14="http://schemas.microsoft.com/office/word/2010/wordml" xmlns:w15="http://schemas.microsoft.com/office/word/2012/wordml" xmlns:w16cei="http://schemas.microsoft.com/office/word/2026/wordml/cei" xmlns:w16cex="http://schemas.microsoft.com/office/word/2018/wordml/cex" xmlns:w16cid="http://schemas.microsoft.com/office/word/2016/wordml/cid" xmlns:w16="http://schemas.microsoft.com/office/word/2018/wordml" xmlns:w16du="http://schemas.microsoft.com/office/word/2023/wordml/word16du" xmlns:w16sdtdh="http://schemas.microsoft.com/office/word/2020/wordml/sdtdatahash" xmlns:w16sdtfl="http://schemas.microsoft.com/office/word/2024/wordml/sdtformatlock" xmlns:w16se="http://schemas.microsoft.com/office/word/2015/wordml/symex" xmlns:wpg="http://schemas.microsoft.com/office/word/2010/wordprocessingGroup" xmlns:wpi="http://schemas.microsoft.com/office/word/2010/wordprocessingInk" xmlns:wne="http://schemas.microsoft.com/office/word/2006/wordml" xmlns:wps="http://schemas.microsoft.com/office/word/2010/wordprocessingShape" mc:Ignorable="w14 w15 w16se w16cid w16 w16cex w16sdtdh w16sdtfl w16du wp14">
+<w:glossaryDocument xmlns:wpc="http://schemas.microsoft.com/office/word/2010/wordprocessingCanvas" xmlns:cx="http://schemas.microsoft.com/office/drawing/2014/chartex" xmlns:cx1="http://schemas.microsoft.com/office/drawing/2015/9/8/chartex" xmlns:cx2="http://schemas.microsoft.com/office/drawing/2015/10/21/chartex" xmlns:cx3="http://schemas.microsoft.com/office/drawing/2016/5/9/chartex" xmlns:cx4="http://schemas.microsoft.com/office/drawing/2016/5/10/chartex" xmlns:cx5="http://schemas.microsoft.com/office/drawing/2016/5/11/chartex" xmlns:cx6="http://schemas.microsoft.com/office/drawing/2016/5/12/chartex" xmlns:cx7="http://schemas.microsoft.com/office/drawing/2016/5/13/chartex" xmlns:cx8="http://schemas.microsoft.com/office/drawing/2016/5/14/chartex" xmlns:mc="http://schemas.openxmlformats.org/markup-compatibility/2006" xmlns:aink="http://schemas.microsoft.com/office/drawing/2016/ink" xmlns:am3d="http://schemas.microsoft.com/office/drawing/2017/model3d" xmlns:o="urn:schemas-microsoft-com:office:office" xmlns:oel="http://schemas.microsoft.com/office/2019/extlst" xmlns:r="http://schemas.openxmlformats.org/officeDocument/2006/relationships" xmlns:m="http://schemas.openxmlformats.org/officeDocument/2006/math" xmlns:v="urn:schemas-microsoft-com:vml" xmlns:wp14="http://schemas.microsoft.com/office/word/2010/wordprocessingDrawing" xmlns:wp="http://schemas.openxmlformats.org/drawingml/2006/wordprocessingDrawing" xmlns:w10="urn:schemas-microsoft-com:office:word" xmlns:w="http://schemas.openxmlformats.org/wordprocessingml/2006/main" xmlns:w14="http://schemas.microsoft.com/office/word/2010/wordml" xmlns:w15="http://schemas.microsoft.com/office/word/2012/wordml" xmlns:w16cex="http://schemas.microsoft.com/office/word/2018/wordml/cex" xmlns:w16cid="http://schemas.microsoft.com/office/word/2016/wordml/cid" xmlns:w16="http://schemas.microsoft.com/office/word/2018/wordml" xmlns:w16du="http://schemas.microsoft.com/office/word/2023/wordml/word16du" xmlns:w16sdtdh="http://schemas.microsoft.com/office/word/2020/wordml/sdtdatahash" xmlns:w16sdtfl="http://schemas.microsoft.com/office/word/2024/wordml/sdtformatlock" xmlns:w16se="http://schemas.microsoft.com/office/word/2015/wordml/symex" xmlns:wpg="http://schemas.microsoft.com/office/word/2010/wordprocessingGroup" xmlns:wpi="http://schemas.microsoft.com/office/word/2010/wordprocessingInk" xmlns:wne="http://schemas.microsoft.com/office/word/2006/wordml" xmlns:wps="http://schemas.microsoft.com/office/word/2010/wordprocessingShape" mc:Ignorable="w14 w15 w16se w16cid w16 w16cex w16sdtdh w16sdtfl w16du wp14">
   <w:docParts>
     <w:docPart>
       <w:docPartPr>
@@ -2724,8 +2711,10 @@
     <w:rsid w:val="0023545D"/>
     <w:rsid w:val="00251397"/>
     <w:rsid w:val="002A7083"/>
+    <w:rsid w:val="00565ECE"/>
     <w:rsid w:val="006203BB"/>
     <w:rsid w:val="007D00DC"/>
+    <w:rsid w:val="00812141"/>
     <w:rsid w:val="00817E50"/>
     <w:rsid w:val="0089231B"/>
     <w:rsid w:val="008C3096"/>
@@ -2734,6 +2723,7 @@
     <w:rsid w:val="00C4474E"/>
     <w:rsid w:val="00E5711F"/>
     <w:rsid w:val="00E84B36"/>
+    <w:rsid w:val="00FE2E14"/>
   </w:rsids>
   <m:mathPr>
     <m:mathFont m:val="Cambria Math"/>
@@ -2750,7 +2740,7 @@
   </m:mathPr>
   <w:themeFontLang w:val="da-DK"/>
   <w:clrSchemeMapping w:bg1="light1" w:t1="dark1" w:bg2="light2" w:t2="dark2" w:accent1="accent1" w:accent2="accent2" w:accent3="accent3" w:accent4="accent4" w:accent5="accent5" w:accent6="accent6" w:hyperlink="hyperlink" w:followedHyperlink="followedHyperlink"/>
-  <w:decimalSymbol w:val=","/>
+  <w:decimalSymbol w:val="."/>
   <w:listSeparator w:val=","/>
   <w15:chartTrackingRefBased/>
 </w:settings>
@@ -3912,9 +3902,7 @@
  < / N a v W o r d R e p o r t X m l P a r t > 
 </file>
 
-<file path=customXml/item2.xml>��< ? x m l   v e r s i o n = " 1 . 0 "   e n c o d i n g = " u t f - 1 6 " ? > - 
- < N a v W o r d R e p o r t X m l P a r t   x m l n s = " u r n : m i c r o s o f t - d y n a m i c s - b u s i n e s s c e n t r a l / i n t e r n a l / e x t e n d e d / r e p o r t s / C u s t o m e r _ O r d e r _ S u m m a r y / 1 0 7 / " > +<file path=customXml/item2.xml>��< ? x m l   v e r s i o n = " 1 . 0 "   e n c o d i n g = " u t f - 1 6 " ? > < N a v W o r d R e p o r t X m l P a r t   x m l n s = " u r n : m i c r o s o f t - d y n a m i c s - b u s i n e s s c e n t r a l / i n t e r n a l / e x t e n d e d / r e p o r t s / C u s t o m e r _ O r d e r _ S u m m a r y / 1 0 7 / " >   
      < B C R e p o r t I n f o r m a t i o n >   

</xml_diff>